<commit_message>
+ "v0.9.8" Updated in Files
</commit_message>
<xml_diff>
--- a/IDM BUILD_8/Help/Help.docx
+++ b/IDM BUILD_8/Help/Help.docx
@@ -81,7 +81,7 @@
         <w:rPr>
           <w:rFonts w:cs="Times New Roman"/>
         </w:rPr>
-        <w:t>V0.9.7</w:t>
+        <w:t>V0.9.8</w:t>
       </w:r>
       <w:bookmarkStart w:id="1" w:name="_GoBack"/>
       <w:bookmarkEnd w:id="1"/>
@@ -9833,7 +9833,7 @@
 </file>
 
 <file path=customXml/itemProps1.xml><?xml version="1.0" encoding="utf-8"?>
-<ds:datastoreItem xmlns:ds="http://schemas.openxmlformats.org/officeDocument/2006/customXml" ds:itemID="{52AFA830-FBB1-4EE0-BF9D-8BECDCFF4994}">
+<ds:datastoreItem xmlns:ds="http://schemas.openxmlformats.org/officeDocument/2006/customXml" ds:itemID="{2EB9EFCE-5B99-438C-832D-11A61121588B}">
   <ds:schemaRefs>
     <ds:schemaRef ds:uri="http://schemas.openxmlformats.org/officeDocument/2006/bibliography"/>
   </ds:schemaRefs>

</xml_diff>

<commit_message>
* Multi Profile Backup Continue... * Speed Improvement Reg read Inserted on _iGetMaxKey * Some Include Changed
</commit_message>
<xml_diff>
--- a/IDM BUILD_8/Help/Help.docx
+++ b/IDM BUILD_8/Help/Help.docx
@@ -1,6 +1,6 @@
 
 <file path=word/document.xml><?xml version="1.0" encoding="utf-8"?>
-<w:document xmlns:wpc="http://schemas.microsoft.com/office/word/2010/wordprocessingCanvas" xmlns:mc="http://schemas.openxmlformats.org/markup-compatibility/2006" xmlns:o="urn:schemas-microsoft-com:office:office" xmlns:r="http://schemas.openxmlformats.org/officeDocument/2006/relationships" xmlns:m="http://schemas.openxmlformats.org/officeDocument/2006/math" xmlns:v="urn:schemas-microsoft-com:vml" xmlns:wp14="http://schemas.microsoft.com/office/word/2010/wordprocessingDrawing" xmlns:wp="http://schemas.openxmlformats.org/drawingml/2006/wordprocessingDrawing" xmlns:w10="urn:schemas-microsoft-com:office:word" xmlns:w="http://schemas.openxmlformats.org/wordprocessingml/2006/main" xmlns:w14="http://schemas.microsoft.com/office/word/2010/wordml" xmlns:wpg="http://schemas.microsoft.com/office/word/2010/wordprocessingGroup" xmlns:wpi="http://schemas.microsoft.com/office/word/2010/wordprocessingInk" xmlns:wne="http://schemas.microsoft.com/office/word/2006/wordml" xmlns:wps="http://schemas.microsoft.com/office/word/2010/wordprocessingShape" mc:Ignorable="w14 wp14">
+<w:document xmlns:wpc="http://schemas.microsoft.com/office/word/2010/wordprocessingCanvas" xmlns:mc="http://schemas.openxmlformats.org/markup-compatibility/2006" xmlns:o="urn:schemas-microsoft-com:office:office" xmlns:r="http://schemas.openxmlformats.org/officeDocument/2006/relationships" xmlns:m="http://schemas.openxmlformats.org/officeDocument/2006/math" xmlns:v="urn:schemas-microsoft-com:vml" xmlns:wp14="http://schemas.microsoft.com/office/word/2010/wordprocessingDrawing" xmlns:wp="http://schemas.openxmlformats.org/drawingml/2006/wordprocessingDrawing" xmlns:w10="urn:schemas-microsoft-com:office:word" xmlns:w="http://schemas.openxmlformats.org/wordprocessingml/2006/main" xmlns:w14="http://schemas.microsoft.com/office/word/2010/wordml" xmlns:w15="http://schemas.microsoft.com/office/word/2012/wordml" xmlns:wpg="http://schemas.microsoft.com/office/word/2010/wordprocessingGroup" xmlns:wpi="http://schemas.microsoft.com/office/word/2010/wordprocessingInk" xmlns:wne="http://schemas.microsoft.com/office/word/2006/wordml" xmlns:wps="http://schemas.microsoft.com/office/word/2010/wordprocessingShape" mc:Ignorable="w14 w15 wp14">
   <w:body>
     <w:p>
       <w:pPr>
@@ -15,7 +15,7 @@
         <w:rPr>
           <w:rFonts w:cs="Times New Roman"/>
           <w:noProof/>
-          <w:lang w:bidi="ar-SA"/>
+          <w:lang w:val="en-IN" w:eastAsia="en-IN" w:bidi="ar-SA"/>
         </w:rPr>
         <w:drawing>
           <wp:anchor distT="0" distB="0" distL="114300" distR="114300" simplePos="0" relativeHeight="251659264" behindDoc="0" locked="0" layoutInCell="1" allowOverlap="1" wp14:anchorId="10914DD8" wp14:editId="31640088">
@@ -43,7 +43,7 @@
                     </pic:cNvPicPr>
                   </pic:nvPicPr>
                   <pic:blipFill>
-                    <a:blip r:embed="rId7"/>
+                    <a:blip r:embed="rId6"/>
                     <a:srcRect/>
                     <a:stretch>
                       <a:fillRect/>
@@ -83,19 +83,71 @@
         </w:rPr>
         <w:t>V0.9.8</w:t>
       </w:r>
+      <w:r>
+        <w:rPr>
+          <w:rFonts w:cs="Times New Roman"/>
+        </w:rPr>
+        <w:t xml:space="preserve"> (</w:t>
+      </w:r>
+      <w:r>
+        <w:rPr>
+          <w:rFonts w:cs="Times New Roman"/>
+        </w:rPr>
+        <w:t xml:space="preserve">Beta) </w:t>
+      </w:r>
+    </w:p>
+    <w:p>
+      <w:pPr>
+        <w:pStyle w:val="NoSpacing"/>
+        <w:rPr>
+          <w:rFonts w:cs="Times New Roman"/>
+          <w:i/>
+        </w:rPr>
+      </w:pPr>
+      <w:r>
+        <w:rPr>
+          <w:rFonts w:cs="Times New Roman"/>
+          <w:i/>
+        </w:rPr>
+        <w:t xml:space="preserve">Please Remember </w:t>
+      </w:r>
+      <w:r>
+        <w:rPr>
+          <w:rFonts w:cs="Times New Roman"/>
+          <w:i/>
+        </w:rPr>
+        <w:t>this</w:t>
+      </w:r>
+      <w:r>
+        <w:rPr>
+          <w:rFonts w:cs="Times New Roman"/>
+          <w:i/>
+        </w:rPr>
+        <w:t xml:space="preserve"> is </w:t>
+      </w:r>
+      <w:r>
+        <w:rPr>
+          <w:rFonts w:cs="Times New Roman"/>
+          <w:i/>
+          <w:color w:val="FF0000"/>
+        </w:rPr>
+        <w:t>Beta</w:t>
+      </w:r>
+      <w:r>
+        <w:rPr>
+          <w:rFonts w:cs="Times New Roman"/>
+          <w:i/>
+        </w:rPr>
+        <w:t xml:space="preserve"> Versi</w:t>
+      </w:r>
       <w:bookmarkStart w:id="1" w:name="_GoBack"/>
       <w:bookmarkEnd w:id="1"/>
       <w:r>
         <w:rPr>
           <w:rFonts w:cs="Times New Roman"/>
-        </w:rPr>
-        <w:t xml:space="preserve"> (</w:t>
-      </w:r>
-      <w:r>
-        <w:rPr>
-          <w:rFonts w:cs="Times New Roman"/>
-        </w:rPr>
-        <w:t xml:space="preserve">Beta) </w:t>
+          <w:i/>
+        </w:rPr>
+        <w:t>on and may Contain Bug.</w:t>
       </w:r>
     </w:p>
     <w:p>
@@ -103,44 +155,39 @@
         <w:pStyle w:val="NoSpacing"/>
         <w:rPr>
           <w:rFonts w:cs="Times New Roman"/>
-          <w:i/>
-        </w:rPr>
-      </w:pPr>
-      <w:r>
-        <w:rPr>
-          <w:rFonts w:cs="Times New Roman"/>
-          <w:i/>
-        </w:rPr>
-        <w:t xml:space="preserve">Please Remember </w:t>
-      </w:r>
-      <w:r>
-        <w:rPr>
-          <w:rFonts w:cs="Times New Roman"/>
-          <w:i/>
-        </w:rPr>
-        <w:t>this</w:t>
-      </w:r>
-      <w:r>
-        <w:rPr>
-          <w:rFonts w:cs="Times New Roman"/>
-          <w:i/>
-        </w:rPr>
-        <w:t xml:space="preserve"> is </w:t>
-      </w:r>
-      <w:r>
-        <w:rPr>
-          <w:rFonts w:cs="Times New Roman"/>
-          <w:i/>
-          <w:color w:val="FF0000"/>
-        </w:rPr>
-        <w:t>Beta</w:t>
-      </w:r>
-      <w:r>
-        <w:rPr>
-          <w:rFonts w:cs="Times New Roman"/>
-          <w:i/>
-        </w:rPr>
-        <w:t xml:space="preserve"> Version and may Contain Bug.</w:t>
+        </w:rPr>
+      </w:pPr>
+      <w:r>
+        <w:rPr>
+          <w:rFonts w:cs="Times New Roman"/>
+        </w:rPr>
+        <w:t xml:space="preserve">Copyright © </w:t>
+      </w:r>
+      <w:r>
+        <w:rPr>
+          <w:rFonts w:cs="Times New Roman"/>
+        </w:rPr>
+        <w:t>2012-13</w:t>
+      </w:r>
+      <w:r>
+        <w:rPr>
+          <w:rFonts w:cs="Times New Roman"/>
+        </w:rPr>
+        <w:t xml:space="preserve"> </w:t>
+      </w:r>
+      <w:proofErr w:type="spellStart"/>
+      <w:r>
+        <w:rPr>
+          <w:rFonts w:cs="Times New Roman"/>
+        </w:rPr>
+        <w:t>Gajjar</w:t>
+      </w:r>
+      <w:proofErr w:type="spellEnd"/>
+      <w:r>
+        <w:rPr>
+          <w:rFonts w:cs="Times New Roman"/>
+        </w:rPr>
+        <w:t xml:space="preserve"> Tejas</w:t>
       </w:r>
     </w:p>
     <w:p>
@@ -150,41 +197,7 @@
           <w:rFonts w:cs="Times New Roman"/>
         </w:rPr>
       </w:pPr>
-      <w:r>
-        <w:rPr>
-          <w:rFonts w:cs="Times New Roman"/>
-        </w:rPr>
-        <w:t xml:space="preserve">Copyright © </w:t>
-      </w:r>
-      <w:r>
-        <w:rPr>
-          <w:rFonts w:cs="Times New Roman"/>
-        </w:rPr>
-        <w:t>2012-13</w:t>
-      </w:r>
-      <w:r>
-        <w:rPr>
-          <w:rFonts w:cs="Times New Roman"/>
-        </w:rPr>
-        <w:t xml:space="preserve"> Gajjar </w:t>
-      </w:r>
-      <w:proofErr w:type="spellStart"/>
-      <w:r>
-        <w:rPr>
-          <w:rFonts w:cs="Times New Roman"/>
-        </w:rPr>
-        <w:t>Tejas</w:t>
-      </w:r>
-      <w:proofErr w:type="spellEnd"/>
-    </w:p>
-    <w:p>
-      <w:pPr>
-        <w:pStyle w:val="NoSpacing"/>
-        <w:rPr>
-          <w:rFonts w:cs="Times New Roman"/>
-        </w:rPr>
-      </w:pPr>
-      <w:hyperlink r:id="rId8" w:tgtFrame="_blank" w:history="1">
+      <w:hyperlink r:id="rId7" w:tgtFrame="_blank" w:history="1">
         <w:r>
           <w:rPr>
             <w:rStyle w:val="Hyperlink"/>
@@ -798,14 +811,14 @@
       <w:r>
         <w:rPr>
           <w:noProof/>
-          <w:lang w:bidi="ar-SA"/>
+          <w:lang w:val="en-IN" w:eastAsia="en-IN" w:bidi="ar-SA"/>
         </w:rPr>
         <w:drawing>
           <wp:inline distT="0" distB="0" distL="0" distR="0" wp14:anchorId="2A107EF9" wp14:editId="55E3F158">
             <wp:extent cx="190500" cy="190500"/>
             <wp:effectExtent l="0" t="0" r="0" b="0"/>
             <wp:docPr id="1" name="Picture 0" descr="thumbs_up.gif">
-              <a:hlinkClick xmlns:a="http://schemas.openxmlformats.org/drawingml/2006/main" r:id="rId9"/>
+              <a:hlinkClick xmlns:a="http://schemas.openxmlformats.org/drawingml/2006/main" r:id="rId8"/>
             </wp:docPr>
             <wp:cNvGraphicFramePr>
               <a:graphicFrameLocks xmlns:a="http://schemas.openxmlformats.org/drawingml/2006/main" noChangeAspect="1"/>
@@ -818,7 +831,7 @@
                     <pic:cNvPicPr/>
                   </pic:nvPicPr>
                   <pic:blipFill>
-                    <a:blip r:embed="rId10"/>
+                    <a:blip r:embed="rId9"/>
                     <a:stretch>
                       <a:fillRect/>
                     </a:stretch>
@@ -918,14 +931,14 @@
       <w:r>
         <w:rPr>
           <w:noProof/>
-          <w:lang w:bidi="ar-SA"/>
+          <w:lang w:val="en-IN" w:eastAsia="en-IN" w:bidi="ar-SA"/>
         </w:rPr>
         <w:drawing>
           <wp:inline distT="0" distB="0" distL="0" distR="0" wp14:anchorId="24AEA379" wp14:editId="5AC21F04">
             <wp:extent cx="190500" cy="190500"/>
             <wp:effectExtent l="0" t="0" r="0" b="0"/>
             <wp:docPr id="2" name="Picture 0" descr="thumbs_up.gif">
-              <a:hlinkClick xmlns:a="http://schemas.openxmlformats.org/drawingml/2006/main" r:id="rId9"/>
+              <a:hlinkClick xmlns:a="http://schemas.openxmlformats.org/drawingml/2006/main" r:id="rId8"/>
             </wp:docPr>
             <wp:cNvGraphicFramePr>
               <a:graphicFrameLocks xmlns:a="http://schemas.openxmlformats.org/drawingml/2006/main" noChangeAspect="1"/>
@@ -938,7 +951,7 @@
                     <pic:cNvPicPr/>
                   </pic:nvPicPr>
                   <pic:blipFill>
-                    <a:blip r:embed="rId10"/>
+                    <a:blip r:embed="rId9"/>
                     <a:stretch>
                       <a:fillRect/>
                     </a:stretch>
@@ -1114,19 +1127,11 @@
         </w:rPr>
         <w:t xml:space="preserve"> </w:t>
       </w:r>
-      <w:proofErr w:type="gramStart"/>
-      <w:r>
-        <w:rPr>
-          <w:rFonts w:cs="Times New Roman"/>
-        </w:rPr>
-        <w:t>click</w:t>
-      </w:r>
-      <w:proofErr w:type="gramEnd"/>
-      <w:r>
-        <w:rPr>
-          <w:rFonts w:cs="Times New Roman"/>
-        </w:rPr>
-        <w:t xml:space="preserve"> Backup and Restore</w:t>
+      <w:r>
+        <w:rPr>
+          <w:rFonts w:cs="Times New Roman"/>
+        </w:rPr>
+        <w:t>click Backup and Restore</w:t>
       </w:r>
       <w:r>
         <w:rPr>
@@ -1265,14 +1270,14 @@
       <w:r>
         <w:rPr>
           <w:noProof/>
-          <w:lang w:bidi="ar-SA"/>
+          <w:lang w:val="en-IN" w:eastAsia="en-IN" w:bidi="ar-SA"/>
         </w:rPr>
         <w:drawing>
           <wp:inline distT="0" distB="0" distL="0" distR="0" wp14:anchorId="642CAFEC" wp14:editId="2165D7EA">
             <wp:extent cx="190500" cy="190500"/>
             <wp:effectExtent l="0" t="0" r="0" b="0"/>
             <wp:docPr id="11" name="Picture 0" descr="thumbs_up.gif">
-              <a:hlinkClick xmlns:a="http://schemas.openxmlformats.org/drawingml/2006/main" r:id="rId9"/>
+              <a:hlinkClick xmlns:a="http://schemas.openxmlformats.org/drawingml/2006/main" r:id="rId8"/>
             </wp:docPr>
             <wp:cNvGraphicFramePr>
               <a:graphicFrameLocks xmlns:a="http://schemas.openxmlformats.org/drawingml/2006/main" noChangeAspect="1"/>
@@ -1285,7 +1290,7 @@
                     <pic:cNvPicPr/>
                   </pic:nvPicPr>
                   <pic:blipFill>
-                    <a:blip r:embed="rId10"/>
+                    <a:blip r:embed="rId9"/>
                     <a:stretch>
                       <a:fillRect/>
                     </a:stretch>
@@ -1439,14 +1444,14 @@
       <w:r>
         <w:rPr>
           <w:noProof/>
-          <w:lang w:bidi="ar-SA"/>
+          <w:lang w:val="en-IN" w:eastAsia="en-IN" w:bidi="ar-SA"/>
         </w:rPr>
         <w:drawing>
           <wp:inline distT="0" distB="0" distL="0" distR="0" wp14:anchorId="5B18E40E" wp14:editId="64F1C1D4">
             <wp:extent cx="190500" cy="190500"/>
             <wp:effectExtent l="0" t="0" r="0" b="0"/>
             <wp:docPr id="12" name="Picture 0" descr="thumbs_up.gif">
-              <a:hlinkClick xmlns:a="http://schemas.openxmlformats.org/drawingml/2006/main" r:id="rId9"/>
+              <a:hlinkClick xmlns:a="http://schemas.openxmlformats.org/drawingml/2006/main" r:id="rId8"/>
             </wp:docPr>
             <wp:cNvGraphicFramePr>
               <a:graphicFrameLocks xmlns:a="http://schemas.openxmlformats.org/drawingml/2006/main" noChangeAspect="1"/>
@@ -1459,7 +1464,7 @@
                     <pic:cNvPicPr/>
                   </pic:nvPicPr>
                   <pic:blipFill>
-                    <a:blip r:embed="rId10"/>
+                    <a:blip r:embed="rId9"/>
                     <a:stretch>
                       <a:fillRect/>
                     </a:stretch>
@@ -1547,7 +1552,7 @@
         <w:rPr>
           <w:rFonts w:cs="Times New Roman"/>
           <w:noProof/>
-          <w:lang w:bidi="ar-SA"/>
+          <w:lang w:val="en-IN" w:eastAsia="en-IN" w:bidi="ar-SA"/>
         </w:rPr>
         <w:drawing>
           <wp:inline distT="0" distB="0" distL="0" distR="0" wp14:anchorId="29A5CC91" wp14:editId="58A59564">
@@ -1565,7 +1570,7 @@
                     <pic:cNvPicPr/>
                   </pic:nvPicPr>
                   <pic:blipFill>
-                    <a:blip r:embed="rId11">
+                    <a:blip r:embed="rId10">
                       <a:extLst>
                         <a:ext uri="{28A0092B-C50C-407E-A947-70E740481C1C}">
                           <a14:useLocalDpi xmlns:a14="http://schemas.microsoft.com/office/drawing/2010/main" val="0"/>
@@ -1775,7 +1780,7 @@
         <w:rPr>
           <w:rFonts w:cs="Times New Roman"/>
           <w:noProof/>
-          <w:lang w:bidi="ar-SA"/>
+          <w:lang w:val="en-IN" w:eastAsia="en-IN" w:bidi="ar-SA"/>
         </w:rPr>
         <w:drawing>
           <wp:inline distT="0" distB="0" distL="0" distR="0" wp14:anchorId="6360F870" wp14:editId="1A27DC19">
@@ -1793,7 +1798,7 @@
                     <pic:cNvPicPr/>
                   </pic:nvPicPr>
                   <pic:blipFill>
-                    <a:blip r:embed="rId12">
+                    <a:blip r:embed="rId11">
                       <a:extLst>
                         <a:ext uri="{28A0092B-C50C-407E-A947-70E740481C1C}">
                           <a14:useLocalDpi xmlns:a14="http://schemas.microsoft.com/office/drawing/2010/main" val="0"/>
@@ -1973,7 +1978,7 @@
         <w:rPr>
           <w:rFonts w:cs="Times New Roman"/>
           <w:noProof/>
-          <w:lang w:bidi="ar-SA"/>
+          <w:lang w:val="en-IN" w:eastAsia="en-IN" w:bidi="ar-SA"/>
         </w:rPr>
         <w:drawing>
           <wp:inline distT="0" distB="0" distL="0" distR="0" wp14:anchorId="063364C8" wp14:editId="7CADFAE2">
@@ -1991,7 +1996,7 @@
                     <pic:cNvPicPr/>
                   </pic:nvPicPr>
                   <pic:blipFill>
-                    <a:blip r:embed="rId13">
+                    <a:blip r:embed="rId12">
                       <a:extLst>
                         <a:ext uri="{28A0092B-C50C-407E-A947-70E740481C1C}">
                           <a14:useLocalDpi xmlns:a14="http://schemas.microsoft.com/office/drawing/2010/main" val="0"/>
@@ -2249,7 +2254,7 @@
         <w:rPr>
           <w:rFonts w:cs="Times New Roman"/>
           <w:noProof/>
-          <w:lang w:bidi="ar-SA"/>
+          <w:lang w:val="en-IN" w:eastAsia="en-IN" w:bidi="ar-SA"/>
         </w:rPr>
         <w:drawing>
           <wp:inline distT="0" distB="0" distL="0" distR="0" wp14:anchorId="397EB314" wp14:editId="4CA8CD39">
@@ -2267,7 +2272,7 @@
                     <pic:cNvPicPr/>
                   </pic:nvPicPr>
                   <pic:blipFill>
-                    <a:blip r:embed="rId14">
+                    <a:blip r:embed="rId13">
                       <a:extLst>
                         <a:ext uri="{28A0092B-C50C-407E-A947-70E740481C1C}">
                           <a14:useLocalDpi xmlns:a14="http://schemas.microsoft.com/office/drawing/2010/main" val="0"/>
@@ -2601,7 +2606,7 @@
         <w:rPr>
           <w:rFonts w:cs="Times New Roman"/>
           <w:noProof/>
-          <w:lang w:bidi="ar-SA"/>
+          <w:lang w:val="en-IN" w:eastAsia="en-IN" w:bidi="ar-SA"/>
         </w:rPr>
         <w:drawing>
           <wp:inline distT="0" distB="0" distL="0" distR="0" wp14:anchorId="02D5DE13" wp14:editId="61B534A0">
@@ -2619,7 +2624,7 @@
                     <pic:cNvPicPr/>
                   </pic:nvPicPr>
                   <pic:blipFill>
-                    <a:blip r:embed="rId15">
+                    <a:blip r:embed="rId14">
                       <a:extLst>
                         <a:ext uri="{28A0092B-C50C-407E-A947-70E740481C1C}">
                           <a14:useLocalDpi xmlns:a14="http://schemas.microsoft.com/office/drawing/2010/main" val="0"/>
@@ -3168,7 +3173,7 @@
         <w:rPr>
           <w:rFonts w:cs="Times New Roman"/>
           <w:noProof/>
-          <w:lang w:bidi="ar-SA"/>
+          <w:lang w:val="en-IN" w:eastAsia="en-IN" w:bidi="ar-SA"/>
         </w:rPr>
         <w:lastRenderedPageBreak/>
         <w:drawing>
@@ -3187,7 +3192,7 @@
                     <pic:cNvPicPr/>
                   </pic:nvPicPr>
                   <pic:blipFill>
-                    <a:blip r:embed="rId16">
+                    <a:blip r:embed="rId15">
                       <a:extLst>
                         <a:ext uri="{28A0092B-C50C-407E-A947-70E740481C1C}">
                           <a14:useLocalDpi xmlns:a14="http://schemas.microsoft.com/office/drawing/2010/main" val="0"/>
@@ -3351,7 +3356,7 @@
         <w:rPr>
           <w:rFonts w:cs="Times New Roman"/>
           <w:noProof/>
-          <w:lang w:bidi="ar-SA"/>
+          <w:lang w:val="en-IN" w:eastAsia="en-IN" w:bidi="ar-SA"/>
         </w:rPr>
         <w:drawing>
           <wp:inline distT="0" distB="0" distL="0" distR="0" wp14:anchorId="4669DE06" wp14:editId="66777022">
@@ -3369,7 +3374,7 @@
                     <pic:cNvPicPr/>
                   </pic:nvPicPr>
                   <pic:blipFill>
-                    <a:blip r:embed="rId17">
+                    <a:blip r:embed="rId16">
                       <a:extLst>
                         <a:ext uri="{28A0092B-C50C-407E-A947-70E740481C1C}">
                           <a14:useLocalDpi xmlns:a14="http://schemas.microsoft.com/office/drawing/2010/main" val="0"/>
@@ -3538,7 +3543,7 @@
         <w:rPr>
           <w:rFonts w:cs="Times New Roman"/>
           <w:noProof/>
-          <w:lang w:bidi="ar-SA"/>
+          <w:lang w:val="en-IN" w:eastAsia="en-IN" w:bidi="ar-SA"/>
         </w:rPr>
         <w:lastRenderedPageBreak/>
         <w:drawing>
@@ -3557,7 +3562,7 @@
                     <pic:cNvPicPr/>
                   </pic:nvPicPr>
                   <pic:blipFill>
-                    <a:blip r:embed="rId18">
+                    <a:blip r:embed="rId17">
                       <a:extLst>
                         <a:ext uri="{28A0092B-C50C-407E-A947-70E740481C1C}">
                           <a14:useLocalDpi xmlns:a14="http://schemas.microsoft.com/office/drawing/2010/main" val="0"/>
@@ -3769,7 +3774,7 @@
         <w:rPr>
           <w:rFonts w:cs="Times New Roman"/>
           <w:noProof/>
-          <w:lang w:bidi="ar-SA"/>
+          <w:lang w:val="en-IN" w:eastAsia="en-IN" w:bidi="ar-SA"/>
         </w:rPr>
         <w:drawing>
           <wp:inline distT="0" distB="0" distL="0" distR="0" wp14:anchorId="2D936D13" wp14:editId="0BCC2E99">
@@ -3787,7 +3792,7 @@
                     <pic:cNvPicPr/>
                   </pic:nvPicPr>
                   <pic:blipFill>
-                    <a:blip r:embed="rId19">
+                    <a:blip r:embed="rId18">
                       <a:extLst>
                         <a:ext uri="{28A0092B-C50C-407E-A947-70E740481C1C}">
                           <a14:useLocalDpi xmlns:a14="http://schemas.microsoft.com/office/drawing/2010/main" val="0"/>
@@ -3865,7 +3870,7 @@
       <w:r>
         <w:rPr>
           <w:noProof/>
-          <w:lang w:bidi="ar-SA"/>
+          <w:lang w:val="en-IN" w:eastAsia="en-IN" w:bidi="ar-SA"/>
         </w:rPr>
         <w:lastRenderedPageBreak/>
         <w:drawing>
@@ -3884,7 +3889,7 @@
                     <pic:cNvPicPr/>
                   </pic:nvPicPr>
                   <pic:blipFill>
-                    <a:blip r:embed="rId20">
+                    <a:blip r:embed="rId19">
                       <a:extLst>
                         <a:ext uri="{28A0092B-C50C-407E-A947-70E740481C1C}">
                           <a14:useLocalDpi xmlns:a14="http://schemas.microsoft.com/office/drawing/2010/main" val="0"/>
@@ -3963,7 +3968,7 @@
         <w:rPr>
           <w:rFonts w:cs="Times New Roman"/>
           <w:noProof/>
-          <w:lang w:bidi="ar-SA"/>
+          <w:lang w:val="en-IN" w:eastAsia="en-IN" w:bidi="ar-SA"/>
         </w:rPr>
         <w:drawing>
           <wp:inline distT="0" distB="0" distL="0" distR="0" wp14:anchorId="7EFB476E" wp14:editId="08F05448">
@@ -3981,7 +3986,7 @@
                     <pic:cNvPicPr/>
                   </pic:nvPicPr>
                   <pic:blipFill>
-                    <a:blip r:embed="rId21">
+                    <a:blip r:embed="rId20">
                       <a:extLst>
                         <a:ext uri="{28A0092B-C50C-407E-A947-70E740481C1C}">
                           <a14:useLocalDpi xmlns:a14="http://schemas.microsoft.com/office/drawing/2010/main" val="0"/>
@@ -4520,7 +4525,7 @@
         <w:rPr>
           <w:rFonts w:cs="Times New Roman"/>
           <w:noProof/>
-          <w:lang w:bidi="ar-SA"/>
+          <w:lang w:val="en-IN" w:eastAsia="en-IN" w:bidi="ar-SA"/>
         </w:rPr>
         <w:drawing>
           <wp:inline distT="0" distB="0" distL="0" distR="0" wp14:anchorId="06DDF174" wp14:editId="0B849176">
@@ -4535,6 +4540,158 @@
                 <pic:pic xmlns:pic="http://schemas.openxmlformats.org/drawingml/2006/picture">
                   <pic:nvPicPr>
                     <pic:cNvPr id="0" name="5.3.a.png"/>
+                    <pic:cNvPicPr/>
+                  </pic:nvPicPr>
+                  <pic:blipFill>
+                    <a:blip r:embed="rId21">
+                      <a:extLst>
+                        <a:ext uri="{28A0092B-C50C-407E-A947-70E740481C1C}">
+                          <a14:useLocalDpi xmlns:a14="http://schemas.microsoft.com/office/drawing/2010/main" val="0"/>
+                        </a:ext>
+                      </a:extLst>
+                    </a:blip>
+                    <a:stretch>
+                      <a:fillRect/>
+                    </a:stretch>
+                  </pic:blipFill>
+                  <pic:spPr>
+                    <a:xfrm>
+                      <a:off x="0" y="0"/>
+                      <a:ext cx="285790" cy="219106"/>
+                    </a:xfrm>
+                    <a:prstGeom prst="rect">
+                      <a:avLst/>
+                    </a:prstGeom>
+                  </pic:spPr>
+                </pic:pic>
+              </a:graphicData>
+            </a:graphic>
+          </wp:inline>
+        </w:drawing>
+      </w:r>
+      <w:r>
+        <w:rPr>
+          <w:rFonts w:cs="Times New Roman"/>
+        </w:rPr>
+        <w:t xml:space="preserve"> Setting </w:t>
+      </w:r>
+      <w:r>
+        <w:rPr>
+          <w:rFonts w:cs="Times New Roman"/>
+        </w:rPr>
+        <w:t>icon to change Some more setting:</w:t>
+      </w:r>
+    </w:p>
+    <w:p>
+      <w:pPr>
+        <w:pStyle w:val="ListParagraph"/>
+        <w:numPr>
+          <w:ilvl w:val="2"/>
+          <w:numId w:val="20"/>
+        </w:numPr>
+        <w:rPr>
+          <w:rFonts w:cs="Times New Roman"/>
+        </w:rPr>
+      </w:pPr>
+      <w:r>
+        <w:rPr>
+          <w:rFonts w:cs="Times New Roman"/>
+        </w:rPr>
+        <w:t xml:space="preserve">Log File will append on every Session </w:t>
+      </w:r>
+      <w:r>
+        <w:rPr>
+          <w:rFonts w:cs="Times New Roman"/>
+        </w:rPr>
+        <w:t xml:space="preserve">or </w:t>
+      </w:r>
+      <w:proofErr w:type="gramStart"/>
+      <w:r>
+        <w:rPr>
+          <w:rFonts w:cs="Times New Roman"/>
+        </w:rPr>
+        <w:t>Not</w:t>
+      </w:r>
+      <w:r>
+        <w:rPr>
+          <w:rFonts w:cs="Times New Roman"/>
+        </w:rPr>
+        <w:t>(</w:t>
+      </w:r>
+      <w:proofErr w:type="gramEnd"/>
+      <w:r>
+        <w:rPr>
+          <w:rFonts w:cs="Times New Roman"/>
+        </w:rPr>
+        <w:t>On startup).</w:t>
+      </w:r>
+    </w:p>
+    <w:p>
+      <w:pPr>
+        <w:pStyle w:val="ListParagraph"/>
+        <w:numPr>
+          <w:ilvl w:val="2"/>
+          <w:numId w:val="20"/>
+        </w:numPr>
+        <w:rPr>
+          <w:rFonts w:cs="Times New Roman"/>
+        </w:rPr>
+      </w:pPr>
+      <w:r>
+        <w:rPr>
+          <w:rFonts w:cs="Times New Roman"/>
+        </w:rPr>
+        <w:t>Restart IDM every time on restore</w:t>
+      </w:r>
+      <w:r>
+        <w:rPr>
+          <w:rFonts w:cs="Times New Roman"/>
+        </w:rPr>
+        <w:t xml:space="preserve"> or Not</w:t>
+      </w:r>
+      <w:r>
+        <w:rPr>
+          <w:rFonts w:cs="Times New Roman"/>
+        </w:rPr>
+        <w:t>.</w:t>
+      </w:r>
+    </w:p>
+    <w:p>
+      <w:pPr>
+        <w:pStyle w:val="ListParagraph"/>
+        <w:numPr>
+          <w:ilvl w:val="1"/>
+          <w:numId w:val="20"/>
+        </w:numPr>
+        <w:rPr>
+          <w:rFonts w:cs="Times New Roman"/>
+        </w:rPr>
+      </w:pPr>
+      <w:r>
+        <w:rPr>
+          <w:rFonts w:cs="Times New Roman"/>
+        </w:rPr>
+        <w:t xml:space="preserve">Click on </w:t>
+      </w:r>
+      <w:r>
+        <w:rPr>
+          <w:rFonts w:cs="Times New Roman"/>
+          <w:noProof/>
+          <w:lang w:val="en-IN" w:eastAsia="en-IN" w:bidi="ar-SA"/>
+        </w:rPr>
+        <w:drawing>
+          <wp:inline distT="0" distB="0" distL="0" distR="0" wp14:anchorId="77CD16AF" wp14:editId="11EC27F8">
+            <wp:extent cx="285790" cy="219106"/>
+            <wp:effectExtent l="0" t="0" r="0" b="9525"/>
+            <wp:docPr id="19" name="Picture 19"/>
+            <wp:cNvGraphicFramePr>
+              <a:graphicFrameLocks xmlns:a="http://schemas.openxmlformats.org/drawingml/2006/main" noChangeAspect="1"/>
+            </wp:cNvGraphicFramePr>
+            <a:graphic xmlns:a="http://schemas.openxmlformats.org/drawingml/2006/main">
+              <a:graphicData uri="http://schemas.openxmlformats.org/drawingml/2006/picture">
+                <pic:pic xmlns:pic="http://schemas.openxmlformats.org/drawingml/2006/picture">
+                  <pic:nvPicPr>
+                    <pic:cNvPr id="0" name="5.3.b.png"/>
                     <pic:cNvPicPr/>
                   </pic:nvPicPr>
                   <pic:blipFill>
@@ -4568,87 +4725,33 @@
         <w:rPr>
           <w:rFonts w:cs="Times New Roman"/>
         </w:rPr>
-        <w:t xml:space="preserve"> Setting </w:t>
-      </w:r>
-      <w:r>
-        <w:rPr>
-          <w:rFonts w:cs="Times New Roman"/>
-        </w:rPr>
-        <w:t>icon to change Some more setting:</w:t>
-      </w:r>
-    </w:p>
-    <w:p>
-      <w:pPr>
-        <w:pStyle w:val="ListParagraph"/>
-        <w:numPr>
-          <w:ilvl w:val="2"/>
-          <w:numId w:val="20"/>
-        </w:numPr>
-        <w:rPr>
-          <w:rFonts w:cs="Times New Roman"/>
-        </w:rPr>
-      </w:pPr>
-      <w:r>
-        <w:rPr>
-          <w:rFonts w:cs="Times New Roman"/>
-        </w:rPr>
-        <w:t xml:space="preserve">Log File will append on every Session </w:t>
-      </w:r>
-      <w:r>
-        <w:rPr>
-          <w:rFonts w:cs="Times New Roman"/>
-        </w:rPr>
-        <w:t xml:space="preserve">or </w:t>
-      </w:r>
-      <w:proofErr w:type="gramStart"/>
-      <w:r>
-        <w:rPr>
-          <w:rFonts w:cs="Times New Roman"/>
-        </w:rPr>
-        <w:t>Not</w:t>
-      </w:r>
-      <w:r>
-        <w:rPr>
-          <w:rFonts w:cs="Times New Roman"/>
-        </w:rPr>
-        <w:t>(</w:t>
-      </w:r>
-      <w:proofErr w:type="gramEnd"/>
-      <w:r>
-        <w:rPr>
-          <w:rFonts w:cs="Times New Roman"/>
-        </w:rPr>
-        <w:t>On startup).</w:t>
-      </w:r>
-    </w:p>
-    <w:p>
-      <w:pPr>
-        <w:pStyle w:val="ListParagraph"/>
-        <w:numPr>
-          <w:ilvl w:val="2"/>
-          <w:numId w:val="20"/>
-        </w:numPr>
-        <w:rPr>
-          <w:rFonts w:cs="Times New Roman"/>
-        </w:rPr>
-      </w:pPr>
-      <w:r>
-        <w:rPr>
-          <w:rFonts w:cs="Times New Roman"/>
-        </w:rPr>
-        <w:t>Restart IDM every time on restore</w:t>
-      </w:r>
-      <w:r>
-        <w:rPr>
-          <w:rFonts w:cs="Times New Roman"/>
-        </w:rPr>
-        <w:t xml:space="preserve"> or Not</w:t>
-      </w:r>
-      <w:r>
-        <w:rPr>
-          <w:rFonts w:cs="Times New Roman"/>
-        </w:rPr>
-        <w:t>.</w:t>
+        <w:t xml:space="preserve"> Association icon to associate .</w:t>
+      </w:r>
+      <w:proofErr w:type="spellStart"/>
+      <w:r>
+        <w:rPr>
+          <w:rFonts w:cs="Times New Roman"/>
+        </w:rPr>
+        <w:t>ibf</w:t>
+      </w:r>
+      <w:proofErr w:type="spellEnd"/>
+      <w:r>
+        <w:rPr>
+          <w:rFonts w:cs="Times New Roman"/>
+        </w:rPr>
+        <w:t xml:space="preserve"> </w:t>
+      </w:r>
+      <w:r>
+        <w:rPr>
+          <w:rFonts w:cs="Times New Roman"/>
+        </w:rPr>
+        <w:t>(IDM Backup File)</w:t>
+      </w:r>
+      <w:r>
+        <w:rPr>
+          <w:rFonts w:cs="Times New Roman"/>
+        </w:rPr>
+        <w:t xml:space="preserve"> file.</w:t>
       </w:r>
     </w:p>
     <w:p>
@@ -4672,13 +4775,13 @@
         <w:rPr>
           <w:rFonts w:cs="Times New Roman"/>
           <w:noProof/>
-          <w:lang w:bidi="ar-SA"/>
+          <w:lang w:val="en-IN" w:eastAsia="en-IN" w:bidi="ar-SA"/>
         </w:rPr>
         <w:drawing>
-          <wp:inline distT="0" distB="0" distL="0" distR="0" wp14:anchorId="77CD16AF" wp14:editId="11EC27F8">
+          <wp:inline distT="0" distB="0" distL="0" distR="0" wp14:anchorId="2BC61A41" wp14:editId="69E9FC30">
             <wp:extent cx="285790" cy="219106"/>
             <wp:effectExtent l="0" t="0" r="0" b="9525"/>
-            <wp:docPr id="19" name="Picture 19"/>
+            <wp:docPr id="20" name="Picture 20"/>
             <wp:cNvGraphicFramePr>
               <a:graphicFrameLocks xmlns:a="http://schemas.openxmlformats.org/drawingml/2006/main" noChangeAspect="1"/>
             </wp:cNvGraphicFramePr>
@@ -4686,7 +4789,7 @@
               <a:graphicData uri="http://schemas.openxmlformats.org/drawingml/2006/picture">
                 <pic:pic xmlns:pic="http://schemas.openxmlformats.org/drawingml/2006/picture">
                   <pic:nvPicPr>
-                    <pic:cNvPr id="0" name="5.3.b.png"/>
+                    <pic:cNvPr id="0" name="5.3.c.png"/>
                     <pic:cNvPicPr/>
                   </pic:nvPicPr>
                   <pic:blipFill>
@@ -4720,104 +4823,6 @@
         <w:rPr>
           <w:rFonts w:cs="Times New Roman"/>
         </w:rPr>
-        <w:t xml:space="preserve"> Association icon to associate .</w:t>
-      </w:r>
-      <w:proofErr w:type="spellStart"/>
-      <w:r>
-        <w:rPr>
-          <w:rFonts w:cs="Times New Roman"/>
-        </w:rPr>
-        <w:t>ibf</w:t>
-      </w:r>
-      <w:proofErr w:type="spellEnd"/>
-      <w:r>
-        <w:rPr>
-          <w:rFonts w:cs="Times New Roman"/>
-        </w:rPr>
-        <w:t xml:space="preserve"> </w:t>
-      </w:r>
-      <w:r>
-        <w:rPr>
-          <w:rFonts w:cs="Times New Roman"/>
-        </w:rPr>
-        <w:t>(IDM Backup File)</w:t>
-      </w:r>
-      <w:r>
-        <w:rPr>
-          <w:rFonts w:cs="Times New Roman"/>
-        </w:rPr>
-        <w:t xml:space="preserve"> file.</w:t>
-      </w:r>
-    </w:p>
-    <w:p>
-      <w:pPr>
-        <w:pStyle w:val="ListParagraph"/>
-        <w:numPr>
-          <w:ilvl w:val="1"/>
-          <w:numId w:val="20"/>
-        </w:numPr>
-        <w:rPr>
-          <w:rFonts w:cs="Times New Roman"/>
-        </w:rPr>
-      </w:pPr>
-      <w:r>
-        <w:rPr>
-          <w:rFonts w:cs="Times New Roman"/>
-        </w:rPr>
-        <w:t xml:space="preserve">Click on </w:t>
-      </w:r>
-      <w:r>
-        <w:rPr>
-          <w:rFonts w:cs="Times New Roman"/>
-          <w:noProof/>
-          <w:lang w:bidi="ar-SA"/>
-        </w:rPr>
-        <w:drawing>
-          <wp:inline distT="0" distB="0" distL="0" distR="0" wp14:anchorId="2BC61A41" wp14:editId="69E9FC30">
-            <wp:extent cx="285790" cy="219106"/>
-            <wp:effectExtent l="0" t="0" r="0" b="9525"/>
-            <wp:docPr id="20" name="Picture 20"/>
-            <wp:cNvGraphicFramePr>
-              <a:graphicFrameLocks xmlns:a="http://schemas.openxmlformats.org/drawingml/2006/main" noChangeAspect="1"/>
-            </wp:cNvGraphicFramePr>
-            <a:graphic xmlns:a="http://schemas.openxmlformats.org/drawingml/2006/main">
-              <a:graphicData uri="http://schemas.openxmlformats.org/drawingml/2006/picture">
-                <pic:pic xmlns:pic="http://schemas.openxmlformats.org/drawingml/2006/picture">
-                  <pic:nvPicPr>
-                    <pic:cNvPr id="0" name="5.3.c.png"/>
-                    <pic:cNvPicPr/>
-                  </pic:nvPicPr>
-                  <pic:blipFill>
-                    <a:blip r:embed="rId24">
-                      <a:extLst>
-                        <a:ext uri="{28A0092B-C50C-407E-A947-70E740481C1C}">
-                          <a14:useLocalDpi xmlns:a14="http://schemas.microsoft.com/office/drawing/2010/main" val="0"/>
-                        </a:ext>
-                      </a:extLst>
-                    </a:blip>
-                    <a:stretch>
-                      <a:fillRect/>
-                    </a:stretch>
-                  </pic:blipFill>
-                  <pic:spPr>
-                    <a:xfrm>
-                      <a:off x="0" y="0"/>
-                      <a:ext cx="285790" cy="219106"/>
-                    </a:xfrm>
-                    <a:prstGeom prst="rect">
-                      <a:avLst/>
-                    </a:prstGeom>
-                  </pic:spPr>
-                </pic:pic>
-              </a:graphicData>
-            </a:graphic>
-          </wp:inline>
-        </w:drawing>
-      </w:r>
-      <w:r>
-        <w:rPr>
-          <w:rFonts w:cs="Times New Roman"/>
-        </w:rPr>
         <w:t xml:space="preserve"> Restore default icon to default all setting including default profile.</w:t>
       </w:r>
     </w:p>
@@ -4877,14 +4882,14 @@
         <w:rPr>
           <w:rFonts w:cs="Times New Roman"/>
           <w:noProof/>
-          <w:lang w:bidi="ar-SA"/>
+          <w:lang w:val="en-IN" w:eastAsia="en-IN" w:bidi="ar-SA"/>
         </w:rPr>
         <w:drawing>
           <wp:inline distT="0" distB="0" distL="0" distR="0" wp14:anchorId="507CAFB4" wp14:editId="5A6D664E">
             <wp:extent cx="190500" cy="190500"/>
             <wp:effectExtent l="0" t="0" r="0" b="0"/>
             <wp:docPr id="16" name="Picture 0" descr="thumbs_up.gif">
-              <a:hlinkClick xmlns:a="http://schemas.openxmlformats.org/drawingml/2006/main" r:id="rId9"/>
+              <a:hlinkClick xmlns:a="http://schemas.openxmlformats.org/drawingml/2006/main" r:id="rId8"/>
             </wp:docPr>
             <wp:cNvGraphicFramePr>
               <a:graphicFrameLocks xmlns:a="http://schemas.openxmlformats.org/drawingml/2006/main" noChangeAspect="1"/>
@@ -4897,7 +4902,7 @@
                     <pic:cNvPicPr/>
                   </pic:nvPicPr>
                   <pic:blipFill>
-                    <a:blip r:embed="rId10"/>
+                    <a:blip r:embed="rId9"/>
                     <a:stretch>
                       <a:fillRect/>
                     </a:stretch>
@@ -5179,14 +5184,14 @@
         <w:rPr>
           <w:rFonts w:cs="Times New Roman"/>
           <w:noProof/>
-          <w:lang w:bidi="ar-SA"/>
+          <w:lang w:val="en-IN" w:eastAsia="en-IN" w:bidi="ar-SA"/>
         </w:rPr>
         <w:drawing>
           <wp:inline distT="0" distB="0" distL="0" distR="0" wp14:anchorId="4898E3F7" wp14:editId="2C6E5CAA">
             <wp:extent cx="190500" cy="190500"/>
             <wp:effectExtent l="0" t="0" r="0" b="0"/>
             <wp:docPr id="17" name="Picture 0" descr="thumbs_up.gif">
-              <a:hlinkClick xmlns:a="http://schemas.openxmlformats.org/drawingml/2006/main" r:id="rId9"/>
+              <a:hlinkClick xmlns:a="http://schemas.openxmlformats.org/drawingml/2006/main" r:id="rId8"/>
             </wp:docPr>
             <wp:cNvGraphicFramePr>
               <a:graphicFrameLocks xmlns:a="http://schemas.openxmlformats.org/drawingml/2006/main" noChangeAspect="1"/>
@@ -5199,7 +5204,7 @@
                     <pic:cNvPicPr/>
                   </pic:nvPicPr>
                   <pic:blipFill>
-                    <a:blip r:embed="rId10"/>
+                    <a:blip r:embed="rId9"/>
                     <a:stretch>
                       <a:fillRect/>
                     </a:stretch>
@@ -5225,7 +5230,6 @@
         <w:tblStyle w:val="TableGrid"/>
         <w:tblW w:w="0" w:type="auto"/>
         <w:jc w:val="center"/>
-        <w:tblInd w:w="198" w:type="dxa"/>
         <w:tblBorders>
           <w:bottom w:val="single" w:sz="4" w:space="0" w:color="auto"/>
         </w:tblBorders>
@@ -5283,7 +5287,7 @@
               </w:rPr>
               <w:t xml:space="preserve"> </w:t>
             </w:r>
-            <w:hyperlink r:id="rId25" w:history="1">
+            <w:hyperlink r:id="rId24" w:history="1">
               <w:r>
                 <w:rPr>
                   <w:rStyle w:val="Hyperlink"/>
@@ -5341,7 +5345,7 @@
               </w:rPr>
               <w:t xml:space="preserve"> </w:t>
             </w:r>
-            <w:hyperlink r:id="rId26" w:tgtFrame="_blank" w:history="1">
+            <w:hyperlink r:id="rId25" w:tgtFrame="_blank" w:history="1">
               <w:r>
                 <w:rPr>
                   <w:rStyle w:val="Hyperlink"/>
@@ -5393,7 +5397,7 @@
               </w:rPr>
               <w:t>:</w:t>
             </w:r>
-            <w:hyperlink r:id="rId27" w:tgtFrame="_blank" w:history="1">
+            <w:hyperlink r:id="rId26" w:tgtFrame="_blank" w:history="1">
               <w:r>
                 <w:rPr>
                   <w:rStyle w:val="Hyperlink"/>
@@ -5445,7 +5449,7 @@
               </w:rPr>
               <w:t>:</w:t>
             </w:r>
-            <w:hyperlink r:id="rId28" w:tgtFrame="_blank" w:history="1">
+            <w:hyperlink r:id="rId27" w:tgtFrame="_blank" w:history="1">
               <w:r>
                 <w:rPr>
                   <w:rStyle w:val="Hyperlink"/>
@@ -5472,14 +5476,14 @@
         <w:rPr>
           <w:rFonts w:cs="Times New Roman"/>
           <w:noProof/>
-          <w:lang w:bidi="ar-SA"/>
+          <w:lang w:val="en-IN" w:eastAsia="en-IN" w:bidi="ar-SA"/>
         </w:rPr>
         <w:drawing>
           <wp:inline distT="0" distB="0" distL="0" distR="0">
             <wp:extent cx="900113" cy="900113"/>
             <wp:effectExtent l="19050" t="0" r="0" b="0"/>
             <wp:docPr id="18" name="Picture 17" descr="images.jpg">
-              <a:hlinkClick xmlns:a="http://schemas.openxmlformats.org/drawingml/2006/main" r:id="rId9"/>
+              <a:hlinkClick xmlns:a="http://schemas.openxmlformats.org/drawingml/2006/main" r:id="rId8"/>
             </wp:docPr>
             <wp:cNvGraphicFramePr>
               <a:graphicFrameLocks xmlns:a="http://schemas.openxmlformats.org/drawingml/2006/main" noChangeAspect="1"/>
@@ -5492,7 +5496,7 @@
                     <pic:cNvPicPr/>
                   </pic:nvPicPr>
                   <pic:blipFill>
-                    <a:blip r:embed="rId29"/>
+                    <a:blip r:embed="rId28"/>
                     <a:stretch>
                       <a:fillRect/>
                     </a:stretch>
@@ -5524,7 +5528,7 @@
 </file>
 
 <file path=word/numbering.xml><?xml version="1.0" encoding="utf-8"?>
-<w:numbering xmlns:wpc="http://schemas.microsoft.com/office/word/2010/wordprocessingCanvas" xmlns:mc="http://schemas.openxmlformats.org/markup-compatibility/2006" xmlns:o="urn:schemas-microsoft-com:office:office" xmlns:r="http://schemas.openxmlformats.org/officeDocument/2006/relationships" xmlns:m="http://schemas.openxmlformats.org/officeDocument/2006/math" xmlns:v="urn:schemas-microsoft-com:vml" xmlns:wp14="http://schemas.microsoft.com/office/word/2010/wordprocessingDrawing" xmlns:wp="http://schemas.openxmlformats.org/drawingml/2006/wordprocessingDrawing" xmlns:w10="urn:schemas-microsoft-com:office:word" xmlns:w="http://schemas.openxmlformats.org/wordprocessingml/2006/main" xmlns:w14="http://schemas.microsoft.com/office/word/2010/wordml" xmlns:wpg="http://schemas.microsoft.com/office/word/2010/wordprocessingGroup" xmlns:wpi="http://schemas.microsoft.com/office/word/2010/wordprocessingInk" xmlns:wne="http://schemas.microsoft.com/office/word/2006/wordml" xmlns:wps="http://schemas.microsoft.com/office/word/2010/wordprocessingShape" mc:Ignorable="w14 wp14">
+<w:numbering xmlns:wpc="http://schemas.microsoft.com/office/word/2010/wordprocessingCanvas" xmlns:mc="http://schemas.openxmlformats.org/markup-compatibility/2006" xmlns:o="urn:schemas-microsoft-com:office:office" xmlns:r="http://schemas.openxmlformats.org/officeDocument/2006/relationships" xmlns:m="http://schemas.openxmlformats.org/officeDocument/2006/math" xmlns:v="urn:schemas-microsoft-com:vml" xmlns:wp14="http://schemas.microsoft.com/office/word/2010/wordprocessingDrawing" xmlns:wp="http://schemas.openxmlformats.org/drawingml/2006/wordprocessingDrawing" xmlns:w10="urn:schemas-microsoft-com:office:word" xmlns:w="http://schemas.openxmlformats.org/wordprocessingml/2006/main" xmlns:w14="http://schemas.microsoft.com/office/word/2010/wordml" xmlns:w15="http://schemas.microsoft.com/office/word/2012/wordml" xmlns:wpg="http://schemas.microsoft.com/office/word/2010/wordprocessingGroup" xmlns:wpi="http://schemas.microsoft.com/office/word/2010/wordprocessingInk" xmlns:wne="http://schemas.microsoft.com/office/word/2006/wordml" xmlns:wps="http://schemas.microsoft.com/office/word/2010/wordprocessingShape" mc:Ignorable="w14 w15 wp14">
   <w:abstractNum w:abstractNumId="0">
     <w:nsid w:val="003D5CD4"/>
     <w:multiLevelType w:val="multilevel"/>
@@ -7638,7 +7642,7 @@
 </file>
 
 <file path=word/styles.xml><?xml version="1.0" encoding="utf-8"?>
-<w:styles xmlns:mc="http://schemas.openxmlformats.org/markup-compatibility/2006" xmlns:r="http://schemas.openxmlformats.org/officeDocument/2006/relationships" xmlns:w="http://schemas.openxmlformats.org/wordprocessingml/2006/main" xmlns:w14="http://schemas.microsoft.com/office/word/2010/wordml" mc:Ignorable="w14">
+<w:styles xmlns:mc="http://schemas.openxmlformats.org/markup-compatibility/2006" xmlns:r="http://schemas.openxmlformats.org/officeDocument/2006/relationships" xmlns:w="http://schemas.openxmlformats.org/wordprocessingml/2006/main" xmlns:w14="http://schemas.microsoft.com/office/word/2010/wordml" xmlns:w15="http://schemas.microsoft.com/office/word/2012/wordml" mc:Ignorable="w14 w15">
   <w:docDefaults>
     <w:rPrDefault>
       <w:rPr>
@@ -7654,1098 +7658,378 @@
       </w:pPr>
     </w:pPrDefault>
   </w:docDefaults>
-  <w:latentStyles w:defLockedState="0" w:defUIPriority="99" w:defSemiHidden="1" w:defUnhideWhenUsed="1" w:defQFormat="0" w:count="267">
-    <w:lsdException w:name="Normal" w:semiHidden="0" w:uiPriority="0" w:unhideWhenUsed="0" w:qFormat="1"/>
-    <w:lsdException w:name="heading 1" w:semiHidden="0" w:uiPriority="9" w:unhideWhenUsed="0" w:qFormat="1"/>
-    <w:lsdException w:name="heading 2" w:uiPriority="9" w:qFormat="1"/>
-    <w:lsdException w:name="heading 3" w:uiPriority="9" w:qFormat="1"/>
-    <w:lsdException w:name="heading 4" w:uiPriority="9" w:qFormat="1"/>
-    <w:lsdException w:name="heading 5" w:uiPriority="9" w:qFormat="1"/>
-    <w:lsdException w:name="heading 6" w:uiPriority="9" w:qFormat="1"/>
-    <w:lsdException w:name="heading 7" w:uiPriority="9" w:qFormat="1"/>
-    <w:lsdException w:name="heading 8" w:uiPriority="9" w:qFormat="1"/>
-    <w:lsdException w:name="heading 9" w:uiPriority="9" w:qFormat="1"/>
-    <w:lsdException w:name="toc 1" w:uiPriority="39" w:qFormat="1"/>
-    <w:lsdException w:name="toc 2" w:uiPriority="39" w:qFormat="1"/>
-    <w:lsdException w:name="toc 3" w:uiPriority="39" w:qFormat="1"/>
-    <w:lsdException w:name="toc 4" w:uiPriority="39"/>
-    <w:lsdException w:name="toc 5" w:uiPriority="39"/>
-    <w:lsdException w:name="toc 6" w:uiPriority="39"/>
-    <w:lsdException w:name="toc 7" w:uiPriority="39"/>
-    <w:lsdException w:name="toc 8" w:uiPriority="39"/>
-    <w:lsdException w:name="toc 9" w:uiPriority="39"/>
-    <w:lsdException w:name="caption" w:uiPriority="35" w:qFormat="1"/>
-    <w:lsdException w:name="Title" w:semiHidden="0" w:uiPriority="10" w:unhideWhenUsed="0" w:qFormat="1"/>
-    <w:lsdException w:name="Default Paragraph Font" w:uiPriority="1"/>
-    <w:lsdException w:name="Subtitle" w:semiHidden="0" w:uiPriority="11" w:unhideWhenUsed="0" w:qFormat="1"/>
-    <w:lsdException w:name="Strong" w:semiHidden="0" w:uiPriority="22" w:unhideWhenUsed="0" w:qFormat="1"/>
-    <w:lsdException w:name="Emphasis" w:semiHidden="0" w:uiPriority="20" w:unhideWhenUsed="0" w:qFormat="1"/>
-    <w:lsdException w:name="Table Grid" w:semiHidden="0" w:uiPriority="59" w:unhideWhenUsed="0"/>
-    <w:lsdException w:name="Placeholder Text" w:unhideWhenUsed="0"/>
-    <w:lsdException w:name="No Spacing" w:semiHidden="0" w:uiPriority="1" w:unhideWhenUsed="0" w:qFormat="1"/>
-    <w:lsdException w:name="Light Shading" w:semiHidden="0" w:uiPriority="60" w:unhideWhenUsed="0"/>
-    <w:lsdException w:name="Light List" w:semiHidden="0" w:uiPriority="61" w:unhideWhenUsed="0"/>
-    <w:lsdException w:name="Light Grid" w:semiHidden="0" w:uiPriority="62" w:unhideWhenUsed="0"/>
-    <w:lsdException w:name="Medium Shading 1" w:semiHidden="0" w:uiPriority="63" w:unhideWhenUsed="0"/>
-    <w:lsdException w:name="Medium Shading 2" w:semiHidden="0" w:uiPriority="64" w:unhideWhenUsed="0"/>
-    <w:lsdException w:name="Medium List 1" w:semiHidden="0" w:uiPriority="65" w:unhideWhenUsed="0"/>
-    <w:lsdException w:name="Medium List 2" w:semiHidden="0" w:uiPriority="66" w:unhideWhenUsed="0"/>
-    <w:lsdException w:name="Medium Grid 1" w:semiHidden="0" w:uiPriority="67" w:unhideWhenUsed="0"/>
-    <w:lsdException w:name="Medium Grid 2" w:semiHidden="0" w:uiPriority="68" w:unhideWhenUsed="0"/>
-    <w:lsdException w:name="Medium Grid 3" w:semiHidden="0" w:uiPriority="69" w:unhideWhenUsed="0"/>
-    <w:lsdException w:name="Dark List" w:semiHidden="0" w:uiPriority="70" w:unhideWhenUsed="0"/>
-    <w:lsdException w:name="Colorful Shading" w:semiHidden="0" w:uiPriority="71" w:unhideWhenUsed="0"/>
-    <w:lsdException w:name="Colorful List" w:semiHidden="0" w:uiPriority="72" w:unhideWhenUsed="0"/>
-    <w:lsdException w:name="Colorful Grid" w:semiHidden="0" w:uiPriority="73" w:unhideWhenUsed="0"/>
-    <w:lsdException w:name="Light Shading Accent 1" w:semiHidden="0" w:uiPriority="60" w:unhideWhenUsed="0"/>
-    <w:lsdException w:name="Light List Accent 1" w:semiHidden="0" w:uiPriority="61" w:unhideWhenUsed="0"/>
-    <w:lsdException w:name="Light Grid Accent 1" w:semiHidden="0" w:uiPriority="62" w:unhideWhenUsed="0"/>
-    <w:lsdException w:name="Medium Shading 1 Accent 1" w:semiHidden="0" w:uiPriority="63" w:unhideWhenUsed="0"/>
-    <w:lsdException w:name="Medium Shading 2 Accent 1" w:semiHidden="0" w:uiPriority="64" w:unhideWhenUsed="0"/>
-    <w:lsdException w:name="Medium List 1 Accent 1" w:semiHidden="0" w:uiPriority="65" w:unhideWhenUsed="0"/>
-    <w:lsdException w:name="Revision" w:unhideWhenUsed="0"/>
-    <w:lsdException w:name="List Paragraph" w:semiHidden="0" w:uiPriority="34" w:unhideWhenUsed="0" w:qFormat="1"/>
-    <w:lsdException w:name="Quote" w:semiHidden="0" w:uiPriority="29" w:unhideWhenUsed="0" w:qFormat="1"/>
-    <w:lsdException w:name="Intense Quote" w:semiHidden="0" w:uiPriority="30" w:unhideWhenUsed="0" w:qFormat="1"/>
-    <w:lsdException w:name="Medium List 2 Accent 1" w:semiHidden="0" w:uiPriority="66" w:unhideWhenUsed="0"/>
-    <w:lsdException w:name="Medium Grid 1 Accent 1" w:semiHidden="0" w:uiPriority="67" w:unhideWhenUsed="0"/>
-    <w:lsdException w:name="Medium Grid 2 Accent 1" w:semiHidden="0" w:uiPriority="68" w:unhideWhenUsed="0"/>
-    <w:lsdException w:name="Medium Grid 3 Accent 1" w:semiHidden="0" w:uiPriority="69" w:unhideWhenUsed="0"/>
-    <w:lsdException w:name="Dark List Accent 1" w:semiHidden="0" w:uiPriority="70" w:unhideWhenUsed="0"/>
-    <w:lsdException w:name="Colorful Shading Accent 1" w:semiHidden="0" w:uiPriority="71" w:unhideWhenUsed="0"/>
-    <w:lsdException w:name="Colorful List Accent 1" w:semiHidden="0" w:uiPriority="72" w:unhideWhenUsed="0"/>
-    <w:lsdException w:name="Colorful Grid Accent 1" w:semiHidden="0" w:uiPriority="73" w:unhideWhenUsed="0"/>
-    <w:lsdException w:name="Light Shading Accent 2" w:semiHidden="0" w:uiPriority="60" w:unhideWhenUsed="0"/>
-    <w:lsdException w:name="Light List Accent 2" w:semiHidden="0" w:uiPriority="61" w:unhideWhenUsed="0"/>
-    <w:lsdException w:name="Light Grid Accent 2" w:semiHidden="0" w:uiPriority="62" w:unhideWhenUsed="0"/>
-    <w:lsdException w:name="Medium Shading 1 Accent 2" w:semiHidden="0" w:uiPriority="63" w:unhideWhenUsed="0"/>
-    <w:lsdException w:name="Medium Shading 2 Accent 2" w:semiHidden="0" w:uiPriority="64" w:unhideWhenUsed="0"/>
-    <w:lsdException w:name="Medium List 1 Accent 2" w:semiHidden="0" w:uiPriority="65" w:unhideWhenUsed="0"/>
-    <w:lsdException w:name="Medium List 2 Accent 2" w:semiHidden="0" w:uiPriority="66" w:unhideWhenUsed="0"/>
-    <w:lsdException w:name="Medium Grid 1 Accent 2" w:semiHidden="0" w:uiPriority="67" w:unhideWhenUsed="0"/>
-    <w:lsdException w:name="Medium Grid 2 Accent 2" w:semiHidden="0" w:uiPriority="68" w:unhideWhenUsed="0"/>
-    <w:lsdException w:name="Medium Grid 3 Accent 2" w:semiHidden="0" w:uiPriority="69" w:unhideWhenUsed="0"/>
-    <w:lsdException w:name="Dark List Accent 2" w:semiHidden="0" w:uiPriority="70" w:unhideWhenUsed="0"/>
-    <w:lsdException w:name="Colorful Shading Accent 2" w:semiHidden="0" w:uiPriority="71" w:unhideWhenUsed="0"/>
-    <w:lsdException w:name="Colorful List Accent 2" w:semiHidden="0" w:uiPriority="72" w:unhideWhenUsed="0"/>
-    <w:lsdException w:name="Colorful Grid Accent 2" w:semiHidden="0" w:uiPriority="73" w:unhideWhenUsed="0"/>
-    <w:lsdException w:name="Light Shading Accent 3" w:semiHidden="0" w:uiPriority="60" w:unhideWhenUsed="0"/>
-    <w:lsdException w:name="Light List Accent 3" w:semiHidden="0" w:uiPriority="61" w:unhideWhenUsed="0"/>
-    <w:lsdException w:name="Light Grid Accent 3" w:semiHidden="0" w:uiPriority="62" w:unhideWhenUsed="0"/>
-    <w:lsdException w:name="Medium Shading 1 Accent 3" w:semiHidden="0" w:uiPriority="63" w:unhideWhenUsed="0"/>
-    <w:lsdException w:name="Medium Shading 2 Accent 3" w:semiHidden="0" w:uiPriority="64" w:unhideWhenUsed="0"/>
-    <w:lsdException w:name="Medium List 1 Accent 3" w:semiHidden="0" w:uiPriority="65" w:unhideWhenUsed="0"/>
-    <w:lsdException w:name="Medium List 2 Accent 3" w:semiHidden="0" w:uiPriority="66" w:unhideWhenUsed="0"/>
-    <w:lsdException w:name="Medium Grid 1 Accent 3" w:semiHidden="0" w:uiPriority="67" w:unhideWhenUsed="0"/>
-    <w:lsdException w:name="Medium Grid 2 Accent 3" w:semiHidden="0" w:uiPriority="68" w:unhideWhenUsed="0"/>
-    <w:lsdException w:name="Medium Grid 3 Accent 3" w:semiHidden="0" w:uiPriority="69" w:unhideWhenUsed="0"/>
-    <w:lsdException w:name="Dark List Accent 3" w:semiHidden="0" w:uiPriority="70" w:unhideWhenUsed="0"/>
-    <w:lsdException w:name="Colorful Shading Accent 3" w:semiHidden="0" w:uiPriority="71" w:unhideWhenUsed="0"/>
-    <w:lsdException w:name="Colorful List Accent 3" w:semiHidden="0" w:uiPriority="72" w:unhideWhenUsed="0"/>
-    <w:lsdException w:name="Colorful Grid Accent 3" w:semiHidden="0" w:uiPriority="73" w:unhideWhenUsed="0"/>
-    <w:lsdException w:name="Light Shading Accent 4" w:semiHidden="0" w:uiPriority="60" w:unhideWhenUsed="0"/>
-    <w:lsdException w:name="Light List Accent 4" w:semiHidden="0" w:uiPriority="61" w:unhideWhenUsed="0"/>
-    <w:lsdException w:name="Light Grid Accent 4" w:semiHidden="0" w:uiPriority="62" w:unhideWhenUsed="0"/>
-    <w:lsdException w:name="Medium Shading 1 Accent 4" w:semiHidden="0" w:uiPriority="63" w:unhideWhenUsed="0"/>
-    <w:lsdException w:name="Medium Shading 2 Accent 4" w:semiHidden="0" w:uiPriority="64" w:unhideWhenUsed="0"/>
-    <w:lsdException w:name="Medium List 1 Accent 4" w:semiHidden="0" w:uiPriority="65" w:unhideWhenUsed="0"/>
-    <w:lsdException w:name="Medium List 2 Accent 4" w:semiHidden="0" w:uiPriority="66" w:unhideWhenUsed="0"/>
-    <w:lsdException w:name="Medium Grid 1 Accent 4" w:semiHidden="0" w:uiPriority="67" w:unhideWhenUsed="0"/>
-    <w:lsdException w:name="Medium Grid 2 Accent 4" w:semiHidden="0" w:uiPriority="68" w:unhideWhenUsed="0"/>
-    <w:lsdException w:name="Medium Grid 3 Accent 4" w:semiHidden="0" w:uiPriority="69" w:unhideWhenUsed="0"/>
-    <w:lsdException w:name="Dark List Accent 4" w:semiHidden="0" w:uiPriority="70" w:unhideWhenUsed="0"/>
-    <w:lsdException w:name="Colorful Shading Accent 4" w:semiHidden="0" w:uiPriority="71" w:unhideWhenUsed="0"/>
-    <w:lsdException w:name="Colorful List Accent 4" w:semiHidden="0" w:uiPriority="72" w:unhideWhenUsed="0"/>
-    <w:lsdException w:name="Colorful Grid Accent 4" w:semiHidden="0" w:uiPriority="73" w:unhideWhenUsed="0"/>
-    <w:lsdException w:name="Light Shading Accent 5" w:semiHidden="0" w:uiPriority="60" w:unhideWhenUsed="0"/>
-    <w:lsdException w:name="Light List Accent 5" w:semiHidden="0" w:uiPriority="61" w:unhideWhenUsed="0"/>
-    <w:lsdException w:name="Light Grid Accent 5" w:semiHidden="0" w:uiPriority="62" w:unhideWhenUsed="0"/>
-    <w:lsdException w:name="Medium Shading 1 Accent 5" w:semiHidden="0" w:uiPriority="63" w:unhideWhenUsed="0"/>
-    <w:lsdException w:name="Medium Shading 2 Accent 5" w:semiHidden="0" w:uiPriority="64" w:unhideWhenUsed="0"/>
-    <w:lsdException w:name="Medium List 1 Accent 5" w:semiHidden="0" w:uiPriority="65" w:unhideWhenUsed="0"/>
-    <w:lsdException w:name="Medium List 2 Accent 5" w:semiHidden="0" w:uiPriority="66" w:unhideWhenUsed="0"/>
-    <w:lsdException w:name="Medium Grid 1 Accent 5" w:semiHidden="0" w:uiPriority="67" w:unhideWhenUsed="0"/>
-    <w:lsdException w:name="Medium Grid 2 Accent 5" w:semiHidden="0" w:uiPriority="68" w:unhideWhenUsed="0"/>
-    <w:lsdException w:name="Medium Grid 3 Accent 5" w:semiHidden="0" w:uiPriority="69" w:unhideWhenUsed="0"/>
-    <w:lsdException w:name="Dark List Accent 5" w:semiHidden="0" w:uiPriority="70" w:unhideWhenUsed="0"/>
-    <w:lsdException w:name="Colorful Shading Accent 5" w:semiHidden="0" w:uiPriority="71" w:unhideWhenUsed="0"/>
-    <w:lsdException w:name="Colorful List Accent 5" w:semiHidden="0" w:uiPriority="72" w:unhideWhenUsed="0"/>
-    <w:lsdException w:name="Colorful Grid Accent 5" w:semiHidden="0" w:uiPriority="73" w:unhideWhenUsed="0"/>
-    <w:lsdException w:name="Light Shading Accent 6" w:semiHidden="0" w:uiPriority="60" w:unhideWhenUsed="0"/>
-    <w:lsdException w:name="Light List Accent 6" w:semiHidden="0" w:uiPriority="61" w:unhideWhenUsed="0"/>
-    <w:lsdException w:name="Light Grid Accent 6" w:semiHidden="0" w:uiPriority="62" w:unhideWhenUsed="0"/>
-    <w:lsdException w:name="Medium Shading 1 Accent 6" w:semiHidden="0" w:uiPriority="63" w:unhideWhenUsed="0"/>
-    <w:lsdException w:name="Medium Shading 2 Accent 6" w:semiHidden="0" w:uiPriority="64" w:unhideWhenUsed="0"/>
-    <w:lsdException w:name="Medium List 1 Accent 6" w:semiHidden="0" w:uiPriority="65" w:unhideWhenUsed="0"/>
-    <w:lsdException w:name="Medium List 2 Accent 6" w:semiHidden="0" w:uiPriority="66" w:unhideWhenUsed="0"/>
-    <w:lsdException w:name="Medium Grid 1 Accent 6" w:semiHidden="0" w:uiPriority="67" w:unhideWhenUsed="0"/>
-    <w:lsdException w:name="Medium Grid 2 Accent 6" w:semiHidden="0" w:uiPriority="68" w:unhideWhenUsed="0"/>
-    <w:lsdException w:name="Medium Grid 3 Accent 6" w:semiHidden="0" w:uiPriority="69" w:unhideWhenUsed="0"/>
-    <w:lsdException w:name="Dark List Accent 6" w:semiHidden="0" w:uiPriority="70" w:unhideWhenUsed="0"/>
-    <w:lsdException w:name="Colorful Shading Accent 6" w:semiHidden="0" w:uiPriority="71" w:unhideWhenUsed="0"/>
-    <w:lsdException w:name="Colorful List Accent 6" w:semiHidden="0" w:uiPriority="72" w:unhideWhenUsed="0"/>
-    <w:lsdException w:name="Colorful Grid Accent 6" w:semiHidden="0" w:uiPriority="73" w:unhideWhenUsed="0"/>
-    <w:lsdException w:name="Subtle Emphasis" w:semiHidden="0" w:uiPriority="19" w:unhideWhenUsed="0" w:qFormat="1"/>
-    <w:lsdException w:name="Intense Emphasis" w:semiHidden="0" w:uiPriority="21" w:unhideWhenUsed="0" w:qFormat="1"/>
-    <w:lsdException w:name="Subtle Reference" w:semiHidden="0" w:uiPriority="31" w:unhideWhenUsed="0" w:qFormat="1"/>
-    <w:lsdException w:name="Intense Reference" w:semiHidden="0" w:uiPriority="32" w:unhideWhenUsed="0" w:qFormat="1"/>
-    <w:lsdException w:name="Book Title" w:semiHidden="0" w:uiPriority="33" w:unhideWhenUsed="0" w:qFormat="1"/>
-    <w:lsdException w:name="Bibliography" w:uiPriority="37"/>
-    <w:lsdException w:name="TOC Heading" w:uiPriority="39" w:qFormat="1"/>
-  </w:latentStyles>
-  <w:style w:type="paragraph" w:default="1" w:styleId="Normal">
-    <w:name w:val="Normal"/>
-    <w:qFormat/>
-    <w:rsid w:val="007606C8"/>
-    <w:rPr>
-      <w:rFonts w:ascii="Times New Roman" w:hAnsi="Times New Roman"/>
-      <w:sz w:val="20"/>
-      <w:szCs w:val="20"/>
-    </w:rPr>
-  </w:style>
-  <w:style w:type="paragraph" w:styleId="Heading1">
-    <w:name w:val="heading 1"/>
-    <w:basedOn w:val="Normal"/>
-    <w:next w:val="Normal"/>
-    <w:link w:val="Heading1Char"/>
-    <w:uiPriority w:val="9"/>
-    <w:qFormat/>
-    <w:rsid w:val="00831434"/>
-    <w:pPr>
-      <w:pBdr>
-        <w:top w:val="single" w:sz="24" w:space="0" w:color="00B0F0"/>
-        <w:left w:val="single" w:sz="24" w:space="0" w:color="00B0F0"/>
-        <w:bottom w:val="single" w:sz="24" w:space="0" w:color="00B0F0"/>
-        <w:right w:val="single" w:sz="24" w:space="0" w:color="00B0F0"/>
-      </w:pBdr>
-      <w:shd w:val="clear" w:color="auto" w:fill="00B0F0"/>
-      <w:spacing w:after="0"/>
-      <w:outlineLvl w:val="0"/>
-    </w:pPr>
-    <w:rPr>
-      <w:b/>
-      <w:bCs/>
-      <w:caps/>
-      <w:color w:val="FFFFFF" w:themeColor="background1"/>
-      <w:spacing w:val="15"/>
-      <w:sz w:val="22"/>
-      <w:szCs w:val="22"/>
-      <w14:shadow w14:blurRad="50800" w14:dist="38100" w14:dir="2700000" w14:sx="100000" w14:sy="100000" w14:kx="0" w14:ky="0" w14:algn="tl">
-        <w14:srgbClr w14:val="000000">
-          <w14:alpha w14:val="60000"/>
-        </w14:srgbClr>
-      </w14:shadow>
-    </w:rPr>
-  </w:style>
-  <w:style w:type="paragraph" w:styleId="Heading2">
-    <w:name w:val="heading 2"/>
-    <w:basedOn w:val="Normal"/>
-    <w:next w:val="Normal"/>
-    <w:link w:val="Heading2Char"/>
-    <w:uiPriority w:val="9"/>
-    <w:unhideWhenUsed/>
-    <w:qFormat/>
-    <w:rsid w:val="00B73FF7"/>
-    <w:pPr>
-      <w:pBdr>
-        <w:top w:val="single" w:sz="24" w:space="0" w:color="00B050"/>
-        <w:left w:val="single" w:sz="24" w:space="0" w:color="00B050"/>
-        <w:bottom w:val="single" w:sz="24" w:space="0" w:color="00B050"/>
-        <w:right w:val="single" w:sz="24" w:space="0" w:color="00B050"/>
-      </w:pBdr>
-      <w:shd w:val="clear" w:color="auto" w:fill="00B050"/>
-      <w:spacing w:after="0"/>
-      <w:outlineLvl w:val="1"/>
-    </w:pPr>
-    <w:rPr>
-      <w:caps/>
-      <w:color w:val="FFFFFF" w:themeColor="background1"/>
-      <w:spacing w:val="15"/>
-      <w:sz w:val="22"/>
-      <w:szCs w:val="22"/>
-      <w14:shadow w14:blurRad="50800" w14:dist="38100" w14:dir="8100000" w14:sx="100000" w14:sy="100000" w14:kx="0" w14:ky="0" w14:algn="tr">
-        <w14:srgbClr w14:val="000000">
-          <w14:alpha w14:val="60000"/>
-        </w14:srgbClr>
-      </w14:shadow>
-    </w:rPr>
-  </w:style>
-  <w:style w:type="paragraph" w:styleId="Heading3">
-    <w:name w:val="heading 3"/>
-    <w:basedOn w:val="Normal"/>
-    <w:next w:val="Normal"/>
-    <w:link w:val="Heading3Char"/>
-    <w:uiPriority w:val="9"/>
-    <w:unhideWhenUsed/>
-    <w:qFormat/>
-    <w:rsid w:val="00317A5D"/>
-    <w:pPr>
-      <w:pBdr>
-        <w:bottom w:val="single" w:sz="6" w:space="1" w:color="D16349" w:themeColor="accent1"/>
-      </w:pBdr>
-      <w:shd w:val="clear" w:color="auto" w:fill="FFFFFF" w:themeFill="background1"/>
-      <w:spacing w:before="300" w:after="0"/>
-      <w:outlineLvl w:val="2"/>
-    </w:pPr>
-    <w:rPr>
-      <w:caps/>
-      <w:spacing w:val="15"/>
-      <w:sz w:val="22"/>
-      <w:szCs w:val="22"/>
-    </w:rPr>
-  </w:style>
-  <w:style w:type="paragraph" w:styleId="Heading4">
-    <w:name w:val="heading 4"/>
-    <w:basedOn w:val="Normal"/>
-    <w:next w:val="Normal"/>
-    <w:link w:val="Heading4Char"/>
-    <w:uiPriority w:val="9"/>
-    <w:semiHidden/>
-    <w:unhideWhenUsed/>
-    <w:qFormat/>
-    <w:rsid w:val="005070FC"/>
-    <w:pPr>
-      <w:pBdr>
-        <w:top w:val="dotted" w:sz="6" w:space="2" w:color="D16349" w:themeColor="accent1"/>
-        <w:left w:val="dotted" w:sz="6" w:space="2" w:color="D16349" w:themeColor="accent1"/>
-      </w:pBdr>
-      <w:spacing w:before="300" w:after="0"/>
-      <w:outlineLvl w:val="3"/>
-    </w:pPr>
-    <w:rPr>
-      <w:caps/>
-      <w:color w:val="A8422A" w:themeColor="accent1" w:themeShade="BF"/>
-      <w:spacing w:val="10"/>
-      <w:sz w:val="22"/>
-      <w:szCs w:val="22"/>
-    </w:rPr>
-  </w:style>
-  <w:style w:type="paragraph" w:styleId="Heading5">
-    <w:name w:val="heading 5"/>
-    <w:basedOn w:val="Normal"/>
-    <w:next w:val="Normal"/>
-    <w:link w:val="Heading5Char"/>
-    <w:uiPriority w:val="9"/>
-    <w:semiHidden/>
-    <w:unhideWhenUsed/>
-    <w:qFormat/>
-    <w:rsid w:val="005070FC"/>
-    <w:pPr>
-      <w:pBdr>
-        <w:bottom w:val="single" w:sz="6" w:space="1" w:color="D16349" w:themeColor="accent1"/>
-      </w:pBdr>
-      <w:spacing w:before="300" w:after="0"/>
-      <w:outlineLvl w:val="4"/>
-    </w:pPr>
-    <w:rPr>
-      <w:caps/>
-      <w:color w:val="A8422A" w:themeColor="accent1" w:themeShade="BF"/>
-      <w:spacing w:val="10"/>
-      <w:sz w:val="22"/>
-      <w:szCs w:val="22"/>
-    </w:rPr>
-  </w:style>
-  <w:style w:type="paragraph" w:styleId="Heading6">
-    <w:name w:val="heading 6"/>
-    <w:basedOn w:val="Normal"/>
-    <w:next w:val="Normal"/>
-    <w:link w:val="Heading6Char"/>
-    <w:uiPriority w:val="9"/>
-    <w:semiHidden/>
-    <w:unhideWhenUsed/>
-    <w:qFormat/>
-    <w:rsid w:val="005070FC"/>
-    <w:pPr>
-      <w:pBdr>
-        <w:bottom w:val="dotted" w:sz="6" w:space="1" w:color="D16349" w:themeColor="accent1"/>
-      </w:pBdr>
-      <w:spacing w:before="300" w:after="0"/>
-      <w:outlineLvl w:val="5"/>
-    </w:pPr>
-    <w:rPr>
-      <w:caps/>
-      <w:color w:val="A8422A" w:themeColor="accent1" w:themeShade="BF"/>
-      <w:spacing w:val="10"/>
-      <w:sz w:val="22"/>
-      <w:szCs w:val="22"/>
-    </w:rPr>
-  </w:style>
-  <w:style w:type="paragraph" w:styleId="Heading7">
-    <w:name w:val="heading 7"/>
-    <w:basedOn w:val="Normal"/>
-    <w:next w:val="Normal"/>
-    <w:link w:val="Heading7Char"/>
-    <w:uiPriority w:val="9"/>
-    <w:semiHidden/>
-    <w:unhideWhenUsed/>
-    <w:qFormat/>
-    <w:rsid w:val="005070FC"/>
-    <w:pPr>
-      <w:spacing w:before="300" w:after="0"/>
-      <w:outlineLvl w:val="6"/>
-    </w:pPr>
-    <w:rPr>
-      <w:caps/>
-      <w:color w:val="A8422A" w:themeColor="accent1" w:themeShade="BF"/>
-      <w:spacing w:val="10"/>
-      <w:sz w:val="22"/>
-      <w:szCs w:val="22"/>
-    </w:rPr>
-  </w:style>
-  <w:style w:type="paragraph" w:styleId="Heading8">
-    <w:name w:val="heading 8"/>
-    <w:basedOn w:val="Normal"/>
-    <w:next w:val="Normal"/>
-    <w:link w:val="Heading8Char"/>
-    <w:uiPriority w:val="9"/>
-    <w:semiHidden/>
-    <w:unhideWhenUsed/>
-    <w:qFormat/>
-    <w:rsid w:val="005070FC"/>
-    <w:pPr>
-      <w:spacing w:before="300" w:after="0"/>
-      <w:outlineLvl w:val="7"/>
-    </w:pPr>
-    <w:rPr>
-      <w:caps/>
-      <w:spacing w:val="10"/>
-      <w:sz w:val="18"/>
-      <w:szCs w:val="18"/>
-    </w:rPr>
-  </w:style>
-  <w:style w:type="paragraph" w:styleId="Heading9">
-    <w:name w:val="heading 9"/>
-    <w:basedOn w:val="Normal"/>
-    <w:next w:val="Normal"/>
-    <w:link w:val="Heading9Char"/>
-    <w:uiPriority w:val="9"/>
-    <w:semiHidden/>
-    <w:unhideWhenUsed/>
-    <w:qFormat/>
-    <w:rsid w:val="005070FC"/>
-    <w:pPr>
-      <w:spacing w:before="300" w:after="0"/>
-      <w:outlineLvl w:val="8"/>
-    </w:pPr>
-    <w:rPr>
-      <w:i/>
-      <w:caps/>
-      <w:spacing w:val="10"/>
-      <w:sz w:val="18"/>
-      <w:szCs w:val="18"/>
-    </w:rPr>
-  </w:style>
-  <w:style w:type="character" w:default="1" w:styleId="DefaultParagraphFont">
-    <w:name w:val="Default Paragraph Font"/>
-    <w:uiPriority w:val="1"/>
-    <w:semiHidden/>
-    <w:unhideWhenUsed/>
-  </w:style>
-  <w:style w:type="table" w:default="1" w:styleId="TableNormal">
-    <w:name w:val="Normal Table"/>
-    <w:uiPriority w:val="99"/>
-    <w:semiHidden/>
-    <w:unhideWhenUsed/>
-    <w:tblPr>
-      <w:tblInd w:w="0" w:type="dxa"/>
-      <w:tblCellMar>
-        <w:top w:w="0" w:type="dxa"/>
-        <w:left w:w="108" w:type="dxa"/>
-        <w:bottom w:w="0" w:type="dxa"/>
-        <w:right w:w="108" w:type="dxa"/>
-      </w:tblCellMar>
-    </w:tblPr>
-  </w:style>
-  <w:style w:type="numbering" w:default="1" w:styleId="NoList">
-    <w:name w:val="No List"/>
-    <w:uiPriority w:val="99"/>
-    <w:semiHidden/>
-    <w:unhideWhenUsed/>
-  </w:style>
-  <w:style w:type="paragraph" w:styleId="ListParagraph">
-    <w:name w:val="List Paragraph"/>
-    <w:basedOn w:val="Normal"/>
-    <w:uiPriority w:val="34"/>
-    <w:qFormat/>
-    <w:rsid w:val="005070FC"/>
-    <w:pPr>
-      <w:ind w:left="720"/>
-      <w:contextualSpacing/>
-    </w:pPr>
-  </w:style>
-  <w:style w:type="paragraph" w:styleId="NoSpacing">
-    <w:name w:val="No Spacing"/>
-    <w:basedOn w:val="Normal"/>
-    <w:link w:val="NoSpacingChar"/>
-    <w:uiPriority w:val="1"/>
-    <w:qFormat/>
-    <w:rsid w:val="005070FC"/>
-    <w:pPr>
-      <w:spacing w:before="0" w:after="0" w:line="240" w:lineRule="auto"/>
-    </w:pPr>
-  </w:style>
-  <w:style w:type="paragraph" w:styleId="Title">
-    <w:name w:val="Title"/>
-    <w:basedOn w:val="Normal"/>
-    <w:next w:val="Normal"/>
-    <w:link w:val="TitleChar"/>
-    <w:uiPriority w:val="10"/>
-    <w:qFormat/>
-    <w:rsid w:val="005070FC"/>
-    <w:pPr>
-      <w:spacing w:before="720"/>
-    </w:pPr>
-    <w:rPr>
-      <w:caps/>
-      <w:color w:val="D16349" w:themeColor="accent1"/>
-      <w:spacing w:val="10"/>
-      <w:kern w:val="28"/>
-      <w:sz w:val="52"/>
-      <w:szCs w:val="52"/>
-    </w:rPr>
-  </w:style>
-  <w:style w:type="character" w:customStyle="1" w:styleId="TitleChar">
-    <w:name w:val="Title Char"/>
-    <w:basedOn w:val="DefaultParagraphFont"/>
-    <w:link w:val="Title"/>
-    <w:uiPriority w:val="10"/>
-    <w:rsid w:val="005070FC"/>
-    <w:rPr>
-      <w:caps/>
-      <w:color w:val="D16349" w:themeColor="accent1"/>
-      <w:spacing w:val="10"/>
-      <w:kern w:val="28"/>
-      <w:sz w:val="52"/>
-      <w:szCs w:val="52"/>
-    </w:rPr>
-  </w:style>
-  <w:style w:type="character" w:customStyle="1" w:styleId="Heading1Char">
-    <w:name w:val="Heading 1 Char"/>
-    <w:basedOn w:val="DefaultParagraphFont"/>
-    <w:link w:val="Heading1"/>
-    <w:uiPriority w:val="9"/>
-    <w:rsid w:val="00831434"/>
-    <w:rPr>
-      <w:b/>
-      <w:bCs/>
-      <w:caps/>
-      <w:color w:val="FFFFFF" w:themeColor="background1"/>
-      <w:spacing w:val="15"/>
-      <w:shd w:val="clear" w:color="auto" w:fill="00B0F0"/>
-      <w14:shadow w14:blurRad="50800" w14:dist="38100" w14:dir="2700000" w14:sx="100000" w14:sy="100000" w14:kx="0" w14:ky="0" w14:algn="tl">
-        <w14:srgbClr w14:val="000000">
-          <w14:alpha w14:val="60000"/>
-        </w14:srgbClr>
-      </w14:shadow>
-    </w:rPr>
-  </w:style>
-  <w:style w:type="paragraph" w:styleId="BalloonText">
-    <w:name w:val="Balloon Text"/>
-    <w:basedOn w:val="Normal"/>
-    <w:link w:val="BalloonTextChar"/>
-    <w:uiPriority w:val="99"/>
-    <w:semiHidden/>
-    <w:unhideWhenUsed/>
-    <w:rsid w:val="002C1303"/>
-    <w:pPr>
-      <w:spacing w:after="0" w:line="240" w:lineRule="auto"/>
-    </w:pPr>
-    <w:rPr>
-      <w:rFonts w:ascii="Tahoma" w:hAnsi="Tahoma" w:cs="Tahoma"/>
-      <w:sz w:val="16"/>
-      <w:szCs w:val="16"/>
-    </w:rPr>
-  </w:style>
-  <w:style w:type="character" w:customStyle="1" w:styleId="BalloonTextChar">
-    <w:name w:val="Balloon Text Char"/>
-    <w:basedOn w:val="DefaultParagraphFont"/>
-    <w:link w:val="BalloonText"/>
-    <w:uiPriority w:val="99"/>
-    <w:semiHidden/>
-    <w:rsid w:val="002C1303"/>
-    <w:rPr>
-      <w:rFonts w:ascii="Tahoma" w:hAnsi="Tahoma" w:cs="Tahoma"/>
-      <w:sz w:val="16"/>
-      <w:szCs w:val="16"/>
-    </w:rPr>
-  </w:style>
-  <w:style w:type="character" w:customStyle="1" w:styleId="Heading2Char">
-    <w:name w:val="Heading 2 Char"/>
-    <w:basedOn w:val="DefaultParagraphFont"/>
-    <w:link w:val="Heading2"/>
-    <w:uiPriority w:val="9"/>
-    <w:rsid w:val="00B73FF7"/>
-    <w:rPr>
-      <w:caps/>
-      <w:color w:val="FFFFFF" w:themeColor="background1"/>
-      <w:spacing w:val="15"/>
-      <w:shd w:val="clear" w:color="auto" w:fill="00B050"/>
-      <w14:shadow w14:blurRad="50800" w14:dist="38100" w14:dir="8100000" w14:sx="100000" w14:sy="100000" w14:kx="0" w14:ky="0" w14:algn="tr">
-        <w14:srgbClr w14:val="000000">
-          <w14:alpha w14:val="60000"/>
-        </w14:srgbClr>
-      </w14:shadow>
-    </w:rPr>
-  </w:style>
-  <w:style w:type="paragraph" w:styleId="Caption">
-    <w:name w:val="caption"/>
-    <w:basedOn w:val="Normal"/>
-    <w:next w:val="Normal"/>
-    <w:uiPriority w:val="35"/>
-    <w:unhideWhenUsed/>
-    <w:qFormat/>
-    <w:rsid w:val="005070FC"/>
-    <w:rPr>
-      <w:b/>
-      <w:bCs/>
-      <w:color w:val="A8422A" w:themeColor="accent1" w:themeShade="BF"/>
-      <w:sz w:val="16"/>
-      <w:szCs w:val="16"/>
-    </w:rPr>
-  </w:style>
-  <w:style w:type="character" w:styleId="Hyperlink">
-    <w:name w:val="Hyperlink"/>
-    <w:basedOn w:val="DefaultParagraphFont"/>
-    <w:uiPriority w:val="99"/>
-    <w:unhideWhenUsed/>
-    <w:rsid w:val="00FC7723"/>
-    <w:rPr>
-      <w:color w:val="00A3D6" w:themeColor="hyperlink"/>
-      <w:u w:val="single"/>
-    </w:rPr>
-  </w:style>
-  <w:style w:type="table" w:styleId="TableGrid">
-    <w:name w:val="Table Grid"/>
-    <w:basedOn w:val="TableNormal"/>
-    <w:uiPriority w:val="59"/>
-    <w:rsid w:val="00815A13"/>
-    <w:pPr>
-      <w:spacing w:after="0" w:line="240" w:lineRule="auto"/>
-    </w:pPr>
-    <w:tblPr>
-      <w:tblInd w:w="0" w:type="dxa"/>
-      <w:tblBorders>
-        <w:top w:val="single" w:sz="4" w:space="0" w:color="000000" w:themeColor="text1"/>
-        <w:left w:val="single" w:sz="4" w:space="0" w:color="000000" w:themeColor="text1"/>
-        <w:bottom w:val="single" w:sz="4" w:space="0" w:color="000000" w:themeColor="text1"/>
-        <w:right w:val="single" w:sz="4" w:space="0" w:color="000000" w:themeColor="text1"/>
-        <w:insideH w:val="single" w:sz="4" w:space="0" w:color="000000" w:themeColor="text1"/>
-        <w:insideV w:val="single" w:sz="4" w:space="0" w:color="000000" w:themeColor="text1"/>
-      </w:tblBorders>
-      <w:tblCellMar>
-        <w:top w:w="0" w:type="dxa"/>
-        <w:left w:w="108" w:type="dxa"/>
-        <w:bottom w:w="0" w:type="dxa"/>
-        <w:right w:w="108" w:type="dxa"/>
-      </w:tblCellMar>
-    </w:tblPr>
-  </w:style>
-  <w:style w:type="character" w:customStyle="1" w:styleId="Heading3Char">
-    <w:name w:val="Heading 3 Char"/>
-    <w:basedOn w:val="DefaultParagraphFont"/>
-    <w:link w:val="Heading3"/>
-    <w:uiPriority w:val="9"/>
-    <w:rsid w:val="00317A5D"/>
-    <w:rPr>
-      <w:caps/>
-      <w:spacing w:val="15"/>
-      <w:shd w:val="clear" w:color="auto" w:fill="FFFFFF" w:themeFill="background1"/>
-    </w:rPr>
-  </w:style>
-  <w:style w:type="paragraph" w:styleId="TOCHeading">
-    <w:name w:val="TOC Heading"/>
-    <w:basedOn w:val="Heading1"/>
-    <w:next w:val="Normal"/>
-    <w:uiPriority w:val="39"/>
-    <w:unhideWhenUsed/>
-    <w:qFormat/>
-    <w:rsid w:val="005070FC"/>
-    <w:pPr>
-      <w:outlineLvl w:val="9"/>
-    </w:pPr>
-  </w:style>
-  <w:style w:type="paragraph" w:styleId="TOC1">
-    <w:name w:val="toc 1"/>
-    <w:basedOn w:val="Normal"/>
-    <w:next w:val="Normal"/>
-    <w:autoRedefine/>
-    <w:uiPriority w:val="39"/>
-    <w:unhideWhenUsed/>
-    <w:qFormat/>
-    <w:rsid w:val="00E44CF8"/>
-    <w:pPr>
-      <w:spacing w:after="100"/>
-    </w:pPr>
-  </w:style>
-  <w:style w:type="paragraph" w:styleId="TOC2">
-    <w:name w:val="toc 2"/>
-    <w:basedOn w:val="Normal"/>
-    <w:next w:val="Normal"/>
-    <w:autoRedefine/>
-    <w:uiPriority w:val="39"/>
-    <w:unhideWhenUsed/>
-    <w:qFormat/>
-    <w:rsid w:val="00E44CF8"/>
-    <w:pPr>
-      <w:spacing w:after="100"/>
-      <w:ind w:left="220"/>
-    </w:pPr>
-  </w:style>
-  <w:style w:type="paragraph" w:styleId="TOC3">
-    <w:name w:val="toc 3"/>
-    <w:basedOn w:val="Normal"/>
-    <w:next w:val="Normal"/>
-    <w:autoRedefine/>
-    <w:uiPriority w:val="39"/>
-    <w:unhideWhenUsed/>
-    <w:qFormat/>
-    <w:rsid w:val="00E44CF8"/>
-    <w:pPr>
-      <w:spacing w:after="100"/>
-      <w:ind w:left="440"/>
-    </w:pPr>
-  </w:style>
-  <w:style w:type="character" w:customStyle="1" w:styleId="Heading4Char">
-    <w:name w:val="Heading 4 Char"/>
-    <w:basedOn w:val="DefaultParagraphFont"/>
-    <w:link w:val="Heading4"/>
-    <w:uiPriority w:val="9"/>
-    <w:semiHidden/>
-    <w:rsid w:val="005070FC"/>
-    <w:rPr>
-      <w:caps/>
-      <w:color w:val="A8422A" w:themeColor="accent1" w:themeShade="BF"/>
-      <w:spacing w:val="10"/>
-    </w:rPr>
-  </w:style>
-  <w:style w:type="character" w:customStyle="1" w:styleId="Heading5Char">
-    <w:name w:val="Heading 5 Char"/>
-    <w:basedOn w:val="DefaultParagraphFont"/>
-    <w:link w:val="Heading5"/>
-    <w:uiPriority w:val="9"/>
-    <w:semiHidden/>
-    <w:rsid w:val="005070FC"/>
-    <w:rPr>
-      <w:caps/>
-      <w:color w:val="A8422A" w:themeColor="accent1" w:themeShade="BF"/>
-      <w:spacing w:val="10"/>
-    </w:rPr>
-  </w:style>
-  <w:style w:type="character" w:customStyle="1" w:styleId="Heading6Char">
-    <w:name w:val="Heading 6 Char"/>
-    <w:basedOn w:val="DefaultParagraphFont"/>
-    <w:link w:val="Heading6"/>
-    <w:uiPriority w:val="9"/>
-    <w:semiHidden/>
-    <w:rsid w:val="005070FC"/>
-    <w:rPr>
-      <w:caps/>
-      <w:color w:val="A8422A" w:themeColor="accent1" w:themeShade="BF"/>
-      <w:spacing w:val="10"/>
-    </w:rPr>
-  </w:style>
-  <w:style w:type="character" w:customStyle="1" w:styleId="Heading7Char">
-    <w:name w:val="Heading 7 Char"/>
-    <w:basedOn w:val="DefaultParagraphFont"/>
-    <w:link w:val="Heading7"/>
-    <w:uiPriority w:val="9"/>
-    <w:semiHidden/>
-    <w:rsid w:val="005070FC"/>
-    <w:rPr>
-      <w:caps/>
-      <w:color w:val="A8422A" w:themeColor="accent1" w:themeShade="BF"/>
-      <w:spacing w:val="10"/>
-    </w:rPr>
-  </w:style>
-  <w:style w:type="character" w:customStyle="1" w:styleId="Heading8Char">
-    <w:name w:val="Heading 8 Char"/>
-    <w:basedOn w:val="DefaultParagraphFont"/>
-    <w:link w:val="Heading8"/>
-    <w:uiPriority w:val="9"/>
-    <w:semiHidden/>
-    <w:rsid w:val="005070FC"/>
-    <w:rPr>
-      <w:caps/>
-      <w:spacing w:val="10"/>
-      <w:sz w:val="18"/>
-      <w:szCs w:val="18"/>
-    </w:rPr>
-  </w:style>
-  <w:style w:type="character" w:customStyle="1" w:styleId="Heading9Char">
-    <w:name w:val="Heading 9 Char"/>
-    <w:basedOn w:val="DefaultParagraphFont"/>
-    <w:link w:val="Heading9"/>
-    <w:uiPriority w:val="9"/>
-    <w:semiHidden/>
-    <w:rsid w:val="005070FC"/>
-    <w:rPr>
-      <w:i/>
-      <w:caps/>
-      <w:spacing w:val="10"/>
-      <w:sz w:val="18"/>
-      <w:szCs w:val="18"/>
-    </w:rPr>
-  </w:style>
-  <w:style w:type="paragraph" w:styleId="Subtitle">
-    <w:name w:val="Subtitle"/>
-    <w:basedOn w:val="Normal"/>
-    <w:next w:val="Normal"/>
-    <w:link w:val="SubtitleChar"/>
-    <w:uiPriority w:val="11"/>
-    <w:qFormat/>
-    <w:rsid w:val="005070FC"/>
-    <w:pPr>
-      <w:spacing w:after="1000" w:line="240" w:lineRule="auto"/>
-    </w:pPr>
-    <w:rPr>
-      <w:caps/>
-      <w:color w:val="595959" w:themeColor="text1" w:themeTint="A6"/>
-      <w:spacing w:val="10"/>
-      <w:sz w:val="24"/>
-      <w:szCs w:val="24"/>
-    </w:rPr>
-  </w:style>
-  <w:style w:type="character" w:customStyle="1" w:styleId="SubtitleChar">
-    <w:name w:val="Subtitle Char"/>
-    <w:basedOn w:val="DefaultParagraphFont"/>
-    <w:link w:val="Subtitle"/>
-    <w:uiPriority w:val="11"/>
-    <w:rsid w:val="005070FC"/>
-    <w:rPr>
-      <w:caps/>
-      <w:color w:val="595959" w:themeColor="text1" w:themeTint="A6"/>
-      <w:spacing w:val="10"/>
-      <w:sz w:val="24"/>
-      <w:szCs w:val="24"/>
-    </w:rPr>
-  </w:style>
-  <w:style w:type="character" w:styleId="Strong">
-    <w:name w:val="Strong"/>
-    <w:uiPriority w:val="22"/>
-    <w:qFormat/>
-    <w:rsid w:val="005070FC"/>
-    <w:rPr>
-      <w:b/>
-      <w:bCs/>
-    </w:rPr>
-  </w:style>
-  <w:style w:type="character" w:styleId="Emphasis">
-    <w:name w:val="Emphasis"/>
-    <w:uiPriority w:val="20"/>
-    <w:qFormat/>
-    <w:rsid w:val="005070FC"/>
-    <w:rPr>
-      <w:caps/>
-      <w:color w:val="6F2C1C" w:themeColor="accent1" w:themeShade="7F"/>
-      <w:spacing w:val="5"/>
-    </w:rPr>
-  </w:style>
-  <w:style w:type="character" w:customStyle="1" w:styleId="NoSpacingChar">
-    <w:name w:val="No Spacing Char"/>
-    <w:basedOn w:val="DefaultParagraphFont"/>
-    <w:link w:val="NoSpacing"/>
-    <w:uiPriority w:val="1"/>
-    <w:rsid w:val="005070FC"/>
-    <w:rPr>
-      <w:sz w:val="20"/>
-      <w:szCs w:val="20"/>
-    </w:rPr>
-  </w:style>
-  <w:style w:type="paragraph" w:styleId="Quote">
-    <w:name w:val="Quote"/>
-    <w:basedOn w:val="Normal"/>
-    <w:next w:val="Normal"/>
-    <w:link w:val="QuoteChar"/>
-    <w:uiPriority w:val="29"/>
-    <w:qFormat/>
-    <w:rsid w:val="005070FC"/>
-    <w:rPr>
-      <w:i/>
-      <w:iCs/>
-    </w:rPr>
-  </w:style>
-  <w:style w:type="character" w:customStyle="1" w:styleId="QuoteChar">
-    <w:name w:val="Quote Char"/>
-    <w:basedOn w:val="DefaultParagraphFont"/>
-    <w:link w:val="Quote"/>
-    <w:uiPriority w:val="29"/>
-    <w:rsid w:val="005070FC"/>
-    <w:rPr>
-      <w:i/>
-      <w:iCs/>
-      <w:sz w:val="20"/>
-      <w:szCs w:val="20"/>
-    </w:rPr>
-  </w:style>
-  <w:style w:type="paragraph" w:styleId="IntenseQuote">
-    <w:name w:val="Intense Quote"/>
-    <w:basedOn w:val="Normal"/>
-    <w:next w:val="Normal"/>
-    <w:link w:val="IntenseQuoteChar"/>
-    <w:uiPriority w:val="30"/>
-    <w:qFormat/>
-    <w:rsid w:val="005070FC"/>
-    <w:pPr>
-      <w:pBdr>
-        <w:top w:val="single" w:sz="4" w:space="10" w:color="D16349" w:themeColor="accent1"/>
-        <w:left w:val="single" w:sz="4" w:space="10" w:color="D16349" w:themeColor="accent1"/>
-      </w:pBdr>
-      <w:spacing w:after="0"/>
-      <w:ind w:left="1296" w:right="1152"/>
-      <w:jc w:val="both"/>
-    </w:pPr>
-    <w:rPr>
-      <w:i/>
-      <w:iCs/>
-      <w:color w:val="D16349" w:themeColor="accent1"/>
-    </w:rPr>
-  </w:style>
-  <w:style w:type="character" w:customStyle="1" w:styleId="IntenseQuoteChar">
-    <w:name w:val="Intense Quote Char"/>
-    <w:basedOn w:val="DefaultParagraphFont"/>
-    <w:link w:val="IntenseQuote"/>
-    <w:uiPriority w:val="30"/>
-    <w:rsid w:val="005070FC"/>
-    <w:rPr>
-      <w:i/>
-      <w:iCs/>
-      <w:color w:val="D16349" w:themeColor="accent1"/>
-      <w:sz w:val="20"/>
-      <w:szCs w:val="20"/>
-    </w:rPr>
-  </w:style>
-  <w:style w:type="character" w:styleId="SubtleEmphasis">
-    <w:name w:val="Subtle Emphasis"/>
-    <w:uiPriority w:val="19"/>
-    <w:qFormat/>
-    <w:rsid w:val="005070FC"/>
-    <w:rPr>
-      <w:i/>
-      <w:iCs/>
-      <w:color w:val="6F2C1C" w:themeColor="accent1" w:themeShade="7F"/>
-    </w:rPr>
-  </w:style>
-  <w:style w:type="character" w:styleId="IntenseEmphasis">
-    <w:name w:val="Intense Emphasis"/>
-    <w:uiPriority w:val="21"/>
-    <w:qFormat/>
-    <w:rsid w:val="005070FC"/>
-    <w:rPr>
-      <w:b/>
-      <w:bCs/>
-      <w:caps/>
-      <w:color w:val="6F2C1C" w:themeColor="accent1" w:themeShade="7F"/>
-      <w:spacing w:val="10"/>
-    </w:rPr>
-  </w:style>
-  <w:style w:type="character" w:styleId="SubtleReference">
-    <w:name w:val="Subtle Reference"/>
-    <w:uiPriority w:val="31"/>
-    <w:qFormat/>
-    <w:rsid w:val="005070FC"/>
-    <w:rPr>
-      <w:b/>
-      <w:bCs/>
-      <w:color w:val="D16349" w:themeColor="accent1"/>
-    </w:rPr>
-  </w:style>
-  <w:style w:type="character" w:styleId="IntenseReference">
-    <w:name w:val="Intense Reference"/>
-    <w:uiPriority w:val="32"/>
-    <w:qFormat/>
-    <w:rsid w:val="005070FC"/>
-    <w:rPr>
-      <w:b/>
-      <w:bCs/>
-      <w:i/>
-      <w:iCs/>
-      <w:caps/>
-      <w:color w:val="D16349" w:themeColor="accent1"/>
-    </w:rPr>
-  </w:style>
-  <w:style w:type="character" w:styleId="BookTitle">
-    <w:name w:val="Book Title"/>
-    <w:uiPriority w:val="33"/>
-    <w:qFormat/>
-    <w:rsid w:val="005070FC"/>
-    <w:rPr>
-      <w:b/>
-      <w:bCs/>
-      <w:i/>
-      <w:iCs/>
-      <w:spacing w:val="9"/>
-    </w:rPr>
-  </w:style>
-  <w:style w:type="character" w:styleId="FollowedHyperlink">
-    <w:name w:val="FollowedHyperlink"/>
-    <w:basedOn w:val="DefaultParagraphFont"/>
-    <w:uiPriority w:val="99"/>
-    <w:semiHidden/>
-    <w:unhideWhenUsed/>
-    <w:rsid w:val="00741B1A"/>
-    <w:rPr>
-      <w:color w:val="694F07" w:themeColor="followedHyperlink"/>
-      <w:u w:val="single"/>
-    </w:rPr>
-  </w:style>
-</w:styles>
-</file>
-
-<file path=word/stylesWithEffects.xml><?xml version="1.0" encoding="utf-8"?>
-<w:styles xmlns:wpc="http://schemas.microsoft.com/office/word/2010/wordprocessingCanvas" xmlns:mc="http://schemas.openxmlformats.org/markup-compatibility/2006" xmlns:o="urn:schemas-microsoft-com:office:office" xmlns:r="http://schemas.openxmlformats.org/officeDocument/2006/relationships" xmlns:m="http://schemas.openxmlformats.org/officeDocument/2006/math" xmlns:v="urn:schemas-microsoft-com:vml" xmlns:wp14="http://schemas.microsoft.com/office/word/2010/wordprocessingDrawing" xmlns:wp="http://schemas.openxmlformats.org/drawingml/2006/wordprocessingDrawing" xmlns:w10="urn:schemas-microsoft-com:office:word" xmlns:w="http://schemas.openxmlformats.org/wordprocessingml/2006/main" xmlns:w14="http://schemas.microsoft.com/office/word/2010/wordml" xmlns:wpg="http://schemas.microsoft.com/office/word/2010/wordprocessingGroup" xmlns:wpi="http://schemas.microsoft.com/office/word/2010/wordprocessingInk" xmlns:wne="http://schemas.microsoft.com/office/word/2006/wordml" xmlns:wps="http://schemas.microsoft.com/office/word/2010/wordprocessingShape" mc:Ignorable="w14 wp14">
-  <w:docDefaults>
-    <w:rPrDefault>
-      <w:rPr>
-        <w:rFonts w:asciiTheme="minorHAnsi" w:eastAsiaTheme="minorEastAsia" w:hAnsiTheme="minorHAnsi" w:cstheme="minorBidi"/>
-        <w:sz w:val="22"/>
-        <w:szCs w:val="22"/>
-        <w:lang w:val="en-US" w:eastAsia="en-US" w:bidi="en-US"/>
-      </w:rPr>
-    </w:rPrDefault>
-    <w:pPrDefault>
-      <w:pPr>
-        <w:spacing w:before="200" w:after="200" w:line="276" w:lineRule="auto"/>
-      </w:pPr>
-    </w:pPrDefault>
-  </w:docDefaults>
-  <w:latentStyles w:defLockedState="0" w:defUIPriority="99" w:defSemiHidden="1" w:defUnhideWhenUsed="1" w:defQFormat="0" w:count="267">
-    <w:lsdException w:name="Normal" w:semiHidden="0" w:uiPriority="0" w:unhideWhenUsed="0" w:qFormat="1"/>
-    <w:lsdException w:name="heading 1" w:semiHidden="0" w:uiPriority="9" w:unhideWhenUsed="0" w:qFormat="1"/>
-    <w:lsdException w:name="heading 2" w:uiPriority="9" w:qFormat="1"/>
-    <w:lsdException w:name="heading 3" w:uiPriority="9" w:qFormat="1"/>
-    <w:lsdException w:name="heading 4" w:uiPriority="9" w:qFormat="1"/>
-    <w:lsdException w:name="heading 5" w:uiPriority="9" w:qFormat="1"/>
-    <w:lsdException w:name="heading 6" w:uiPriority="9" w:qFormat="1"/>
-    <w:lsdException w:name="heading 7" w:uiPriority="9" w:qFormat="1"/>
-    <w:lsdException w:name="heading 8" w:uiPriority="9" w:qFormat="1"/>
-    <w:lsdException w:name="heading 9" w:uiPriority="9" w:qFormat="1"/>
-    <w:lsdException w:name="toc 1" w:uiPriority="39" w:qFormat="1"/>
-    <w:lsdException w:name="toc 2" w:uiPriority="39" w:qFormat="1"/>
-    <w:lsdException w:name="toc 3" w:uiPriority="39" w:qFormat="1"/>
-    <w:lsdException w:name="toc 4" w:uiPriority="39"/>
-    <w:lsdException w:name="toc 5" w:uiPriority="39"/>
-    <w:lsdException w:name="toc 6" w:uiPriority="39"/>
-    <w:lsdException w:name="toc 7" w:uiPriority="39"/>
-    <w:lsdException w:name="toc 8" w:uiPriority="39"/>
-    <w:lsdException w:name="toc 9" w:uiPriority="39"/>
-    <w:lsdException w:name="caption" w:uiPriority="35" w:qFormat="1"/>
-    <w:lsdException w:name="Title" w:semiHidden="0" w:uiPriority="10" w:unhideWhenUsed="0" w:qFormat="1"/>
-    <w:lsdException w:name="Default Paragraph Font" w:uiPriority="1"/>
-    <w:lsdException w:name="Subtitle" w:semiHidden="0" w:uiPriority="11" w:unhideWhenUsed="0" w:qFormat="1"/>
-    <w:lsdException w:name="Strong" w:semiHidden="0" w:uiPriority="22" w:unhideWhenUsed="0" w:qFormat="1"/>
-    <w:lsdException w:name="Emphasis" w:semiHidden="0" w:uiPriority="20" w:unhideWhenUsed="0" w:qFormat="1"/>
-    <w:lsdException w:name="Table Grid" w:semiHidden="0" w:uiPriority="59" w:unhideWhenUsed="0"/>
-    <w:lsdException w:name="Placeholder Text" w:unhideWhenUsed="0"/>
-    <w:lsdException w:name="No Spacing" w:semiHidden="0" w:uiPriority="1" w:unhideWhenUsed="0" w:qFormat="1"/>
-    <w:lsdException w:name="Light Shading" w:semiHidden="0" w:uiPriority="60" w:unhideWhenUsed="0"/>
-    <w:lsdException w:name="Light List" w:semiHidden="0" w:uiPriority="61" w:unhideWhenUsed="0"/>
-    <w:lsdException w:name="Light Grid" w:semiHidden="0" w:uiPriority="62" w:unhideWhenUsed="0"/>
-    <w:lsdException w:name="Medium Shading 1" w:semiHidden="0" w:uiPriority="63" w:unhideWhenUsed="0"/>
-    <w:lsdException w:name="Medium Shading 2" w:semiHidden="0" w:uiPriority="64" w:unhideWhenUsed="0"/>
-    <w:lsdException w:name="Medium List 1" w:semiHidden="0" w:uiPriority="65" w:unhideWhenUsed="0"/>
-    <w:lsdException w:name="Medium List 2" w:semiHidden="0" w:uiPriority="66" w:unhideWhenUsed="0"/>
-    <w:lsdException w:name="Medium Grid 1" w:semiHidden="0" w:uiPriority="67" w:unhideWhenUsed="0"/>
-    <w:lsdException w:name="Medium Grid 2" w:semiHidden="0" w:uiPriority="68" w:unhideWhenUsed="0"/>
-    <w:lsdException w:name="Medium Grid 3" w:semiHidden="0" w:uiPriority="69" w:unhideWhenUsed="0"/>
-    <w:lsdException w:name="Dark List" w:semiHidden="0" w:uiPriority="70" w:unhideWhenUsed="0"/>
-    <w:lsdException w:name="Colorful Shading" w:semiHidden="0" w:uiPriority="71" w:unhideWhenUsed="0"/>
-    <w:lsdException w:name="Colorful List" w:semiHidden="0" w:uiPriority="72" w:unhideWhenUsed="0"/>
-    <w:lsdException w:name="Colorful Grid" w:semiHidden="0" w:uiPriority="73" w:unhideWhenUsed="0"/>
-    <w:lsdException w:name="Light Shading Accent 1" w:semiHidden="0" w:uiPriority="60" w:unhideWhenUsed="0"/>
-    <w:lsdException w:name="Light List Accent 1" w:semiHidden="0" w:uiPriority="61" w:unhideWhenUsed="0"/>
-    <w:lsdException w:name="Light Grid Accent 1" w:semiHidden="0" w:uiPriority="62" w:unhideWhenUsed="0"/>
-    <w:lsdException w:name="Medium Shading 1 Accent 1" w:semiHidden="0" w:uiPriority="63" w:unhideWhenUsed="0"/>
-    <w:lsdException w:name="Medium Shading 2 Accent 1" w:semiHidden="0" w:uiPriority="64" w:unhideWhenUsed="0"/>
-    <w:lsdException w:name="Medium List 1 Accent 1" w:semiHidden="0" w:uiPriority="65" w:unhideWhenUsed="0"/>
-    <w:lsdException w:name="Revision" w:unhideWhenUsed="0"/>
-    <w:lsdException w:name="List Paragraph" w:semiHidden="0" w:uiPriority="34" w:unhideWhenUsed="0" w:qFormat="1"/>
-    <w:lsdException w:name="Quote" w:semiHidden="0" w:uiPriority="29" w:unhideWhenUsed="0" w:qFormat="1"/>
-    <w:lsdException w:name="Intense Quote" w:semiHidden="0" w:uiPriority="30" w:unhideWhenUsed="0" w:qFormat="1"/>
-    <w:lsdException w:name="Medium List 2 Accent 1" w:semiHidden="0" w:uiPriority="66" w:unhideWhenUsed="0"/>
-    <w:lsdException w:name="Medium Grid 1 Accent 1" w:semiHidden="0" w:uiPriority="67" w:unhideWhenUsed="0"/>
-    <w:lsdException w:name="Medium Grid 2 Accent 1" w:semiHidden="0" w:uiPriority="68" w:unhideWhenUsed="0"/>
-    <w:lsdException w:name="Medium Grid 3 Accent 1" w:semiHidden="0" w:uiPriority="69" w:unhideWhenUsed="0"/>
-    <w:lsdException w:name="Dark List Accent 1" w:semiHidden="0" w:uiPriority="70" w:unhideWhenUsed="0"/>
-    <w:lsdException w:name="Colorful Shading Accent 1" w:semiHidden="0" w:uiPriority="71" w:unhideWhenUsed="0"/>
-    <w:lsdException w:name="Colorful List Accent 1" w:semiHidden="0" w:uiPriority="72" w:unhideWhenUsed="0"/>
-    <w:lsdException w:name="Colorful Grid Accent 1" w:semiHidden="0" w:uiPriority="73" w:unhideWhenUsed="0"/>
-    <w:lsdException w:name="Light Shading Accent 2" w:semiHidden="0" w:uiPriority="60" w:unhideWhenUsed="0"/>
-    <w:lsdException w:name="Light List Accent 2" w:semiHidden="0" w:uiPriority="61" w:unhideWhenUsed="0"/>
-    <w:lsdException w:name="Light Grid Accent 2" w:semiHidden="0" w:uiPriority="62" w:unhideWhenUsed="0"/>
-    <w:lsdException w:name="Medium Shading 1 Accent 2" w:semiHidden="0" w:uiPriority="63" w:unhideWhenUsed="0"/>
-    <w:lsdException w:name="Medium Shading 2 Accent 2" w:semiHidden="0" w:uiPriority="64" w:unhideWhenUsed="0"/>
-    <w:lsdException w:name="Medium List 1 Accent 2" w:semiHidden="0" w:uiPriority="65" w:unhideWhenUsed="0"/>
-    <w:lsdException w:name="Medium List 2 Accent 2" w:semiHidden="0" w:uiPriority="66" w:unhideWhenUsed="0"/>
-    <w:lsdException w:name="Medium Grid 1 Accent 2" w:semiHidden="0" w:uiPriority="67" w:unhideWhenUsed="0"/>
-    <w:lsdException w:name="Medium Grid 2 Accent 2" w:semiHidden="0" w:uiPriority="68" w:unhideWhenUsed="0"/>
-    <w:lsdException w:name="Medium Grid 3 Accent 2" w:semiHidden="0" w:uiPriority="69" w:unhideWhenUsed="0"/>
-    <w:lsdException w:name="Dark List Accent 2" w:semiHidden="0" w:uiPriority="70" w:unhideWhenUsed="0"/>
-    <w:lsdException w:name="Colorful Shading Accent 2" w:semiHidden="0" w:uiPriority="71" w:unhideWhenUsed="0"/>
-    <w:lsdException w:name="Colorful List Accent 2" w:semiHidden="0" w:uiPriority="72" w:unhideWhenUsed="0"/>
-    <w:lsdException w:name="Colorful Grid Accent 2" w:semiHidden="0" w:uiPriority="73" w:unhideWhenUsed="0"/>
-    <w:lsdException w:name="Light Shading Accent 3" w:semiHidden="0" w:uiPriority="60" w:unhideWhenUsed="0"/>
-    <w:lsdException w:name="Light List Accent 3" w:semiHidden="0" w:uiPriority="61" w:unhideWhenUsed="0"/>
-    <w:lsdException w:name="Light Grid Accent 3" w:semiHidden="0" w:uiPriority="62" w:unhideWhenUsed="0"/>
-    <w:lsdException w:name="Medium Shading 1 Accent 3" w:semiHidden="0" w:uiPriority="63" w:unhideWhenUsed="0"/>
-    <w:lsdException w:name="Medium Shading 2 Accent 3" w:semiHidden="0" w:uiPriority="64" w:unhideWhenUsed="0"/>
-    <w:lsdException w:name="Medium List 1 Accent 3" w:semiHidden="0" w:uiPriority="65" w:unhideWhenUsed="0"/>
-    <w:lsdException w:name="Medium List 2 Accent 3" w:semiHidden="0" w:uiPriority="66" w:unhideWhenUsed="0"/>
-    <w:lsdException w:name="Medium Grid 1 Accent 3" w:semiHidden="0" w:uiPriority="67" w:unhideWhenUsed="0"/>
-    <w:lsdException w:name="Medium Grid 2 Accent 3" w:semiHidden="0" w:uiPriority="68" w:unhideWhenUsed="0"/>
-    <w:lsdException w:name="Medium Grid 3 Accent 3" w:semiHidden="0" w:uiPriority="69" w:unhideWhenUsed="0"/>
-    <w:lsdException w:name="Dark List Accent 3" w:semiHidden="0" w:uiPriority="70" w:unhideWhenUsed="0"/>
-    <w:lsdException w:name="Colorful Shading Accent 3" w:semiHidden="0" w:uiPriority="71" w:unhideWhenUsed="0"/>
-    <w:lsdException w:name="Colorful List Accent 3" w:semiHidden="0" w:uiPriority="72" w:unhideWhenUsed="0"/>
-    <w:lsdException w:name="Colorful Grid Accent 3" w:semiHidden="0" w:uiPriority="73" w:unhideWhenUsed="0"/>
-    <w:lsdException w:name="Light Shading Accent 4" w:semiHidden="0" w:uiPriority="60" w:unhideWhenUsed="0"/>
-    <w:lsdException w:name="Light List Accent 4" w:semiHidden="0" w:uiPriority="61" w:unhideWhenUsed="0"/>
-    <w:lsdException w:name="Light Grid Accent 4" w:semiHidden="0" w:uiPriority="62" w:unhideWhenUsed="0"/>
-    <w:lsdException w:name="Medium Shading 1 Accent 4" w:semiHidden="0" w:uiPriority="63" w:unhideWhenUsed="0"/>
-    <w:lsdException w:name="Medium Shading 2 Accent 4" w:semiHidden="0" w:uiPriority="64" w:unhideWhenUsed="0"/>
-    <w:lsdException w:name="Medium List 1 Accent 4" w:semiHidden="0" w:uiPriority="65" w:unhideWhenUsed="0"/>
-    <w:lsdException w:name="Medium List 2 Accent 4" w:semiHidden="0" w:uiPriority="66" w:unhideWhenUsed="0"/>
-    <w:lsdException w:name="Medium Grid 1 Accent 4" w:semiHidden="0" w:uiPriority="67" w:unhideWhenUsed="0"/>
-    <w:lsdException w:name="Medium Grid 2 Accent 4" w:semiHidden="0" w:uiPriority="68" w:unhideWhenUsed="0"/>
-    <w:lsdException w:name="Medium Grid 3 Accent 4" w:semiHidden="0" w:uiPriority="69" w:unhideWhenUsed="0"/>
-    <w:lsdException w:name="Dark List Accent 4" w:semiHidden="0" w:uiPriority="70" w:unhideWhenUsed="0"/>
-    <w:lsdException w:name="Colorful Shading Accent 4" w:semiHidden="0" w:uiPriority="71" w:unhideWhenUsed="0"/>
-    <w:lsdException w:name="Colorful List Accent 4" w:semiHidden="0" w:uiPriority="72" w:unhideWhenUsed="0"/>
-    <w:lsdException w:name="Colorful Grid Accent 4" w:semiHidden="0" w:uiPriority="73" w:unhideWhenUsed="0"/>
-    <w:lsdException w:name="Light Shading Accent 5" w:semiHidden="0" w:uiPriority="60" w:unhideWhenUsed="0"/>
-    <w:lsdException w:name="Light List Accent 5" w:semiHidden="0" w:uiPriority="61" w:unhideWhenUsed="0"/>
-    <w:lsdException w:name="Light Grid Accent 5" w:semiHidden="0" w:uiPriority="62" w:unhideWhenUsed="0"/>
-    <w:lsdException w:name="Medium Shading 1 Accent 5" w:semiHidden="0" w:uiPriority="63" w:unhideWhenUsed="0"/>
-    <w:lsdException w:name="Medium Shading 2 Accent 5" w:semiHidden="0" w:uiPriority="64" w:unhideWhenUsed="0"/>
-    <w:lsdException w:name="Medium List 1 Accent 5" w:semiHidden="0" w:uiPriority="65" w:unhideWhenUsed="0"/>
-    <w:lsdException w:name="Medium List 2 Accent 5" w:semiHidden="0" w:uiPriority="66" w:unhideWhenUsed="0"/>
-    <w:lsdException w:name="Medium Grid 1 Accent 5" w:semiHidden="0" w:uiPriority="67" w:unhideWhenUsed="0"/>
-    <w:lsdException w:name="Medium Grid 2 Accent 5" w:semiHidden="0" w:uiPriority="68" w:unhideWhenUsed="0"/>
-    <w:lsdException w:name="Medium Grid 3 Accent 5" w:semiHidden="0" w:uiPriority="69" w:unhideWhenUsed="0"/>
-    <w:lsdException w:name="Dark List Accent 5" w:semiHidden="0" w:uiPriority="70" w:unhideWhenUsed="0"/>
-    <w:lsdException w:name="Colorful Shading Accent 5" w:semiHidden="0" w:uiPriority="71" w:unhideWhenUsed="0"/>
-    <w:lsdException w:name="Colorful List Accent 5" w:semiHidden="0" w:uiPriority="72" w:unhideWhenUsed="0"/>
-    <w:lsdException w:name="Colorful Grid Accent 5" w:semiHidden="0" w:uiPriority="73" w:unhideWhenUsed="0"/>
-    <w:lsdException w:name="Light Shading Accent 6" w:semiHidden="0" w:uiPriority="60" w:unhideWhenUsed="0"/>
-    <w:lsdException w:name="Light List Accent 6" w:semiHidden="0" w:uiPriority="61" w:unhideWhenUsed="0"/>
-    <w:lsdException w:name="Light Grid Accent 6" w:semiHidden="0" w:uiPriority="62" w:unhideWhenUsed="0"/>
-    <w:lsdException w:name="Medium Shading 1 Accent 6" w:semiHidden="0" w:uiPriority="63" w:unhideWhenUsed="0"/>
-    <w:lsdException w:name="Medium Shading 2 Accent 6" w:semiHidden="0" w:uiPriority="64" w:unhideWhenUsed="0"/>
-    <w:lsdException w:name="Medium List 1 Accent 6" w:semiHidden="0" w:uiPriority="65" w:unhideWhenUsed="0"/>
-    <w:lsdException w:name="Medium List 2 Accent 6" w:semiHidden="0" w:uiPriority="66" w:unhideWhenUsed="0"/>
-    <w:lsdException w:name="Medium Grid 1 Accent 6" w:semiHidden="0" w:uiPriority="67" w:unhideWhenUsed="0"/>
-    <w:lsdException w:name="Medium Grid 2 Accent 6" w:semiHidden="0" w:uiPriority="68" w:unhideWhenUsed="0"/>
-    <w:lsdException w:name="Medium Grid 3 Accent 6" w:semiHidden="0" w:uiPriority="69" w:unhideWhenUsed="0"/>
-    <w:lsdException w:name="Dark List Accent 6" w:semiHidden="0" w:uiPriority="70" w:unhideWhenUsed="0"/>
-    <w:lsdException w:name="Colorful Shading Accent 6" w:semiHidden="0" w:uiPriority="71" w:unhideWhenUsed="0"/>
-    <w:lsdException w:name="Colorful List Accent 6" w:semiHidden="0" w:uiPriority="72" w:unhideWhenUsed="0"/>
-    <w:lsdException w:name="Colorful Grid Accent 6" w:semiHidden="0" w:uiPriority="73" w:unhideWhenUsed="0"/>
-    <w:lsdException w:name="Subtle Emphasis" w:semiHidden="0" w:uiPriority="19" w:unhideWhenUsed="0" w:qFormat="1"/>
-    <w:lsdException w:name="Intense Emphasis" w:semiHidden="0" w:uiPriority="21" w:unhideWhenUsed="0" w:qFormat="1"/>
-    <w:lsdException w:name="Subtle Reference" w:semiHidden="0" w:uiPriority="31" w:unhideWhenUsed="0" w:qFormat="1"/>
-    <w:lsdException w:name="Intense Reference" w:semiHidden="0" w:uiPriority="32" w:unhideWhenUsed="0" w:qFormat="1"/>
-    <w:lsdException w:name="Book Title" w:semiHidden="0" w:uiPriority="33" w:unhideWhenUsed="0" w:qFormat="1"/>
-    <w:lsdException w:name="Bibliography" w:uiPriority="37"/>
-    <w:lsdException w:name="TOC Heading" w:uiPriority="39" w:qFormat="1"/>
+  <w:latentStyles w:defLockedState="0" w:defUIPriority="99" w:defSemiHidden="0" w:defUnhideWhenUsed="0" w:defQFormat="0" w:count="371">
+    <w:lsdException w:name="Normal" w:uiPriority="0" w:qFormat="1"/>
+    <w:lsdException w:name="heading 1" w:uiPriority="9" w:qFormat="1"/>
+    <w:lsdException w:name="heading 2" w:semiHidden="1" w:uiPriority="9" w:unhideWhenUsed="1" w:qFormat="1"/>
+    <w:lsdException w:name="heading 3" w:semiHidden="1" w:uiPriority="9" w:unhideWhenUsed="1" w:qFormat="1"/>
+    <w:lsdException w:name="heading 4" w:semiHidden="1" w:uiPriority="9" w:unhideWhenUsed="1" w:qFormat="1"/>
+    <w:lsdException w:name="heading 5" w:semiHidden="1" w:uiPriority="9" w:unhideWhenUsed="1" w:qFormat="1"/>
+    <w:lsdException w:name="heading 6" w:semiHidden="1" w:uiPriority="9" w:unhideWhenUsed="1" w:qFormat="1"/>
+    <w:lsdException w:name="heading 7" w:semiHidden="1" w:uiPriority="9" w:unhideWhenUsed="1" w:qFormat="1"/>
+    <w:lsdException w:name="heading 8" w:semiHidden="1" w:uiPriority="9" w:unhideWhenUsed="1" w:qFormat="1"/>
+    <w:lsdException w:name="heading 9" w:semiHidden="1" w:uiPriority="9" w:unhideWhenUsed="1" w:qFormat="1"/>
+    <w:lsdException w:name="index 1" w:semiHidden="1" w:unhideWhenUsed="1"/>
+    <w:lsdException w:name="index 2" w:semiHidden="1" w:unhideWhenUsed="1"/>
+    <w:lsdException w:name="index 3" w:semiHidden="1" w:unhideWhenUsed="1"/>
+    <w:lsdException w:name="index 4" w:semiHidden="1" w:unhideWhenUsed="1"/>
+    <w:lsdException w:name="index 5" w:semiHidden="1" w:unhideWhenUsed="1"/>
+    <w:lsdException w:name="index 6" w:semiHidden="1" w:unhideWhenUsed="1"/>
+    <w:lsdException w:name="index 7" w:semiHidden="1" w:unhideWhenUsed="1"/>
+    <w:lsdException w:name="index 8" w:semiHidden="1" w:unhideWhenUsed="1"/>
+    <w:lsdException w:name="index 9" w:semiHidden="1" w:unhideWhenUsed="1"/>
+    <w:lsdException w:name="toc 1" w:semiHidden="1" w:uiPriority="39" w:unhideWhenUsed="1" w:qFormat="1"/>
+    <w:lsdException w:name="toc 2" w:semiHidden="1" w:uiPriority="39" w:unhideWhenUsed="1" w:qFormat="1"/>
+    <w:lsdException w:name="toc 3" w:semiHidden="1" w:uiPriority="39" w:unhideWhenUsed="1" w:qFormat="1"/>
+    <w:lsdException w:name="toc 4" w:semiHidden="1" w:uiPriority="39" w:unhideWhenUsed="1"/>
+    <w:lsdException w:name="toc 5" w:semiHidden="1" w:uiPriority="39" w:unhideWhenUsed="1"/>
+    <w:lsdException w:name="toc 6" w:semiHidden="1" w:uiPriority="39" w:unhideWhenUsed="1"/>
+    <w:lsdException w:name="toc 7" w:semiHidden="1" w:uiPriority="39" w:unhideWhenUsed="1"/>
+    <w:lsdException w:name="toc 8" w:semiHidden="1" w:uiPriority="39" w:unhideWhenUsed="1"/>
+    <w:lsdException w:name="toc 9" w:semiHidden="1" w:uiPriority="39" w:unhideWhenUsed="1"/>
+    <w:lsdException w:name="Normal Indent" w:semiHidden="1" w:unhideWhenUsed="1"/>
+    <w:lsdException w:name="footnote text" w:semiHidden="1" w:unhideWhenUsed="1"/>
+    <w:lsdException w:name="annotation text" w:semiHidden="1" w:unhideWhenUsed="1"/>
+    <w:lsdException w:name="header" w:semiHidden="1" w:unhideWhenUsed="1"/>
+    <w:lsdException w:name="footer" w:semiHidden="1" w:unhideWhenUsed="1"/>
+    <w:lsdException w:name="index heading" w:semiHidden="1" w:unhideWhenUsed="1"/>
+    <w:lsdException w:name="caption" w:semiHidden="1" w:uiPriority="35" w:unhideWhenUsed="1" w:qFormat="1"/>
+    <w:lsdException w:name="table of figures" w:semiHidden="1" w:unhideWhenUsed="1"/>
+    <w:lsdException w:name="envelope address" w:semiHidden="1" w:unhideWhenUsed="1"/>
+    <w:lsdException w:name="envelope return" w:semiHidden="1" w:unhideWhenUsed="1"/>
+    <w:lsdException w:name="footnote reference" w:semiHidden="1" w:unhideWhenUsed="1"/>
+    <w:lsdException w:name="annotation reference" w:semiHidden="1" w:unhideWhenUsed="1"/>
+    <w:lsdException w:name="line number" w:semiHidden="1" w:unhideWhenUsed="1"/>
+    <w:lsdException w:name="page number" w:semiHidden="1" w:unhideWhenUsed="1"/>
+    <w:lsdException w:name="endnote reference" w:semiHidden="1" w:unhideWhenUsed="1"/>
+    <w:lsdException w:name="endnote text" w:semiHidden="1" w:unhideWhenUsed="1"/>
+    <w:lsdException w:name="table of authorities" w:semiHidden="1" w:unhideWhenUsed="1"/>
+    <w:lsdException w:name="macro" w:semiHidden="1" w:unhideWhenUsed="1"/>
+    <w:lsdException w:name="toa heading" w:semiHidden="1" w:unhideWhenUsed="1"/>
+    <w:lsdException w:name="List" w:semiHidden="1" w:unhideWhenUsed="1"/>
+    <w:lsdException w:name="List Bullet" w:semiHidden="1" w:unhideWhenUsed="1"/>
+    <w:lsdException w:name="List Number" w:semiHidden="1" w:unhideWhenUsed="1"/>
+    <w:lsdException w:name="List 2" w:semiHidden="1" w:unhideWhenUsed="1"/>
+    <w:lsdException w:name="List 3" w:semiHidden="1" w:unhideWhenUsed="1"/>
+    <w:lsdException w:name="List 4" w:semiHidden="1" w:unhideWhenUsed="1"/>
+    <w:lsdException w:name="List 5" w:semiHidden="1" w:unhideWhenUsed="1"/>
+    <w:lsdException w:name="List Bullet 2" w:semiHidden="1" w:unhideWhenUsed="1"/>
+    <w:lsdException w:name="List Bullet 3" w:semiHidden="1" w:unhideWhenUsed="1"/>
+    <w:lsdException w:name="List Bullet 4" w:semiHidden="1" w:unhideWhenUsed="1"/>
+    <w:lsdException w:name="List Bullet 5" w:semiHidden="1" w:unhideWhenUsed="1"/>
+    <w:lsdException w:name="List Number 2" w:semiHidden="1" w:unhideWhenUsed="1"/>
+    <w:lsdException w:name="List Number 3" w:semiHidden="1" w:unhideWhenUsed="1"/>
+    <w:lsdException w:name="List Number 4" w:semiHidden="1" w:unhideWhenUsed="1"/>
+    <w:lsdException w:name="List Number 5" w:semiHidden="1" w:unhideWhenUsed="1"/>
+    <w:lsdException w:name="Title" w:uiPriority="10" w:qFormat="1"/>
+    <w:lsdException w:name="Closing" w:semiHidden="1" w:unhideWhenUsed="1"/>
+    <w:lsdException w:name="Signature" w:semiHidden="1" w:unhideWhenUsed="1"/>
+    <w:lsdException w:name="Default Paragraph Font" w:semiHidden="1" w:uiPriority="1" w:unhideWhenUsed="1"/>
+    <w:lsdException w:name="Body Text" w:semiHidden="1" w:unhideWhenUsed="1"/>
+    <w:lsdException w:name="Body Text Indent" w:semiHidden="1" w:unhideWhenUsed="1"/>
+    <w:lsdException w:name="List Continue" w:semiHidden="1" w:unhideWhenUsed="1"/>
+    <w:lsdException w:name="List Continue 2" w:semiHidden="1" w:unhideWhenUsed="1"/>
+    <w:lsdException w:name="List Continue 3" w:semiHidden="1" w:unhideWhenUsed="1"/>
+    <w:lsdException w:name="List Continue 4" w:semiHidden="1" w:unhideWhenUsed="1"/>
+    <w:lsdException w:name="List Continue 5" w:semiHidden="1" w:unhideWhenUsed="1"/>
+    <w:lsdException w:name="Message Header" w:semiHidden="1" w:unhideWhenUsed="1"/>
+    <w:lsdException w:name="Subtitle" w:uiPriority="11" w:qFormat="1"/>
+    <w:lsdException w:name="Salutation" w:semiHidden="1" w:unhideWhenUsed="1"/>
+    <w:lsdException w:name="Date" w:semiHidden="1" w:unhideWhenUsed="1"/>
+    <w:lsdException w:name="Body Text First Indent" w:semiHidden="1" w:unhideWhenUsed="1"/>
+    <w:lsdException w:name="Body Text First Indent 2" w:semiHidden="1" w:unhideWhenUsed="1"/>
+    <w:lsdException w:name="Note Heading" w:semiHidden="1" w:unhideWhenUsed="1"/>
+    <w:lsdException w:name="Body Text 2" w:semiHidden="1" w:unhideWhenUsed="1"/>
+    <w:lsdException w:name="Body Text 3" w:semiHidden="1" w:unhideWhenUsed="1"/>
+    <w:lsdException w:name="Body Text Indent 2" w:semiHidden="1" w:unhideWhenUsed="1"/>
+    <w:lsdException w:name="Body Text Indent 3" w:semiHidden="1" w:unhideWhenUsed="1"/>
+    <w:lsdException w:name="Block Text" w:semiHidden="1" w:unhideWhenUsed="1"/>
+    <w:lsdException w:name="Hyperlink" w:semiHidden="1" w:unhideWhenUsed="1"/>
+    <w:lsdException w:name="FollowedHyperlink" w:semiHidden="1" w:unhideWhenUsed="1"/>
+    <w:lsdException w:name="Strong" w:uiPriority="22" w:qFormat="1"/>
+    <w:lsdException w:name="Emphasis" w:uiPriority="20" w:qFormat="1"/>
+    <w:lsdException w:name="Document Map" w:semiHidden="1" w:unhideWhenUsed="1"/>
+    <w:lsdException w:name="Plain Text" w:semiHidden="1" w:unhideWhenUsed="1"/>
+    <w:lsdException w:name="E-mail Signature" w:semiHidden="1" w:unhideWhenUsed="1"/>
+    <w:lsdException w:name="HTML Top of Form" w:semiHidden="1" w:unhideWhenUsed="1"/>
+    <w:lsdException w:name="HTML Bottom of Form" w:semiHidden="1" w:unhideWhenUsed="1"/>
+    <w:lsdException w:name="Normal (Web)" w:semiHidden="1" w:unhideWhenUsed="1"/>
+    <w:lsdException w:name="HTML Acronym" w:semiHidden="1" w:unhideWhenUsed="1"/>
+    <w:lsdException w:name="HTML Address" w:semiHidden="1" w:unhideWhenUsed="1"/>
+    <w:lsdException w:name="HTML Cite" w:semiHidden="1" w:unhideWhenUsed="1"/>
+    <w:lsdException w:name="HTML Code" w:semiHidden="1" w:unhideWhenUsed="1"/>
+    <w:lsdException w:name="HTML Definition" w:semiHidden="1" w:unhideWhenUsed="1"/>
+    <w:lsdException w:name="HTML Keyboard" w:semiHidden="1" w:unhideWhenUsed="1"/>
+    <w:lsdException w:name="HTML Preformatted" w:semiHidden="1" w:unhideWhenUsed="1"/>
+    <w:lsdException w:name="HTML Sample" w:semiHidden="1" w:unhideWhenUsed="1"/>
+    <w:lsdException w:name="HTML Typewriter" w:semiHidden="1" w:unhideWhenUsed="1"/>
+    <w:lsdException w:name="HTML Variable" w:semiHidden="1" w:unhideWhenUsed="1"/>
+    <w:lsdException w:name="Normal Table" w:semiHidden="1" w:unhideWhenUsed="1"/>
+    <w:lsdException w:name="annotation subject" w:semiHidden="1" w:unhideWhenUsed="1"/>
+    <w:lsdException w:name="No List" w:semiHidden="1" w:unhideWhenUsed="1"/>
+    <w:lsdException w:name="Outline List 1" w:semiHidden="1" w:unhideWhenUsed="1"/>
+    <w:lsdException w:name="Outline List 2" w:semiHidden="1" w:unhideWhenUsed="1"/>
+    <w:lsdException w:name="Outline List 3" w:semiHidden="1" w:unhideWhenUsed="1"/>
+    <w:lsdException w:name="Table Simple 1" w:semiHidden="1" w:unhideWhenUsed="1"/>
+    <w:lsdException w:name="Table Simple 2" w:semiHidden="1" w:unhideWhenUsed="1"/>
+    <w:lsdException w:name="Table Simple 3" w:semiHidden="1" w:unhideWhenUsed="1"/>
+    <w:lsdException w:name="Table Classic 1" w:semiHidden="1" w:unhideWhenUsed="1"/>
+    <w:lsdException w:name="Table Classic 2" w:semiHidden="1" w:unhideWhenUsed="1"/>
+    <w:lsdException w:name="Table Classic 3" w:semiHidden="1" w:unhideWhenUsed="1"/>
+    <w:lsdException w:name="Table Classic 4" w:semiHidden="1" w:unhideWhenUsed="1"/>
+    <w:lsdException w:name="Table Colorful 1" w:semiHidden="1" w:unhideWhenUsed="1"/>
+    <w:lsdException w:name="Table Colorful 2" w:semiHidden="1" w:unhideWhenUsed="1"/>
+    <w:lsdException w:name="Table Colorful 3" w:semiHidden="1" w:unhideWhenUsed="1"/>
+    <w:lsdException w:name="Table Columns 1" w:semiHidden="1" w:unhideWhenUsed="1"/>
+    <w:lsdException w:name="Table Columns 2" w:semiHidden="1" w:unhideWhenUsed="1"/>
+    <w:lsdException w:name="Table Columns 3" w:semiHidden="1" w:unhideWhenUsed="1"/>
+    <w:lsdException w:name="Table Columns 4" w:semiHidden="1" w:unhideWhenUsed="1"/>
+    <w:lsdException w:name="Table Columns 5" w:semiHidden="1" w:unhideWhenUsed="1"/>
+    <w:lsdException w:name="Table Grid 1" w:semiHidden="1" w:unhideWhenUsed="1"/>
+    <w:lsdException w:name="Table Grid 2" w:semiHidden="1" w:unhideWhenUsed="1"/>
+    <w:lsdException w:name="Table Grid 3" w:semiHidden="1" w:unhideWhenUsed="1"/>
+    <w:lsdException w:name="Table Grid 4" w:semiHidden="1" w:unhideWhenUsed="1"/>
+    <w:lsdException w:name="Table Grid 5" w:semiHidden="1" w:unhideWhenUsed="1"/>
+    <w:lsdException w:name="Table Grid 6" w:semiHidden="1" w:unhideWhenUsed="1"/>
+    <w:lsdException w:name="Table Grid 7" w:semiHidden="1" w:unhideWhenUsed="1"/>
+    <w:lsdException w:name="Table Grid 8" w:semiHidden="1" w:unhideWhenUsed="1"/>
+    <w:lsdException w:name="Table List 1" w:semiHidden="1" w:unhideWhenUsed="1"/>
+    <w:lsdException w:name="Table List 2" w:semiHidden="1" w:unhideWhenUsed="1"/>
+    <w:lsdException w:name="Table List 3" w:semiHidden="1" w:unhideWhenUsed="1"/>
+    <w:lsdException w:name="Table List 4" w:semiHidden="1" w:unhideWhenUsed="1"/>
+    <w:lsdException w:name="Table List 5" w:semiHidden="1" w:unhideWhenUsed="1"/>
+    <w:lsdException w:name="Table List 6" w:semiHidden="1" w:unhideWhenUsed="1"/>
+    <w:lsdException w:name="Table List 7" w:semiHidden="1" w:unhideWhenUsed="1"/>
+    <w:lsdException w:name="Table List 8" w:semiHidden="1" w:unhideWhenUsed="1"/>
+    <w:lsdException w:name="Table 3D effects 1" w:semiHidden="1" w:unhideWhenUsed="1"/>
+    <w:lsdException w:name="Table 3D effects 2" w:semiHidden="1" w:unhideWhenUsed="1"/>
+    <w:lsdException w:name="Table 3D effects 3" w:semiHidden="1" w:unhideWhenUsed="1"/>
+    <w:lsdException w:name="Table Contemporary" w:semiHidden="1" w:unhideWhenUsed="1"/>
+    <w:lsdException w:name="Table Elegant" w:semiHidden="1" w:unhideWhenUsed="1"/>
+    <w:lsdException w:name="Table Professional" w:semiHidden="1" w:unhideWhenUsed="1"/>
+    <w:lsdException w:name="Table Subtle 1" w:semiHidden="1" w:unhideWhenUsed="1"/>
+    <w:lsdException w:name="Table Subtle 2" w:semiHidden="1" w:unhideWhenUsed="1"/>
+    <w:lsdException w:name="Table Web 1" w:semiHidden="1" w:unhideWhenUsed="1"/>
+    <w:lsdException w:name="Table Web 2" w:semiHidden="1" w:unhideWhenUsed="1"/>
+    <w:lsdException w:name="Table Web 3" w:semiHidden="1" w:unhideWhenUsed="1"/>
+    <w:lsdException w:name="Balloon Text" w:semiHidden="1" w:unhideWhenUsed="1"/>
+    <w:lsdException w:name="Table Grid" w:uiPriority="59"/>
+    <w:lsdException w:name="Table Theme" w:semiHidden="1" w:unhideWhenUsed="1"/>
+    <w:lsdException w:name="Placeholder Text" w:semiHidden="1"/>
+    <w:lsdException w:name="No Spacing" w:uiPriority="1" w:qFormat="1"/>
+    <w:lsdException w:name="Light Shading" w:uiPriority="60"/>
+    <w:lsdException w:name="Light List" w:uiPriority="61"/>
+    <w:lsdException w:name="Light Grid" w:uiPriority="62"/>
+    <w:lsdException w:name="Medium Shading 1" w:uiPriority="63"/>
+    <w:lsdException w:name="Medium Shading 2" w:uiPriority="64"/>
+    <w:lsdException w:name="Medium List 1" w:uiPriority="65"/>
+    <w:lsdException w:name="Medium List 2" w:uiPriority="66"/>
+    <w:lsdException w:name="Medium Grid 1" w:uiPriority="67"/>
+    <w:lsdException w:name="Medium Grid 2" w:uiPriority="68"/>
+    <w:lsdException w:name="Medium Grid 3" w:uiPriority="69"/>
+    <w:lsdException w:name="Dark List" w:uiPriority="70"/>
+    <w:lsdException w:name="Colorful Shading" w:uiPriority="71"/>
+    <w:lsdException w:name="Colorful List" w:uiPriority="72"/>
+    <w:lsdException w:name="Colorful Grid" w:uiPriority="73"/>
+    <w:lsdException w:name="Light Shading Accent 1" w:uiPriority="60"/>
+    <w:lsdException w:name="Light List Accent 1" w:uiPriority="61"/>
+    <w:lsdException w:name="Light Grid Accent 1" w:uiPriority="62"/>
+    <w:lsdException w:name="Medium Shading 1 Accent 1" w:uiPriority="63"/>
+    <w:lsdException w:name="Medium Shading 2 Accent 1" w:uiPriority="64"/>
+    <w:lsdException w:name="Medium List 1 Accent 1" w:uiPriority="65"/>
+    <w:lsdException w:name="Revision" w:semiHidden="1"/>
+    <w:lsdException w:name="List Paragraph" w:uiPriority="34" w:qFormat="1"/>
+    <w:lsdException w:name="Quote" w:uiPriority="29" w:qFormat="1"/>
+    <w:lsdException w:name="Intense Quote" w:uiPriority="30" w:qFormat="1"/>
+    <w:lsdException w:name="Medium List 2 Accent 1" w:uiPriority="66"/>
+    <w:lsdException w:name="Medium Grid 1 Accent 1" w:uiPriority="67"/>
+    <w:lsdException w:name="Medium Grid 2 Accent 1" w:uiPriority="68"/>
+    <w:lsdException w:name="Medium Grid 3 Accent 1" w:uiPriority="69"/>
+    <w:lsdException w:name="Dark List Accent 1" w:uiPriority="70"/>
+    <w:lsdException w:name="Colorful Shading Accent 1" w:uiPriority="71"/>
+    <w:lsdException w:name="Colorful List Accent 1" w:uiPriority="72"/>
+    <w:lsdException w:name="Colorful Grid Accent 1" w:uiPriority="73"/>
+    <w:lsdException w:name="Light Shading Accent 2" w:uiPriority="60"/>
+    <w:lsdException w:name="Light List Accent 2" w:uiPriority="61"/>
+    <w:lsdException w:name="Light Grid Accent 2" w:uiPriority="62"/>
+    <w:lsdException w:name="Medium Shading 1 Accent 2" w:uiPriority="63"/>
+    <w:lsdException w:name="Medium Shading 2 Accent 2" w:uiPriority="64"/>
+    <w:lsdException w:name="Medium List 1 Accent 2" w:uiPriority="65"/>
+    <w:lsdException w:name="Medium List 2 Accent 2" w:uiPriority="66"/>
+    <w:lsdException w:name="Medium Grid 1 Accent 2" w:uiPriority="67"/>
+    <w:lsdException w:name="Medium Grid 2 Accent 2" w:uiPriority="68"/>
+    <w:lsdException w:name="Medium Grid 3 Accent 2" w:uiPriority="69"/>
+    <w:lsdException w:name="Dark List Accent 2" w:uiPriority="70"/>
+    <w:lsdException w:name="Colorful Shading Accent 2" w:uiPriority="71"/>
+    <w:lsdException w:name="Colorful List Accent 2" w:uiPriority="72"/>
+    <w:lsdException w:name="Colorful Grid Accent 2" w:uiPriority="73"/>
+    <w:lsdException w:name="Light Shading Accent 3" w:uiPriority="60"/>
+    <w:lsdException w:name="Light List Accent 3" w:uiPriority="61"/>
+    <w:lsdException w:name="Light Grid Accent 3" w:uiPriority="62"/>
+    <w:lsdException w:name="Medium Shading 1 Accent 3" w:uiPriority="63"/>
+    <w:lsdException w:name="Medium Shading 2 Accent 3" w:uiPriority="64"/>
+    <w:lsdException w:name="Medium List 1 Accent 3" w:uiPriority="65"/>
+    <w:lsdException w:name="Medium List 2 Accent 3" w:uiPriority="66"/>
+    <w:lsdException w:name="Medium Grid 1 Accent 3" w:uiPriority="67"/>
+    <w:lsdException w:name="Medium Grid 2 Accent 3" w:uiPriority="68"/>
+    <w:lsdException w:name="Medium Grid 3 Accent 3" w:uiPriority="69"/>
+    <w:lsdException w:name="Dark List Accent 3" w:uiPriority="70"/>
+    <w:lsdException w:name="Colorful Shading Accent 3" w:uiPriority="71"/>
+    <w:lsdException w:name="Colorful List Accent 3" w:uiPriority="72"/>
+    <w:lsdException w:name="Colorful Grid Accent 3" w:uiPriority="73"/>
+    <w:lsdException w:name="Light Shading Accent 4" w:uiPriority="60"/>
+    <w:lsdException w:name="Light List Accent 4" w:uiPriority="61"/>
+    <w:lsdException w:name="Light Grid Accent 4" w:uiPriority="62"/>
+    <w:lsdException w:name="Medium Shading 1 Accent 4" w:uiPriority="63"/>
+    <w:lsdException w:name="Medium Shading 2 Accent 4" w:uiPriority="64"/>
+    <w:lsdException w:name="Medium List 1 Accent 4" w:uiPriority="65"/>
+    <w:lsdException w:name="Medium List 2 Accent 4" w:uiPriority="66"/>
+    <w:lsdException w:name="Medium Grid 1 Accent 4" w:uiPriority="67"/>
+    <w:lsdException w:name="Medium Grid 2 Accent 4" w:uiPriority="68"/>
+    <w:lsdException w:name="Medium Grid 3 Accent 4" w:uiPriority="69"/>
+    <w:lsdException w:name="Dark List Accent 4" w:uiPriority="70"/>
+    <w:lsdException w:name="Colorful Shading Accent 4" w:uiPriority="71"/>
+    <w:lsdException w:name="Colorful List Accent 4" w:uiPriority="72"/>
+    <w:lsdException w:name="Colorful Grid Accent 4" w:uiPriority="73"/>
+    <w:lsdException w:name="Light Shading Accent 5" w:uiPriority="60"/>
+    <w:lsdException w:name="Light List Accent 5" w:uiPriority="61"/>
+    <w:lsdException w:name="Light Grid Accent 5" w:uiPriority="62"/>
+    <w:lsdException w:name="Medium Shading 1 Accent 5" w:uiPriority="63"/>
+    <w:lsdException w:name="Medium Shading 2 Accent 5" w:uiPriority="64"/>
+    <w:lsdException w:name="Medium List 1 Accent 5" w:uiPriority="65"/>
+    <w:lsdException w:name="Medium List 2 Accent 5" w:uiPriority="66"/>
+    <w:lsdException w:name="Medium Grid 1 Accent 5" w:uiPriority="67"/>
+    <w:lsdException w:name="Medium Grid 2 Accent 5" w:uiPriority="68"/>
+    <w:lsdException w:name="Medium Grid 3 Accent 5" w:uiPriority="69"/>
+    <w:lsdException w:name="Dark List Accent 5" w:uiPriority="70"/>
+    <w:lsdException w:name="Colorful Shading Accent 5" w:uiPriority="71"/>
+    <w:lsdException w:name="Colorful List Accent 5" w:uiPriority="72"/>
+    <w:lsdException w:name="Colorful Grid Accent 5" w:uiPriority="73"/>
+    <w:lsdException w:name="Light Shading Accent 6" w:uiPriority="60"/>
+    <w:lsdException w:name="Light List Accent 6" w:uiPriority="61"/>
+    <w:lsdException w:name="Light Grid Accent 6" w:uiPriority="62"/>
+    <w:lsdException w:name="Medium Shading 1 Accent 6" w:uiPriority="63"/>
+    <w:lsdException w:name="Medium Shading 2 Accent 6" w:uiPriority="64"/>
+    <w:lsdException w:name="Medium List 1 Accent 6" w:uiPriority="65"/>
+    <w:lsdException w:name="Medium List 2 Accent 6" w:uiPriority="66"/>
+    <w:lsdException w:name="Medium Grid 1 Accent 6" w:uiPriority="67"/>
+    <w:lsdException w:name="Medium Grid 2 Accent 6" w:uiPriority="68"/>
+    <w:lsdException w:name="Medium Grid 3 Accent 6" w:uiPriority="69"/>
+    <w:lsdException w:name="Dark List Accent 6" w:uiPriority="70"/>
+    <w:lsdException w:name="Colorful Shading Accent 6" w:uiPriority="71"/>
+    <w:lsdException w:name="Colorful List Accent 6" w:uiPriority="72"/>
+    <w:lsdException w:name="Colorful Grid Accent 6" w:uiPriority="73"/>
+    <w:lsdException w:name="Subtle Emphasis" w:uiPriority="19" w:qFormat="1"/>
+    <w:lsdException w:name="Intense Emphasis" w:uiPriority="21" w:qFormat="1"/>
+    <w:lsdException w:name="Subtle Reference" w:uiPriority="31" w:qFormat="1"/>
+    <w:lsdException w:name="Intense Reference" w:uiPriority="32" w:qFormat="1"/>
+    <w:lsdException w:name="Book Title" w:uiPriority="33" w:qFormat="1"/>
+    <w:lsdException w:name="Bibliography" w:semiHidden="1" w:uiPriority="37" w:unhideWhenUsed="1"/>
+    <w:lsdException w:name="TOC Heading" w:semiHidden="1" w:uiPriority="39" w:unhideWhenUsed="1" w:qFormat="1"/>
+    <w:lsdException w:name="Plain Table 1" w:uiPriority="41"/>
+    <w:lsdException w:name="Plain Table 2" w:uiPriority="42"/>
+    <w:lsdException w:name="Plain Table 3" w:uiPriority="43"/>
+    <w:lsdException w:name="Plain Table 4" w:uiPriority="44"/>
+    <w:lsdException w:name="Plain Table 5" w:uiPriority="45"/>
+    <w:lsdException w:name="Grid Table Light" w:uiPriority="40"/>
+    <w:lsdException w:name="Grid Table 1 Light" w:uiPriority="46"/>
+    <w:lsdException w:name="Grid Table 2" w:uiPriority="47"/>
+    <w:lsdException w:name="Grid Table 3" w:uiPriority="48"/>
+    <w:lsdException w:name="Grid Table 4" w:uiPriority="49"/>
+    <w:lsdException w:name="Grid Table 5 Dark" w:uiPriority="50"/>
+    <w:lsdException w:name="Grid Table 6 Colorful" w:uiPriority="51"/>
+    <w:lsdException w:name="Grid Table 7 Colorful" w:uiPriority="52"/>
+    <w:lsdException w:name="Grid Table 1 Light Accent 1" w:uiPriority="46"/>
+    <w:lsdException w:name="Grid Table 2 Accent 1" w:uiPriority="47"/>
+    <w:lsdException w:name="Grid Table 3 Accent 1" w:uiPriority="48"/>
+    <w:lsdException w:name="Grid Table 4 Accent 1" w:uiPriority="49"/>
+    <w:lsdException w:name="Grid Table 5 Dark Accent 1" w:uiPriority="50"/>
+    <w:lsdException w:name="Grid Table 6 Colorful Accent 1" w:uiPriority="51"/>
+    <w:lsdException w:name="Grid Table 7 Colorful Accent 1" w:uiPriority="52"/>
+    <w:lsdException w:name="Grid Table 1 Light Accent 2" w:uiPriority="46"/>
+    <w:lsdException w:name="Grid Table 2 Accent 2" w:uiPriority="47"/>
+    <w:lsdException w:name="Grid Table 3 Accent 2" w:uiPriority="48"/>
+    <w:lsdException w:name="Grid Table 4 Accent 2" w:uiPriority="49"/>
+    <w:lsdException w:name="Grid Table 5 Dark Accent 2" w:uiPriority="50"/>
+    <w:lsdException w:name="Grid Table 6 Colorful Accent 2" w:uiPriority="51"/>
+    <w:lsdException w:name="Grid Table 7 Colorful Accent 2" w:uiPriority="52"/>
+    <w:lsdException w:name="Grid Table 1 Light Accent 3" w:uiPriority="46"/>
+    <w:lsdException w:name="Grid Table 2 Accent 3" w:uiPriority="47"/>
+    <w:lsdException w:name="Grid Table 3 Accent 3" w:uiPriority="48"/>
+    <w:lsdException w:name="Grid Table 4 Accent 3" w:uiPriority="49"/>
+    <w:lsdException w:name="Grid Table 5 Dark Accent 3" w:uiPriority="50"/>
+    <w:lsdException w:name="Grid Table 6 Colorful Accent 3" w:uiPriority="51"/>
+    <w:lsdException w:name="Grid Table 7 Colorful Accent 3" w:uiPriority="52"/>
+    <w:lsdException w:name="Grid Table 1 Light Accent 4" w:uiPriority="46"/>
+    <w:lsdException w:name="Grid Table 2 Accent 4" w:uiPriority="47"/>
+    <w:lsdException w:name="Grid Table 3 Accent 4" w:uiPriority="48"/>
+    <w:lsdException w:name="Grid Table 4 Accent 4" w:uiPriority="49"/>
+    <w:lsdException w:name="Grid Table 5 Dark Accent 4" w:uiPriority="50"/>
+    <w:lsdException w:name="Grid Table 6 Colorful Accent 4" w:uiPriority="51"/>
+    <w:lsdException w:name="Grid Table 7 Colorful Accent 4" w:uiPriority="52"/>
+    <w:lsdException w:name="Grid Table 1 Light Accent 5" w:uiPriority="46"/>
+    <w:lsdException w:name="Grid Table 2 Accent 5" w:uiPriority="47"/>
+    <w:lsdException w:name="Grid Table 3 Accent 5" w:uiPriority="48"/>
+    <w:lsdException w:name="Grid Table 4 Accent 5" w:uiPriority="49"/>
+    <w:lsdException w:name="Grid Table 5 Dark Accent 5" w:uiPriority="50"/>
+    <w:lsdException w:name="Grid Table 6 Colorful Accent 5" w:uiPriority="51"/>
+    <w:lsdException w:name="Grid Table 7 Colorful Accent 5" w:uiPriority="52"/>
+    <w:lsdException w:name="Grid Table 1 Light Accent 6" w:uiPriority="46"/>
+    <w:lsdException w:name="Grid Table 2 Accent 6" w:uiPriority="47"/>
+    <w:lsdException w:name="Grid Table 3 Accent 6" w:uiPriority="48"/>
+    <w:lsdException w:name="Grid Table 4 Accent 6" w:uiPriority="49"/>
+    <w:lsdException w:name="Grid Table 5 Dark Accent 6" w:uiPriority="50"/>
+    <w:lsdException w:name="Grid Table 6 Colorful Accent 6" w:uiPriority="51"/>
+    <w:lsdException w:name="Grid Table 7 Colorful Accent 6" w:uiPriority="52"/>
+    <w:lsdException w:name="List Table 1 Light" w:uiPriority="46"/>
+    <w:lsdException w:name="List Table 2" w:uiPriority="47"/>
+    <w:lsdException w:name="List Table 3" w:uiPriority="48"/>
+    <w:lsdException w:name="List Table 4" w:uiPriority="49"/>
+    <w:lsdException w:name="List Table 5 Dark" w:uiPriority="50"/>
+    <w:lsdException w:name="List Table 6 Colorful" w:uiPriority="51"/>
+    <w:lsdException w:name="List Table 7 Colorful" w:uiPriority="52"/>
+    <w:lsdException w:name="List Table 1 Light Accent 1" w:uiPriority="46"/>
+    <w:lsdException w:name="List Table 2 Accent 1" w:uiPriority="47"/>
+    <w:lsdException w:name="List Table 3 Accent 1" w:uiPriority="48"/>
+    <w:lsdException w:name="List Table 4 Accent 1" w:uiPriority="49"/>
+    <w:lsdException w:name="List Table 5 Dark Accent 1" w:uiPriority="50"/>
+    <w:lsdException w:name="List Table 6 Colorful Accent 1" w:uiPriority="51"/>
+    <w:lsdException w:name="List Table 7 Colorful Accent 1" w:uiPriority="52"/>
+    <w:lsdException w:name="List Table 1 Light Accent 2" w:uiPriority="46"/>
+    <w:lsdException w:name="List Table 2 Accent 2" w:uiPriority="47"/>
+    <w:lsdException w:name="List Table 3 Accent 2" w:uiPriority="48"/>
+    <w:lsdException w:name="List Table 4 Accent 2" w:uiPriority="49"/>
+    <w:lsdException w:name="List Table 5 Dark Accent 2" w:uiPriority="50"/>
+    <w:lsdException w:name="List Table 6 Colorful Accent 2" w:uiPriority="51"/>
+    <w:lsdException w:name="List Table 7 Colorful Accent 2" w:uiPriority="52"/>
+    <w:lsdException w:name="List Table 1 Light Accent 3" w:uiPriority="46"/>
+    <w:lsdException w:name="List Table 2 Accent 3" w:uiPriority="47"/>
+    <w:lsdException w:name="List Table 3 Accent 3" w:uiPriority="48"/>
+    <w:lsdException w:name="List Table 4 Accent 3" w:uiPriority="49"/>
+    <w:lsdException w:name="List Table 5 Dark Accent 3" w:uiPriority="50"/>
+    <w:lsdException w:name="List Table 6 Colorful Accent 3" w:uiPriority="51"/>
+    <w:lsdException w:name="List Table 7 Colorful Accent 3" w:uiPriority="52"/>
+    <w:lsdException w:name="List Table 1 Light Accent 4" w:uiPriority="46"/>
+    <w:lsdException w:name="List Table 2 Accent 4" w:uiPriority="47"/>
+    <w:lsdException w:name="List Table 3 Accent 4" w:uiPriority="48"/>
+    <w:lsdException w:name="List Table 4 Accent 4" w:uiPriority="49"/>
+    <w:lsdException w:name="List Table 5 Dark Accent 4" w:uiPriority="50"/>
+    <w:lsdException w:name="List Table 6 Colorful Accent 4" w:uiPriority="51"/>
+    <w:lsdException w:name="List Table 7 Colorful Accent 4" w:uiPriority="52"/>
+    <w:lsdException w:name="List Table 1 Light Accent 5" w:uiPriority="46"/>
+    <w:lsdException w:name="List Table 2 Accent 5" w:uiPriority="47"/>
+    <w:lsdException w:name="List Table 3 Accent 5" w:uiPriority="48"/>
+    <w:lsdException w:name="List Table 4 Accent 5" w:uiPriority="49"/>
+    <w:lsdException w:name="List Table 5 Dark Accent 5" w:uiPriority="50"/>
+    <w:lsdException w:name="List Table 6 Colorful Accent 5" w:uiPriority="51"/>
+    <w:lsdException w:name="List Table 7 Colorful Accent 5" w:uiPriority="52"/>
+    <w:lsdException w:name="List Table 1 Light Accent 6" w:uiPriority="46"/>
+    <w:lsdException w:name="List Table 2 Accent 6" w:uiPriority="47"/>
+    <w:lsdException w:name="List Table 3 Accent 6" w:uiPriority="48"/>
+    <w:lsdException w:name="List Table 4 Accent 6" w:uiPriority="49"/>
+    <w:lsdException w:name="List Table 5 Dark Accent 6" w:uiPriority="50"/>
+    <w:lsdException w:name="List Table 6 Colorful Accent 6" w:uiPriority="51"/>
+    <w:lsdException w:name="List Table 7 Colorful Accent 6" w:uiPriority="52"/>
   </w:latentStyles>
   <w:style w:type="paragraph" w:default="1" w:styleId="Normal">
     <w:name w:val="Normal"/>
@@ -9833,7 +9117,7 @@
 </file>
 
 <file path=customXml/itemProps1.xml><?xml version="1.0" encoding="utf-8"?>
-<ds:datastoreItem xmlns:ds="http://schemas.openxmlformats.org/officeDocument/2006/customXml" ds:itemID="{2EB9EFCE-5B99-438C-832D-11A61121588B}">
+<ds:datastoreItem xmlns:ds="http://schemas.openxmlformats.org/officeDocument/2006/customXml" ds:itemID="{1D4D4925-6A29-477D-B661-7EA492BB9DF5}">
   <ds:schemaRefs>
     <ds:schemaRef ds:uri="http://schemas.openxmlformats.org/officeDocument/2006/bibliography"/>
   </ds:schemaRefs>

</xml_diff>

<commit_message>
* Updated for pre build 0.9.8
</commit_message>
<xml_diff>
--- a/IDM BUILD_8/Help/Help.docx
+++ b/IDM BUILD_8/Help/Help.docx
@@ -15,7 +15,7 @@
         <w:rPr>
           <w:rFonts w:cs="Times New Roman"/>
           <w:noProof/>
-          <w:lang w:val="en-IN" w:eastAsia="en-IN" w:bidi="ar-SA"/>
+          <w:lang w:bidi="ar-SA"/>
         </w:rPr>
         <w:drawing>
           <wp:anchor distT="0" distB="0" distL="114300" distR="114300" simplePos="0" relativeHeight="251659264" behindDoc="0" locked="0" layoutInCell="1" allowOverlap="1" wp14:anchorId="10914DD8" wp14:editId="31640088">
@@ -138,16 +138,7 @@
           <w:rFonts w:cs="Times New Roman"/>
           <w:i/>
         </w:rPr>
-        <w:t xml:space="preserve"> Versi</w:t>
-      </w:r>
-      <w:bookmarkStart w:id="1" w:name="_GoBack"/>
-      <w:bookmarkEnd w:id="1"/>
-      <w:r>
-        <w:rPr>
-          <w:rFonts w:cs="Times New Roman"/>
-          <w:i/>
-        </w:rPr>
-        <w:t>on and may Contain Bug.</w:t>
+        <w:t xml:space="preserve"> Version and may Contain Bug.</w:t>
       </w:r>
     </w:p>
     <w:p>
@@ -167,7 +158,13 @@
         <w:rPr>
           <w:rFonts w:cs="Times New Roman"/>
         </w:rPr>
-        <w:t>2012-13</w:t>
+        <w:t>2012-1</w:t>
+      </w:r>
+      <w:r>
+        <w:rPr>
+          <w:rFonts w:cs="Times New Roman"/>
+        </w:rPr>
+        <w:t>5</w:t>
       </w:r>
       <w:r>
         <w:rPr>
@@ -203,7 +200,7 @@
             <w:rStyle w:val="Hyperlink"/>
             <w:rFonts w:cs="Times New Roman"/>
           </w:rPr>
-          <w:t>http://gajjartejas26.blogspot.com</w:t>
+          <w:t>http://www.gajjartejas.in</w:t>
         </w:r>
       </w:hyperlink>
     </w:p>
@@ -218,12 +215,13 @@
     <w:p>
       <w:pPr>
         <w:pStyle w:val="Heading1"/>
-      </w:pPr>
-      <w:bookmarkStart w:id="2" w:name="_Toc338444602"/>
+        <w:framePr w:wrap="notBeside"/>
+      </w:pPr>
+      <w:bookmarkStart w:id="1" w:name="_Toc338444602"/>
       <w:r>
         <w:t>Help Content</w:t>
       </w:r>
-      <w:bookmarkEnd w:id="2"/>
+      <w:bookmarkEnd w:id="1"/>
     </w:p>
     <w:p>
       <w:pPr>
@@ -800,18 +798,19 @@
     <w:p>
       <w:pPr>
         <w:pStyle w:val="Heading1"/>
-      </w:pPr>
-      <w:bookmarkStart w:id="3" w:name="_1._Introduction"/>
-      <w:bookmarkStart w:id="4" w:name="_Toc338444603"/>
+        <w:framePr w:wrap="notBeside"/>
+      </w:pPr>
+      <w:bookmarkStart w:id="2" w:name="_1._Introduction"/>
+      <w:bookmarkStart w:id="3" w:name="_Toc338444603"/>
+      <w:bookmarkEnd w:id="2"/>
+      <w:r>
+        <w:t>1. Introduction</w:t>
+      </w:r>
       <w:bookmarkEnd w:id="3"/>
       <w:r>
-        <w:t>1. Introduction</w:t>
-      </w:r>
-      <w:bookmarkEnd w:id="4"/>
-      <w:r>
         <w:rPr>
           <w:noProof/>
-          <w:lang w:val="en-IN" w:eastAsia="en-IN" w:bidi="ar-SA"/>
+          <w:lang w:bidi="ar-SA"/>
         </w:rPr>
         <w:drawing>
           <wp:inline distT="0" distB="0" distL="0" distR="0" wp14:anchorId="2A107EF9" wp14:editId="55E3F158">
@@ -910,17 +909,18 @@
     <w:p>
       <w:pPr>
         <w:pStyle w:val="Heading1"/>
-      </w:pPr>
-      <w:bookmarkStart w:id="5" w:name="_2._Features:"/>
-      <w:bookmarkStart w:id="6" w:name="_Toc338444604"/>
+        <w:framePr w:wrap="notBeside"/>
+      </w:pPr>
+      <w:bookmarkStart w:id="4" w:name="_2._Features:"/>
+      <w:bookmarkStart w:id="5" w:name="_Toc338444604"/>
+      <w:bookmarkEnd w:id="4"/>
+      <w:r>
+        <w:t xml:space="preserve">2. </w:t>
+      </w:r>
+      <w:r>
+        <w:t>Features:</w:t>
+      </w:r>
       <w:bookmarkEnd w:id="5"/>
-      <w:r>
-        <w:t xml:space="preserve">2. </w:t>
-      </w:r>
-      <w:r>
-        <w:t>Features:</w:t>
-      </w:r>
-      <w:bookmarkEnd w:id="6"/>
       <w:r>
         <w:rPr>
           <w:noProof/>
@@ -931,7 +931,7 @@
       <w:r>
         <w:rPr>
           <w:noProof/>
-          <w:lang w:val="en-IN" w:eastAsia="en-IN" w:bidi="ar-SA"/>
+          <w:lang w:bidi="ar-SA"/>
         </w:rPr>
         <w:drawing>
           <wp:inline distT="0" distB="0" distL="0" distR="0" wp14:anchorId="24AEA379" wp14:editId="5AC21F04">
@@ -1011,6 +1011,7 @@
         <w:rPr>
           <w:rFonts w:cs="Times New Roman"/>
         </w:rPr>
+        <w:lastRenderedPageBreak/>
         <w:t xml:space="preserve">Backup Custom elements for Backup like </w:t>
       </w:r>
       <w:r>
@@ -1209,7 +1210,6 @@
         <w:rPr>
           <w:rFonts w:cs="Times New Roman"/>
         </w:rPr>
-        <w:lastRenderedPageBreak/>
         <w:t xml:space="preserve">Download List Manager is allow to use Force to Join Unfinished Downloaded Files, Expert in various format, Remove Download </w:t>
       </w:r>
       <w:r>
@@ -1246,20 +1246,21 @@
     <w:p>
       <w:pPr>
         <w:pStyle w:val="Heading1"/>
-      </w:pPr>
-      <w:bookmarkStart w:id="7" w:name="_3._System_Requirement:"/>
-      <w:bookmarkStart w:id="8" w:name="_Toc338444605"/>
+        <w:framePr w:wrap="notBeside"/>
+      </w:pPr>
+      <w:bookmarkStart w:id="6" w:name="_3._System_Requirement:"/>
+      <w:bookmarkStart w:id="7" w:name="_Toc338444605"/>
+      <w:bookmarkEnd w:id="6"/>
+      <w:r>
+        <w:t>3. System</w:t>
+      </w:r>
+      <w:r>
+        <w:t xml:space="preserve"> </w:t>
+      </w:r>
+      <w:r>
+        <w:t>Requirement:</w:t>
+      </w:r>
       <w:bookmarkEnd w:id="7"/>
-      <w:r>
-        <w:t>3. System</w:t>
-      </w:r>
-      <w:r>
-        <w:t xml:space="preserve"> </w:t>
-      </w:r>
-      <w:r>
-        <w:t>Requirement:</w:t>
-      </w:r>
-      <w:bookmarkEnd w:id="8"/>
       <w:r>
         <w:rPr>
           <w:noProof/>
@@ -1270,7 +1271,7 @@
       <w:r>
         <w:rPr>
           <w:noProof/>
-          <w:lang w:val="en-IN" w:eastAsia="en-IN" w:bidi="ar-SA"/>
+          <w:lang w:bidi="ar-SA"/>
         </w:rPr>
         <w:drawing>
           <wp:inline distT="0" distB="0" distL="0" distR="0" wp14:anchorId="642CAFEC" wp14:editId="2165D7EA">
@@ -1430,21 +1431,22 @@
     <w:p>
       <w:pPr>
         <w:pStyle w:val="Heading1"/>
-      </w:pPr>
-      <w:bookmarkStart w:id="9" w:name="_4._Using_IDM"/>
-      <w:bookmarkStart w:id="10" w:name="_Toc338444606"/>
+        <w:framePr w:wrap="notBeside"/>
+      </w:pPr>
+      <w:bookmarkStart w:id="8" w:name="_4._Using_IDM"/>
+      <w:bookmarkStart w:id="9" w:name="_Toc338444606"/>
+      <w:bookmarkEnd w:id="8"/>
+      <w:r>
+        <w:t>4. Using</w:t>
+      </w:r>
+      <w:r>
+        <w:t xml:space="preserve"> IDM Backup Manager</w:t>
+      </w:r>
       <w:bookmarkEnd w:id="9"/>
       <w:r>
-        <w:t>4. Using</w:t>
-      </w:r>
-      <w:r>
-        <w:t xml:space="preserve"> IDM Backup Manager</w:t>
-      </w:r>
-      <w:bookmarkEnd w:id="10"/>
-      <w:r>
         <w:rPr>
           <w:noProof/>
-          <w:lang w:val="en-IN" w:eastAsia="en-IN" w:bidi="ar-SA"/>
+          <w:lang w:bidi="ar-SA"/>
         </w:rPr>
         <w:drawing>
           <wp:inline distT="0" distB="0" distL="0" distR="0" wp14:anchorId="5B18E40E" wp14:editId="64F1C1D4">
@@ -1489,44 +1491,44 @@
       <w:pPr>
         <w:pStyle w:val="Heading2"/>
       </w:pPr>
-      <w:bookmarkStart w:id="11" w:name="_(a)_Backing_up"/>
-      <w:bookmarkStart w:id="12" w:name="_4.1_Backing_up"/>
-      <w:bookmarkStart w:id="13" w:name="_Toc338444607"/>
+      <w:bookmarkStart w:id="10" w:name="_(a)_Backing_up"/>
+      <w:bookmarkStart w:id="11" w:name="_4.1_Backing_up"/>
+      <w:bookmarkStart w:id="12" w:name="_Toc338444607"/>
+      <w:bookmarkEnd w:id="10"/>
       <w:bookmarkEnd w:id="11"/>
+      <w:r>
+        <w:t>4.1</w:t>
+      </w:r>
+      <w:r>
+        <w:t xml:space="preserve"> </w:t>
+      </w:r>
+      <w:r>
+        <w:t>Backing up</w:t>
+      </w:r>
+      <w:r>
+        <w:t xml:space="preserve"> IDM</w:t>
+      </w:r>
       <w:bookmarkEnd w:id="12"/>
-      <w:r>
-        <w:t>4.1</w:t>
+    </w:p>
+    <w:p>
+      <w:pPr>
+        <w:pStyle w:val="Heading3"/>
+      </w:pPr>
+      <w:bookmarkStart w:id="13" w:name="_(i)_Full_Backup"/>
+      <w:bookmarkStart w:id="14" w:name="_4.1.1_Full_Backup"/>
+      <w:bookmarkStart w:id="15" w:name="_Toc338444608"/>
+      <w:bookmarkEnd w:id="13"/>
+      <w:bookmarkEnd w:id="14"/>
+      <w:r>
+        <w:t>4.1.1</w:t>
       </w:r>
       <w:r>
         <w:t xml:space="preserve"> </w:t>
       </w:r>
       <w:r>
-        <w:t>Backing up</w:t>
-      </w:r>
-      <w:r>
-        <w:t xml:space="preserve"> IDM</w:t>
-      </w:r>
-      <w:bookmarkEnd w:id="13"/>
-    </w:p>
-    <w:p>
-      <w:pPr>
-        <w:pStyle w:val="Heading3"/>
-      </w:pPr>
-      <w:bookmarkStart w:id="14" w:name="_(i)_Full_Backup"/>
-      <w:bookmarkStart w:id="15" w:name="_4.1.1_Full_Backup"/>
-      <w:bookmarkStart w:id="16" w:name="_Toc338444608"/>
-      <w:bookmarkEnd w:id="14"/>
+        <w:t>Full Backup</w:t>
+      </w:r>
       <w:bookmarkEnd w:id="15"/>
-      <w:r>
-        <w:t>4.1.1</w:t>
-      </w:r>
-      <w:r>
-        <w:t xml:space="preserve"> </w:t>
-      </w:r>
-      <w:r>
-        <w:t>Full Backup</w:t>
-      </w:r>
-      <w:bookmarkEnd w:id="16"/>
     </w:p>
     <w:p>
       <w:pPr>
@@ -1552,12 +1554,12 @@
         <w:rPr>
           <w:rFonts w:cs="Times New Roman"/>
           <w:noProof/>
-          <w:lang w:val="en-IN" w:eastAsia="en-IN" w:bidi="ar-SA"/>
+          <w:lang w:bidi="ar-SA"/>
         </w:rPr>
         <w:drawing>
-          <wp:inline distT="0" distB="0" distL="0" distR="0" wp14:anchorId="29A5CC91" wp14:editId="58A59564">
-            <wp:extent cx="4184160" cy="2896002"/>
-            <wp:effectExtent l="0" t="0" r="6985" b="0"/>
+          <wp:inline distT="0" distB="0" distL="0" distR="0" wp14:anchorId="1B1C47A3" wp14:editId="26F4EA7E">
+            <wp:extent cx="4334256" cy="2990088"/>
+            <wp:effectExtent l="0" t="0" r="0" b="1270"/>
             <wp:docPr id="3" name="Picture 2"/>
             <wp:cNvGraphicFramePr>
               <a:graphicFrameLocks xmlns:a="http://schemas.openxmlformats.org/drawingml/2006/main" noChangeAspect="1"/>
@@ -1584,7 +1586,7 @@
                   <pic:spPr>
                     <a:xfrm>
                       <a:off x="0" y="0"/>
-                      <a:ext cx="4184160" cy="2896002"/>
+                      <a:ext cx="4334256" cy="2990088"/>
                     </a:xfrm>
                     <a:prstGeom prst="rect">
                       <a:avLst/>
@@ -1664,6 +1666,7 @@
         <w:rPr>
           <w:rFonts w:cs="Times New Roman"/>
         </w:rPr>
+        <w:lastRenderedPageBreak/>
         <w:t xml:space="preserve">Check Checkbox </w:t>
       </w:r>
       <w:r>
@@ -1753,21 +1756,21 @@
       <w:pPr>
         <w:pStyle w:val="Heading3"/>
       </w:pPr>
-      <w:bookmarkStart w:id="17" w:name="_(ii)_Custom_Backup"/>
-      <w:bookmarkStart w:id="18" w:name="_4.1.2_Custom_Backup"/>
-      <w:bookmarkStart w:id="19" w:name="_Toc338444609"/>
+      <w:bookmarkStart w:id="16" w:name="_(ii)_Custom_Backup"/>
+      <w:bookmarkStart w:id="17" w:name="_4.1.2_Custom_Backup"/>
+      <w:bookmarkStart w:id="18" w:name="_Toc338444609"/>
+      <w:bookmarkEnd w:id="16"/>
       <w:bookmarkEnd w:id="17"/>
+      <w:r>
+        <w:t>4.1.2</w:t>
+      </w:r>
+      <w:r>
+        <w:t xml:space="preserve"> </w:t>
+      </w:r>
+      <w:r>
+        <w:t>Custom Backup</w:t>
+      </w:r>
       <w:bookmarkEnd w:id="18"/>
-      <w:r>
-        <w:t>4.1.2</w:t>
-      </w:r>
-      <w:r>
-        <w:t xml:space="preserve"> </w:t>
-      </w:r>
-      <w:r>
-        <w:t>Custom Backup</w:t>
-      </w:r>
-      <w:bookmarkEnd w:id="19"/>
     </w:p>
     <w:p>
       <w:pPr>
@@ -1780,12 +1783,12 @@
         <w:rPr>
           <w:rFonts w:cs="Times New Roman"/>
           <w:noProof/>
-          <w:lang w:val="en-IN" w:eastAsia="en-IN" w:bidi="ar-SA"/>
+          <w:lang w:bidi="ar-SA"/>
         </w:rPr>
         <w:drawing>
-          <wp:inline distT="0" distB="0" distL="0" distR="0" wp14:anchorId="6360F870" wp14:editId="1A27DC19">
-            <wp:extent cx="2010056" cy="555775"/>
-            <wp:effectExtent l="0" t="0" r="0" b="0"/>
+          <wp:inline distT="0" distB="0" distL="0" distR="0" wp14:anchorId="1CD4B90B" wp14:editId="27CBA999">
+            <wp:extent cx="2029968" cy="667512"/>
+            <wp:effectExtent l="0" t="0" r="8890" b="0"/>
             <wp:docPr id="4" name="Picture 3"/>
             <wp:cNvGraphicFramePr>
               <a:graphicFrameLocks xmlns:a="http://schemas.openxmlformats.org/drawingml/2006/main" noChangeAspect="1"/>
@@ -1812,7 +1815,7 @@
                   <pic:spPr>
                     <a:xfrm>
                       <a:off x="0" y="0"/>
-                      <a:ext cx="2010056" cy="555775"/>
+                      <a:ext cx="2029968" cy="667512"/>
                     </a:xfrm>
                     <a:prstGeom prst="rect">
                       <a:avLst/>
@@ -1844,7 +1847,6 @@
         <w:rPr>
           <w:rFonts w:cs="Times New Roman"/>
         </w:rPr>
-        <w:lastRenderedPageBreak/>
         <w:t xml:space="preserve">Choose </w:t>
       </w:r>
       <w:r>
@@ -1954,18 +1956,18 @@
       <w:pPr>
         <w:pStyle w:val="Heading3"/>
       </w:pPr>
-      <w:bookmarkStart w:id="20" w:name="_(iii)_List_Backup"/>
-      <w:bookmarkStart w:id="21" w:name="_4.1.3_List_Backup"/>
-      <w:bookmarkStart w:id="22" w:name="_Toc338444610"/>
+      <w:bookmarkStart w:id="19" w:name="_(iii)_List_Backup"/>
+      <w:bookmarkStart w:id="20" w:name="_4.1.3_List_Backup"/>
+      <w:bookmarkStart w:id="21" w:name="_Toc338444610"/>
+      <w:bookmarkEnd w:id="19"/>
       <w:bookmarkEnd w:id="20"/>
+      <w:r>
+        <w:t>4.1.3</w:t>
+      </w:r>
+      <w:r>
+        <w:t xml:space="preserve"> List Backup</w:t>
+      </w:r>
       <w:bookmarkEnd w:id="21"/>
-      <w:r>
-        <w:t>4.1.3</w:t>
-      </w:r>
-      <w:r>
-        <w:t xml:space="preserve"> List Backup</w:t>
-      </w:r>
-      <w:bookmarkEnd w:id="22"/>
     </w:p>
     <w:p>
       <w:pPr>
@@ -1978,12 +1980,12 @@
         <w:rPr>
           <w:rFonts w:cs="Times New Roman"/>
           <w:noProof/>
-          <w:lang w:val="en-IN" w:eastAsia="en-IN" w:bidi="ar-SA"/>
+          <w:lang w:bidi="ar-SA"/>
         </w:rPr>
         <w:drawing>
-          <wp:inline distT="0" distB="0" distL="0" distR="0" wp14:anchorId="063364C8" wp14:editId="7CADFAE2">
-            <wp:extent cx="2010056" cy="570294"/>
-            <wp:effectExtent l="0" t="0" r="9525" b="1270"/>
+          <wp:inline distT="0" distB="0" distL="0" distR="0" wp14:anchorId="4B361AD0" wp14:editId="75AF7B4B">
+            <wp:extent cx="2048256" cy="621792"/>
+            <wp:effectExtent l="0" t="0" r="0" b="6985"/>
             <wp:docPr id="5" name="Picture 4"/>
             <wp:cNvGraphicFramePr>
               <a:graphicFrameLocks xmlns:a="http://schemas.openxmlformats.org/drawingml/2006/main" noChangeAspect="1"/>
@@ -2010,7 +2012,7 @@
                   <pic:spPr>
                     <a:xfrm>
                       <a:off x="0" y="0"/>
-                      <a:ext cx="2010056" cy="570294"/>
+                      <a:ext cx="2048256" cy="621792"/>
                     </a:xfrm>
                     <a:prstGeom prst="rect">
                       <a:avLst/>
@@ -2132,16 +2134,22 @@
         </w:rPr>
         <w:t xml:space="preserve">no data will </w:t>
       </w:r>
-      <w:proofErr w:type="spellStart"/>
       <w:r>
         <w:rPr>
           <w:rFonts w:cs="Times New Roman"/>
           <w:b/>
           <w:color w:val="FF0000"/>
         </w:rPr>
+        <w:t xml:space="preserve">be </w:t>
+      </w:r>
+      <w:r>
+        <w:rPr>
+          <w:rFonts w:cs="Times New Roman"/>
+          <w:b/>
+          <w:color w:val="FF0000"/>
+        </w:rPr>
         <w:t>backup</w:t>
       </w:r>
-      <w:proofErr w:type="spellEnd"/>
       <w:r>
         <w:rPr>
           <w:rFonts w:cs="Times New Roman"/>
@@ -2214,21 +2222,21 @@
       <w:pPr>
         <w:pStyle w:val="Heading2"/>
       </w:pPr>
-      <w:bookmarkStart w:id="23" w:name="_(b)_Restoring_IDM"/>
-      <w:bookmarkStart w:id="24" w:name="_4.2_Restoring_IDM"/>
-      <w:bookmarkStart w:id="25" w:name="_Toc338444611"/>
+      <w:bookmarkStart w:id="22" w:name="_(b)_Restoring_IDM"/>
+      <w:bookmarkStart w:id="23" w:name="_4.2_Restoring_IDM"/>
+      <w:bookmarkStart w:id="24" w:name="_Toc338444611"/>
+      <w:bookmarkEnd w:id="22"/>
       <w:bookmarkEnd w:id="23"/>
+      <w:r>
+        <w:t>4.2</w:t>
+      </w:r>
+      <w:r>
+        <w:t xml:space="preserve"> </w:t>
+      </w:r>
+      <w:r>
+        <w:t>Restoring IDM</w:t>
+      </w:r>
       <w:bookmarkEnd w:id="24"/>
-      <w:r>
-        <w:t>4.2</w:t>
-      </w:r>
-      <w:r>
-        <w:t xml:space="preserve"> </w:t>
-      </w:r>
-      <w:r>
-        <w:t>Restoring IDM</w:t>
-      </w:r>
-      <w:bookmarkEnd w:id="25"/>
     </w:p>
     <w:p>
       <w:pPr>
@@ -2254,12 +2262,13 @@
         <w:rPr>
           <w:rFonts w:cs="Times New Roman"/>
           <w:noProof/>
-          <w:lang w:val="en-IN" w:eastAsia="en-IN" w:bidi="ar-SA"/>
-        </w:rPr>
+          <w:lang w:bidi="ar-SA"/>
+        </w:rPr>
+        <w:lastRenderedPageBreak/>
         <w:drawing>
           <wp:inline distT="0" distB="0" distL="0" distR="0" wp14:anchorId="397EB314" wp14:editId="4CA8CD39">
-            <wp:extent cx="4184160" cy="2896003"/>
-            <wp:effectExtent l="0" t="0" r="6985" b="0"/>
+            <wp:extent cx="4334256" cy="2990088"/>
+            <wp:effectExtent l="0" t="0" r="0" b="1270"/>
             <wp:docPr id="6" name="Picture 5"/>
             <wp:cNvGraphicFramePr>
               <a:graphicFrameLocks xmlns:a="http://schemas.openxmlformats.org/drawingml/2006/main" noChangeAspect="1"/>
@@ -2286,7 +2295,7 @@
                   <pic:spPr>
                     <a:xfrm>
                       <a:off x="0" y="0"/>
-                      <a:ext cx="4184160" cy="2896003"/>
+                      <a:ext cx="4334256" cy="2990088"/>
                     </a:xfrm>
                     <a:prstGeom prst="rect">
                       <a:avLst/>
@@ -2402,7 +2411,20 @@
         <w:rPr>
           <w:rFonts w:cs="Times New Roman"/>
         </w:rPr>
-        <w:t xml:space="preserve">Choose Convert Profile options if backup is from </w:t>
+        <w:t xml:space="preserve">Choose </w:t>
+      </w:r>
+      <w:r>
+        <w:rPr>
+          <w:rFonts w:cs="Times New Roman"/>
+          <w:b/>
+        </w:rPr>
+        <w:t>Convert Profile</w:t>
+      </w:r>
+      <w:r>
+        <w:rPr>
+          <w:rFonts w:cs="Times New Roman"/>
+        </w:rPr>
+        <w:t xml:space="preserve"> options if backup is from </w:t>
       </w:r>
       <w:r>
         <w:rPr>
@@ -2450,7 +2472,13 @@
         <w:rPr>
           <w:rFonts w:cs="Times New Roman"/>
         </w:rPr>
-        <w:t>Choose this option to restore only data without restoring IDM List of downloads and setting.</w:t>
+        <w:t xml:space="preserve">Append/Merge </w:t>
+      </w:r>
+      <w:r>
+        <w:rPr>
+          <w:rFonts w:cs="Times New Roman"/>
+        </w:rPr>
+        <w:t>option will not delete users existing data.</w:t>
       </w:r>
     </w:p>
     <w:p>
@@ -2468,41 +2496,40 @@
         <w:rPr>
           <w:rFonts w:cs="Times New Roman"/>
         </w:rPr>
-        <w:t>Choose this option to restore only IDM List of downloads</w:t>
-      </w:r>
-      <w:r>
-        <w:rPr>
-          <w:rFonts w:cs="Times New Roman"/>
-        </w:rPr>
-        <w:t xml:space="preserve"> and setting</w:t>
-      </w:r>
-      <w:r>
-        <w:rPr>
-          <w:rFonts w:cs="Times New Roman"/>
-        </w:rPr>
-        <w:t xml:space="preserve"> without restoring unfinished downloaded data.</w:t>
+        <w:t>Choose this option to restore</w:t>
+      </w:r>
+      <w:r>
+        <w:rPr>
+          <w:rFonts w:cs="Times New Roman"/>
+        </w:rPr>
+        <w:t xml:space="preserve"> data as your choice</w:t>
+      </w:r>
+      <w:r>
+        <w:rPr>
+          <w:rFonts w:cs="Times New Roman"/>
+        </w:rPr>
+        <w:t>.</w:t>
       </w:r>
     </w:p>
     <w:p>
       <w:pPr>
         <w:pStyle w:val="Heading2"/>
       </w:pPr>
-      <w:bookmarkStart w:id="26" w:name="_(c)_IDM_List"/>
-      <w:bookmarkStart w:id="27" w:name="_4.3_IDM_List"/>
-      <w:bookmarkStart w:id="28" w:name="_Toc338444612"/>
+      <w:bookmarkStart w:id="25" w:name="_(c)_IDM_List"/>
+      <w:bookmarkStart w:id="26" w:name="_4.3_IDM_List"/>
+      <w:bookmarkStart w:id="27" w:name="_Toc338444612"/>
+      <w:bookmarkEnd w:id="25"/>
       <w:bookmarkEnd w:id="26"/>
+      <w:r>
+        <w:t>4.3</w:t>
+      </w:r>
+      <w:r>
+        <w:t xml:space="preserve"> </w:t>
+      </w:r>
+      <w:r>
+        <w:t>IDM List Manager</w:t>
+      </w:r>
       <w:bookmarkEnd w:id="27"/>
-      <w:r>
-        <w:lastRenderedPageBreak/>
-        <w:t>4.3</w:t>
-      </w:r>
-      <w:r>
-        <w:t xml:space="preserve"> </w:t>
-      </w:r>
-      <w:r>
-        <w:t>IDM List Manager</w:t>
-      </w:r>
-      <w:bookmarkEnd w:id="28"/>
     </w:p>
     <w:p>
       <w:pPr>
@@ -2606,12 +2633,12 @@
         <w:rPr>
           <w:rFonts w:cs="Times New Roman"/>
           <w:noProof/>
-          <w:lang w:val="en-IN" w:eastAsia="en-IN" w:bidi="ar-SA"/>
+          <w:lang w:bidi="ar-SA"/>
         </w:rPr>
         <w:drawing>
           <wp:inline distT="0" distB="0" distL="0" distR="0" wp14:anchorId="02D5DE13" wp14:editId="61B534A0">
-            <wp:extent cx="6287378" cy="2778143"/>
-            <wp:effectExtent l="0" t="0" r="0" b="3175"/>
+            <wp:extent cx="5586984" cy="1920240"/>
+            <wp:effectExtent l="0" t="0" r="0" b="3810"/>
             <wp:docPr id="7" name="Picture 6"/>
             <wp:cNvGraphicFramePr>
               <a:graphicFrameLocks xmlns:a="http://schemas.openxmlformats.org/drawingml/2006/main" noChangeAspect="1"/>
@@ -2638,7 +2665,7 @@
                   <pic:spPr>
                     <a:xfrm>
                       <a:off x="0" y="0"/>
-                      <a:ext cx="6287378" cy="2778143"/>
+                      <a:ext cx="5586984" cy="1920240"/>
                     </a:xfrm>
                     <a:prstGeom prst="rect">
                       <a:avLst/>
@@ -2659,27 +2686,27 @@
       <w:pPr>
         <w:pStyle w:val="Heading3"/>
       </w:pPr>
-      <w:bookmarkStart w:id="29" w:name="_(i)_Analyzing_the"/>
-      <w:bookmarkStart w:id="30" w:name="_4.3.1_Analyzing_the"/>
-      <w:bookmarkStart w:id="31" w:name="_Toc338444613"/>
+      <w:bookmarkStart w:id="28" w:name="_(i)_Analyzing_the"/>
+      <w:bookmarkStart w:id="29" w:name="_4.3.1_Analyzing_the"/>
+      <w:bookmarkStart w:id="30" w:name="_Toc338444613"/>
+      <w:bookmarkEnd w:id="28"/>
       <w:bookmarkEnd w:id="29"/>
+      <w:r>
+        <w:t>4.3.1</w:t>
+      </w:r>
+      <w:r>
+        <w:t xml:space="preserve"> </w:t>
+      </w:r>
+      <w:r>
+        <w:t xml:space="preserve">Analyzing </w:t>
+      </w:r>
+      <w:r>
+        <w:t>the</w:t>
+      </w:r>
+      <w:r>
+        <w:t xml:space="preserve"> File</w:t>
+      </w:r>
       <w:bookmarkEnd w:id="30"/>
-      <w:r>
-        <w:t>4.3.1</w:t>
-      </w:r>
-      <w:r>
-        <w:t xml:space="preserve"> </w:t>
-      </w:r>
-      <w:r>
-        <w:t xml:space="preserve">Analyzing </w:t>
-      </w:r>
-      <w:r>
-        <w:t>the</w:t>
-      </w:r>
-      <w:r>
-        <w:t xml:space="preserve"> File</w:t>
-      </w:r>
-      <w:bookmarkEnd w:id="31"/>
     </w:p>
     <w:p>
       <w:pPr>
@@ -2791,6 +2818,7 @@
         <w:rPr>
           <w:rFonts w:cs="Times New Roman"/>
         </w:rPr>
+        <w:lastRenderedPageBreak/>
         <w:t>List According To Download:</w:t>
       </w:r>
     </w:p>
@@ -3014,21 +3042,21 @@
       <w:pPr>
         <w:pStyle w:val="Heading3"/>
       </w:pPr>
-      <w:bookmarkStart w:id="32" w:name="_(ii)_Joining_File"/>
-      <w:bookmarkStart w:id="33" w:name="_4.3.2_Joining_FILE"/>
-      <w:bookmarkStart w:id="34" w:name="_Toc338444614"/>
+      <w:bookmarkStart w:id="31" w:name="_(ii)_Joining_File"/>
+      <w:bookmarkStart w:id="32" w:name="_4.3.2_Joining_FILE"/>
+      <w:bookmarkStart w:id="33" w:name="_Toc338444614"/>
+      <w:bookmarkEnd w:id="31"/>
       <w:bookmarkEnd w:id="32"/>
+      <w:r>
+        <w:t>4.3.2</w:t>
+      </w:r>
+      <w:r>
+        <w:t xml:space="preserve"> </w:t>
+      </w:r>
+      <w:r>
+        <w:t xml:space="preserve">Joining </w:t>
+      </w:r>
       <w:bookmarkEnd w:id="33"/>
-      <w:r>
-        <w:t>4.3.2</w:t>
-      </w:r>
-      <w:r>
-        <w:t xml:space="preserve"> </w:t>
-      </w:r>
-      <w:r>
-        <w:t xml:space="preserve">Joining </w:t>
-      </w:r>
-      <w:bookmarkEnd w:id="34"/>
       <w:r>
         <w:t>FILE (</w:t>
       </w:r>
@@ -3173,13 +3201,12 @@
         <w:rPr>
           <w:rFonts w:cs="Times New Roman"/>
           <w:noProof/>
-          <w:lang w:val="en-IN" w:eastAsia="en-IN" w:bidi="ar-SA"/>
-        </w:rPr>
-        <w:lastRenderedPageBreak/>
+          <w:lang w:bidi="ar-SA"/>
+        </w:rPr>
         <w:drawing>
           <wp:inline distT="0" distB="0" distL="0" distR="0" wp14:anchorId="7FB0C107" wp14:editId="3AEA37C2">
-            <wp:extent cx="6665976" cy="1673352"/>
-            <wp:effectExtent l="0" t="0" r="1905" b="3175"/>
+            <wp:extent cx="5350083" cy="1343025"/>
+            <wp:effectExtent l="0" t="0" r="3175" b="0"/>
             <wp:docPr id="8" name="Picture 7"/>
             <wp:cNvGraphicFramePr>
               <a:graphicFrameLocks xmlns:a="http://schemas.openxmlformats.org/drawingml/2006/main" noChangeAspect="1"/>
@@ -3206,7 +3233,7 @@
                   <pic:spPr>
                     <a:xfrm>
                       <a:off x="0" y="0"/>
-                      <a:ext cx="6665976" cy="1673352"/>
+                      <a:ext cx="5377771" cy="1349976"/>
                     </a:xfrm>
                     <a:prstGeom prst="rect">
                       <a:avLst/>
@@ -3227,21 +3254,21 @@
       <w:pPr>
         <w:pStyle w:val="Heading3"/>
       </w:pPr>
-      <w:bookmarkStart w:id="35" w:name="_(iii)_Removing_File"/>
-      <w:bookmarkStart w:id="36" w:name="_4.3.3_Removing_File"/>
-      <w:bookmarkStart w:id="37" w:name="_Toc338444615"/>
+      <w:bookmarkStart w:id="34" w:name="_(iii)_Removing_File"/>
+      <w:bookmarkStart w:id="35" w:name="_4.3.3_Removing_File"/>
+      <w:bookmarkStart w:id="36" w:name="_Toc338444615"/>
+      <w:bookmarkEnd w:id="34"/>
       <w:bookmarkEnd w:id="35"/>
+      <w:r>
+        <w:t>4.3.3</w:t>
+      </w:r>
+      <w:r>
+        <w:t xml:space="preserve"> </w:t>
+      </w:r>
+      <w:r>
+        <w:t>Removing File</w:t>
+      </w:r>
       <w:bookmarkEnd w:id="36"/>
-      <w:r>
-        <w:t>4.3.3</w:t>
-      </w:r>
-      <w:r>
-        <w:t xml:space="preserve"> </w:t>
-      </w:r>
-      <w:r>
-        <w:t>Removing File</w:t>
-      </w:r>
-      <w:bookmarkEnd w:id="37"/>
     </w:p>
     <w:p>
       <w:pPr>
@@ -3286,20 +3313,22 @@
       <w:pPr>
         <w:pStyle w:val="Heading3"/>
       </w:pPr>
-      <w:bookmarkStart w:id="38" w:name="_(iv)_Exporting_List"/>
-      <w:bookmarkStart w:id="39" w:name="_4.3.4_Exporting_List"/>
-      <w:bookmarkStart w:id="40" w:name="_Toc338444616"/>
+      <w:bookmarkStart w:id="37" w:name="_(iv)_Exporting_List"/>
+      <w:bookmarkStart w:id="38" w:name="_4.3.4_Exporting_List"/>
+      <w:bookmarkStart w:id="39" w:name="_Toc338444616"/>
+      <w:bookmarkEnd w:id="37"/>
       <w:bookmarkEnd w:id="38"/>
+      <w:r>
+        <w:t>4.3.4</w:t>
+      </w:r>
+      <w:r>
+        <w:t xml:space="preserve"> Exporting</w:t>
+      </w:r>
+      <w:r>
+        <w:t xml:space="preserve"> List</w:t>
+      </w:r>
+      <w:bookmarkStart w:id="40" w:name="_GoBack"/>
       <w:bookmarkEnd w:id="39"/>
-      <w:r>
-        <w:t>4.3.4</w:t>
-      </w:r>
-      <w:r>
-        <w:t xml:space="preserve"> Exporting</w:t>
-      </w:r>
-      <w:r>
-        <w:t xml:space="preserve"> List</w:t>
-      </w:r>
       <w:bookmarkEnd w:id="40"/>
     </w:p>
     <w:p>
@@ -3356,11 +3385,11 @@
         <w:rPr>
           <w:rFonts w:cs="Times New Roman"/>
           <w:noProof/>
-          <w:lang w:val="en-IN" w:eastAsia="en-IN" w:bidi="ar-SA"/>
+          <w:lang w:bidi="ar-SA"/>
         </w:rPr>
         <w:drawing>
           <wp:inline distT="0" distB="0" distL="0" distR="0" wp14:anchorId="4669DE06" wp14:editId="66777022">
-            <wp:extent cx="3943901" cy="1107244"/>
+            <wp:extent cx="4143375" cy="1165574"/>
             <wp:effectExtent l="0" t="0" r="0" b="0"/>
             <wp:docPr id="9" name="Picture 8"/>
             <wp:cNvGraphicFramePr>
@@ -3388,7 +3417,7 @@
                   <pic:spPr>
                     <a:xfrm>
                       <a:off x="0" y="0"/>
-                      <a:ext cx="3943901" cy="1107244"/>
+                      <a:ext cx="4237445" cy="1192037"/>
                     </a:xfrm>
                     <a:prstGeom prst="rect">
                       <a:avLst/>
@@ -3470,6 +3499,7 @@
         <w:rPr>
           <w:rFonts w:cs="Times New Roman"/>
         </w:rPr>
+        <w:lastRenderedPageBreak/>
         <w:t>To IDM Export File</w:t>
       </w:r>
     </w:p>
@@ -3543,13 +3573,12 @@
         <w:rPr>
           <w:rFonts w:cs="Times New Roman"/>
           <w:noProof/>
-          <w:lang w:val="en-IN" w:eastAsia="en-IN" w:bidi="ar-SA"/>
-        </w:rPr>
-        <w:lastRenderedPageBreak/>
+          <w:lang w:bidi="ar-SA"/>
+        </w:rPr>
         <w:drawing>
           <wp:inline distT="0" distB="0" distL="0" distR="0" wp14:anchorId="0F15AE08" wp14:editId="4DC22F0A">
-            <wp:extent cx="1981477" cy="2695951"/>
-            <wp:effectExtent l="0" t="0" r="0" b="0"/>
+            <wp:extent cx="2075688" cy="2807208"/>
+            <wp:effectExtent l="0" t="0" r="1270" b="0"/>
             <wp:docPr id="10" name="Picture 9"/>
             <wp:cNvGraphicFramePr>
               <a:graphicFrameLocks xmlns:a="http://schemas.openxmlformats.org/drawingml/2006/main" noChangeAspect="1"/>
@@ -3576,7 +3605,7 @@
                   <pic:spPr>
                     <a:xfrm>
                       <a:off x="0" y="0"/>
-                      <a:ext cx="1981477" cy="2695951"/>
+                      <a:ext cx="2075688" cy="2807208"/>
                     </a:xfrm>
                     <a:prstGeom prst="rect">
                       <a:avLst/>
@@ -3774,12 +3803,12 @@
         <w:rPr>
           <w:rFonts w:cs="Times New Roman"/>
           <w:noProof/>
-          <w:lang w:val="en-IN" w:eastAsia="en-IN" w:bidi="ar-SA"/>
+          <w:lang w:bidi="ar-SA"/>
         </w:rPr>
         <w:drawing>
           <wp:inline distT="0" distB="0" distL="0" distR="0" wp14:anchorId="2D936D13" wp14:editId="0BCC2E99">
-            <wp:extent cx="1755648" cy="804672"/>
-            <wp:effectExtent l="0" t="0" r="0" b="0"/>
+            <wp:extent cx="1847088" cy="914400"/>
+            <wp:effectExtent l="0" t="0" r="1270" b="0"/>
             <wp:docPr id="22" name="Picture 22"/>
             <wp:cNvGraphicFramePr>
               <a:graphicFrameLocks xmlns:a="http://schemas.openxmlformats.org/drawingml/2006/main" noChangeAspect="1"/>
@@ -3806,7 +3835,7 @@
                   <pic:spPr>
                     <a:xfrm>
                       <a:off x="0" y="0"/>
-                      <a:ext cx="1755648" cy="804672"/>
+                      <a:ext cx="1847088" cy="914400"/>
                     </a:xfrm>
                     <a:prstGeom prst="rect">
                       <a:avLst/>
@@ -3826,6 +3855,7 @@
       <w:bookmarkStart w:id="51" w:name="_4.6_Add_Extra"/>
       <w:bookmarkEnd w:id="51"/>
       <w:r>
+        <w:lastRenderedPageBreak/>
         <w:t xml:space="preserve">4.6 </w:t>
       </w:r>
       <w:r>
@@ -3870,13 +3900,12 @@
       <w:r>
         <w:rPr>
           <w:noProof/>
-          <w:lang w:val="en-IN" w:eastAsia="en-IN" w:bidi="ar-SA"/>
-        </w:rPr>
-        <w:lastRenderedPageBreak/>
+          <w:lang w:bidi="ar-SA"/>
+        </w:rPr>
         <w:drawing>
           <wp:inline distT="0" distB="0" distL="0" distR="0" wp14:anchorId="33245C01" wp14:editId="14EA6397">
-            <wp:extent cx="4599054" cy="2304288"/>
-            <wp:effectExtent l="0" t="0" r="0" b="1270"/>
+            <wp:extent cx="4700016" cy="2423160"/>
+            <wp:effectExtent l="0" t="0" r="5715" b="0"/>
             <wp:docPr id="23" name="Picture 23"/>
             <wp:cNvGraphicFramePr>
               <a:graphicFrameLocks xmlns:a="http://schemas.openxmlformats.org/drawingml/2006/main" noChangeAspect="1"/>
@@ -3903,7 +3932,7 @@
                   <pic:spPr>
                     <a:xfrm>
                       <a:off x="0" y="0"/>
-                      <a:ext cx="4599054" cy="2304288"/>
+                      <a:ext cx="4700016" cy="2423160"/>
                     </a:xfrm>
                     <a:prstGeom prst="rect">
                       <a:avLst/>
@@ -3919,6 +3948,7 @@
     <w:p>
       <w:pPr>
         <w:pStyle w:val="Heading1"/>
+        <w:framePr w:wrap="notBeside"/>
       </w:pPr>
       <w:bookmarkStart w:id="52" w:name="_5._SETTING"/>
       <w:bookmarkEnd w:id="52"/>
@@ -3968,12 +3998,12 @@
         <w:rPr>
           <w:rFonts w:cs="Times New Roman"/>
           <w:noProof/>
-          <w:lang w:val="en-IN" w:eastAsia="en-IN" w:bidi="ar-SA"/>
+          <w:lang w:bidi="ar-SA"/>
         </w:rPr>
         <w:drawing>
           <wp:inline distT="0" distB="0" distL="0" distR="0" wp14:anchorId="7EFB476E" wp14:editId="08F05448">
-            <wp:extent cx="4184160" cy="2896002"/>
-            <wp:effectExtent l="0" t="0" r="6985" b="0"/>
+            <wp:extent cx="4334256" cy="2990088"/>
+            <wp:effectExtent l="0" t="0" r="0" b="1270"/>
             <wp:docPr id="15" name="Picture 15"/>
             <wp:cNvGraphicFramePr>
               <a:graphicFrameLocks xmlns:a="http://schemas.openxmlformats.org/drawingml/2006/main" noChangeAspect="1"/>
@@ -4000,7 +4030,7 @@
                   <pic:spPr>
                     <a:xfrm>
                       <a:off x="0" y="0"/>
-                      <a:ext cx="4184160" cy="2896002"/>
+                      <a:ext cx="4334256" cy="2990088"/>
                     </a:xfrm>
                     <a:prstGeom prst="rect">
                       <a:avLst/>
@@ -4166,6 +4196,7 @@
           <w:b/>
           <w:bCs/>
         </w:rPr>
+        <w:lastRenderedPageBreak/>
         <w:t>Backup Folder:</w:t>
       </w:r>
       <w:r>
@@ -4419,7 +4450,6 @@
           <w:b/>
           <w:bCs/>
         </w:rPr>
-        <w:lastRenderedPageBreak/>
         <w:t>DonlData</w:t>
       </w:r>
       <w:proofErr w:type="spellEnd"/>
@@ -4525,7 +4555,7 @@
         <w:rPr>
           <w:rFonts w:cs="Times New Roman"/>
           <w:noProof/>
-          <w:lang w:val="en-IN" w:eastAsia="en-IN" w:bidi="ar-SA"/>
+          <w:lang w:bidi="ar-SA"/>
         </w:rPr>
         <w:drawing>
           <wp:inline distT="0" distB="0" distL="0" distR="0" wp14:anchorId="06DDF174" wp14:editId="0B849176">
@@ -4605,7 +4635,6 @@
         </w:rPr>
         <w:t xml:space="preserve">or </w:t>
       </w:r>
-      <w:proofErr w:type="gramStart"/>
       <w:r>
         <w:rPr>
           <w:rFonts w:cs="Times New Roman"/>
@@ -4616,9 +4645,8 @@
         <w:rPr>
           <w:rFonts w:cs="Times New Roman"/>
         </w:rPr>
-        <w:t>(</w:t>
-      </w:r>
-      <w:proofErr w:type="gramEnd"/>
+        <w:t xml:space="preserve"> (</w:t>
+      </w:r>
       <w:r>
         <w:rPr>
           <w:rFonts w:cs="Times New Roman"/>
@@ -4677,7 +4705,7 @@
         <w:rPr>
           <w:rFonts w:cs="Times New Roman"/>
           <w:noProof/>
-          <w:lang w:val="en-IN" w:eastAsia="en-IN" w:bidi="ar-SA"/>
+          <w:lang w:bidi="ar-SA"/>
         </w:rPr>
         <w:drawing>
           <wp:inline distT="0" distB="0" distL="0" distR="0" wp14:anchorId="77CD16AF" wp14:editId="11EC27F8">
@@ -4775,7 +4803,7 @@
         <w:rPr>
           <w:rFonts w:cs="Times New Roman"/>
           <w:noProof/>
-          <w:lang w:val="en-IN" w:eastAsia="en-IN" w:bidi="ar-SA"/>
+          <w:lang w:bidi="ar-SA"/>
         </w:rPr>
         <w:drawing>
           <wp:inline distT="0" distB="0" distL="0" distR="0" wp14:anchorId="2BC61A41" wp14:editId="69E9FC30">
@@ -4838,6 +4866,7 @@
     <w:p>
       <w:pPr>
         <w:pStyle w:val="Heading1"/>
+        <w:framePr w:wrap="notBeside"/>
         <w:rPr>
           <w:rFonts w:cs="Times New Roman"/>
         </w:rPr>
@@ -4882,7 +4911,7 @@
         <w:rPr>
           <w:rFonts w:cs="Times New Roman"/>
           <w:noProof/>
-          <w:lang w:val="en-IN" w:eastAsia="en-IN" w:bidi="ar-SA"/>
+          <w:lang w:bidi="ar-SA"/>
         </w:rPr>
         <w:drawing>
           <wp:inline distT="0" distB="0" distL="0" distR="0" wp14:anchorId="507CAFB4" wp14:editId="5A6D664E">
@@ -5007,6 +5036,14 @@
       <w:r>
         <w:rPr>
           <w:rFonts w:cs="Times New Roman"/>
+          <w:b/>
+          <w:color w:val="FF0000"/>
+        </w:rPr>
+        <w:t xml:space="preserve"> if Append/Merge is not selected</w:t>
+      </w:r>
+      <w:r>
+        <w:rPr>
+          <w:rFonts w:cs="Times New Roman"/>
         </w:rPr>
         <w:t>.</w:t>
       </w:r>
@@ -5152,6 +5189,7 @@
     <w:p>
       <w:pPr>
         <w:pStyle w:val="Heading1"/>
+        <w:framePr w:wrap="notBeside"/>
         <w:rPr>
           <w:rFonts w:cs="Times New Roman"/>
         </w:rPr>
@@ -5184,7 +5222,7 @@
         <w:rPr>
           <w:rFonts w:cs="Times New Roman"/>
           <w:noProof/>
-          <w:lang w:val="en-IN" w:eastAsia="en-IN" w:bidi="ar-SA"/>
+          <w:lang w:bidi="ar-SA"/>
         </w:rPr>
         <w:drawing>
           <wp:inline distT="0" distB="0" distL="0" distR="0" wp14:anchorId="4898E3F7" wp14:editId="2C6E5CAA">
@@ -5227,13 +5265,9 @@
     </w:p>
     <w:tbl>
       <w:tblPr>
-        <w:tblStyle w:val="TableGrid"/>
+        <w:tblStyle w:val="GridTable1Light-Accent6"/>
         <w:tblW w:w="0" w:type="auto"/>
         <w:jc w:val="center"/>
-        <w:tblBorders>
-          <w:bottom w:val="single" w:sz="4" w:space="0" w:color="auto"/>
-        </w:tblBorders>
-        <w:shd w:val="clear" w:color="auto" w:fill="F5DFDA" w:themeFill="accent1" w:themeFillTint="33"/>
         <w:tblLook w:val="05A0" w:firstRow="1" w:lastRow="0" w:firstColumn="1" w:lastColumn="1" w:noHBand="0" w:noVBand="1"/>
       </w:tblPr>
       <w:tblGrid>
@@ -5242,13 +5276,14 @@
       </w:tblGrid>
       <w:tr>
         <w:trPr>
-          <w:trHeight w:val="287"/>
+          <w:cnfStyle w:val="100000000000" w:firstRow="1" w:lastRow="0" w:firstColumn="0" w:lastColumn="0" w:oddVBand="0" w:evenVBand="0" w:oddHBand="0" w:evenHBand="0" w:firstRowFirstColumn="0" w:firstRowLastColumn="0" w:lastRowFirstColumn="0" w:lastRowLastColumn="0"/>
+          <w:trHeight w:val="368"/>
           <w:jc w:val="center"/>
         </w:trPr>
         <w:tc>
           <w:tcPr>
+            <w:cnfStyle w:val="001000000000" w:firstRow="0" w:lastRow="0" w:firstColumn="1" w:lastColumn="0" w:oddVBand="0" w:evenVBand="0" w:oddHBand="0" w:evenHBand="0" w:firstRowFirstColumn="0" w:firstRowLastColumn="0" w:lastRowFirstColumn="0" w:lastRowLastColumn="0"/>
             <w:tcW w:w="1530" w:type="dxa"/>
-            <w:shd w:val="clear" w:color="auto" w:fill="F5DFDA" w:themeFill="accent1" w:themeFillTint="33"/>
           </w:tcPr>
           <w:p>
             <w:pPr>
@@ -5266,8 +5301,8 @@
         </w:tc>
         <w:tc>
           <w:tcPr>
+            <w:cnfStyle w:val="000100000000" w:firstRow="0" w:lastRow="0" w:firstColumn="0" w:lastColumn="1" w:oddVBand="0" w:evenVBand="0" w:oddHBand="0" w:evenHBand="0" w:firstRowFirstColumn="0" w:firstRowLastColumn="0" w:lastRowFirstColumn="0" w:lastRowLastColumn="0"/>
             <w:tcW w:w="3780" w:type="dxa"/>
-            <w:shd w:val="clear" w:color="auto" w:fill="F5DFDA" w:themeFill="accent1" w:themeFillTint="33"/>
           </w:tcPr>
           <w:p>
             <w:pPr>
@@ -5293,7 +5328,7 @@
                   <w:rStyle w:val="Hyperlink"/>
                   <w:rFonts w:cs="Times New Roman"/>
                 </w:rPr>
-                <w:t>mailto:gajjartejas26@gmail.com</w:t>
+                <w:t>support@gajjartejas.in</w:t>
               </w:r>
             </w:hyperlink>
           </w:p>
@@ -5305,8 +5340,8 @@
         </w:trPr>
         <w:tc>
           <w:tcPr>
+            <w:cnfStyle w:val="001000000000" w:firstRow="0" w:lastRow="0" w:firstColumn="1" w:lastColumn="0" w:oddVBand="0" w:evenVBand="0" w:oddHBand="0" w:evenHBand="0" w:firstRowFirstColumn="0" w:firstRowLastColumn="0" w:lastRowFirstColumn="0" w:lastRowLastColumn="0"/>
             <w:tcW w:w="1530" w:type="dxa"/>
-            <w:shd w:val="clear" w:color="auto" w:fill="F5DFDA" w:themeFill="accent1" w:themeFillTint="33"/>
           </w:tcPr>
           <w:p>
             <w:pPr>
@@ -5324,8 +5359,8 @@
         </w:tc>
         <w:tc>
           <w:tcPr>
+            <w:cnfStyle w:val="000100000000" w:firstRow="0" w:lastRow="0" w:firstColumn="0" w:lastColumn="1" w:oddVBand="0" w:evenVBand="0" w:oddHBand="0" w:evenHBand="0" w:firstRowFirstColumn="0" w:firstRowLastColumn="0" w:lastRowFirstColumn="0" w:lastRowLastColumn="0"/>
             <w:tcW w:w="3780" w:type="dxa"/>
-            <w:shd w:val="clear" w:color="auto" w:fill="F5DFDA" w:themeFill="accent1" w:themeFillTint="33"/>
           </w:tcPr>
           <w:p>
             <w:pPr>
@@ -5351,7 +5386,7 @@
                   <w:rStyle w:val="Hyperlink"/>
                   <w:rFonts w:cs="Times New Roman"/>
                 </w:rPr>
-                <w:t>http://gajjartejas26.blogspot.com</w:t>
+                <w:t>http://www.gajjartejas.in</w:t>
               </w:r>
             </w:hyperlink>
           </w:p>
@@ -5363,8 +5398,8 @@
         </w:trPr>
         <w:tc>
           <w:tcPr>
+            <w:cnfStyle w:val="001000000000" w:firstRow="0" w:lastRow="0" w:firstColumn="1" w:lastColumn="0" w:oddVBand="0" w:evenVBand="0" w:oddHBand="0" w:evenHBand="0" w:firstRowFirstColumn="0" w:firstRowLastColumn="0" w:lastRowFirstColumn="0" w:lastRowLastColumn="0"/>
             <w:tcW w:w="1530" w:type="dxa"/>
-            <w:shd w:val="clear" w:color="auto" w:fill="F5DFDA" w:themeFill="accent1" w:themeFillTint="33"/>
           </w:tcPr>
           <w:p>
             <w:pPr>
@@ -5382,8 +5417,8 @@
         </w:tc>
         <w:tc>
           <w:tcPr>
+            <w:cnfStyle w:val="000100000000" w:firstRow="0" w:lastRow="0" w:firstColumn="0" w:lastColumn="1" w:oddVBand="0" w:evenVBand="0" w:oddHBand="0" w:evenHBand="0" w:firstRowFirstColumn="0" w:firstRowLastColumn="0" w:lastRowFirstColumn="0" w:lastRowLastColumn="0"/>
             <w:tcW w:w="3780" w:type="dxa"/>
-            <w:shd w:val="clear" w:color="auto" w:fill="F5DFDA" w:themeFill="accent1" w:themeFillTint="33"/>
           </w:tcPr>
           <w:p>
             <w:pPr>
@@ -5415,8 +5450,8 @@
         </w:trPr>
         <w:tc>
           <w:tcPr>
+            <w:cnfStyle w:val="001000000000" w:firstRow="0" w:lastRow="0" w:firstColumn="1" w:lastColumn="0" w:oddVBand="0" w:evenVBand="0" w:oddHBand="0" w:evenHBand="0" w:firstRowFirstColumn="0" w:firstRowLastColumn="0" w:lastRowFirstColumn="0" w:lastRowLastColumn="0"/>
             <w:tcW w:w="1530" w:type="dxa"/>
-            <w:shd w:val="clear" w:color="auto" w:fill="F5DFDA" w:themeFill="accent1" w:themeFillTint="33"/>
           </w:tcPr>
           <w:p>
             <w:pPr>
@@ -5434,8 +5469,8 @@
         </w:tc>
         <w:tc>
           <w:tcPr>
+            <w:cnfStyle w:val="000100000000" w:firstRow="0" w:lastRow="0" w:firstColumn="0" w:lastColumn="1" w:oddVBand="0" w:evenVBand="0" w:oddHBand="0" w:evenHBand="0" w:firstRowFirstColumn="0" w:firstRowLastColumn="0" w:lastRowFirstColumn="0" w:lastRowLastColumn="0"/>
             <w:tcW w:w="3780" w:type="dxa"/>
-            <w:shd w:val="clear" w:color="auto" w:fill="F5DFDA" w:themeFill="accent1" w:themeFillTint="33"/>
           </w:tcPr>
           <w:p>
             <w:pPr>
@@ -5476,8 +5511,9 @@
         <w:rPr>
           <w:rFonts w:cs="Times New Roman"/>
           <w:noProof/>
-          <w:lang w:val="en-IN" w:eastAsia="en-IN" w:bidi="ar-SA"/>
-        </w:rPr>
+          <w:lang w:bidi="ar-SA"/>
+        </w:rPr>
+        <w:lastRenderedPageBreak/>
         <w:drawing>
           <wp:inline distT="0" distB="0" distL="0" distR="0">
             <wp:extent cx="900113" cy="900113"/>
@@ -8034,9 +8070,9 @@
   <w:style w:type="paragraph" w:default="1" w:styleId="Normal">
     <w:name w:val="Normal"/>
     <w:qFormat/>
-    <w:rsid w:val="007606C8"/>
+    <w:rsid w:val="00831EF3"/>
     <w:rPr>
-      <w:rFonts w:ascii="Times New Roman" w:hAnsi="Times New Roman"/>
+      <w:rFonts w:ascii="Segoe UI" w:hAnsi="Segoe UI"/>
       <w:sz w:val="20"/>
       <w:szCs w:val="20"/>
     </w:rPr>
@@ -8046,32 +8082,24 @@
     <w:basedOn w:val="Normal"/>
     <w:next w:val="Normal"/>
     <w:link w:val="Heading1Char"/>
+    <w:autoRedefine/>
     <w:uiPriority w:val="9"/>
     <w:qFormat/>
-    <w:rsid w:val="00831434"/>
+    <w:rsid w:val="00B563A1"/>
     <w:pPr>
-      <w:pBdr>
-        <w:top w:val="single" w:sz="24" w:space="0" w:color="00B0F0"/>
-        <w:left w:val="single" w:sz="24" w:space="0" w:color="00B0F0"/>
-        <w:bottom w:val="single" w:sz="24" w:space="0" w:color="00B0F0"/>
-        <w:right w:val="single" w:sz="24" w:space="0" w:color="00B0F0"/>
-      </w:pBdr>
-      <w:shd w:val="clear" w:color="auto" w:fill="00B0F0"/>
-      <w:spacing w:after="0"/>
+      <w:framePr w:wrap="notBeside" w:vAnchor="text" w:hAnchor="text" w:y="1"/>
+      <w:spacing w:before="240" w:after="240"/>
       <w:outlineLvl w:val="0"/>
     </w:pPr>
     <w:rPr>
-      <w:b/>
       <w:bCs/>
       <w:caps/>
-      <w:color w:val="FFFFFF" w:themeColor="background1"/>
+      <w:color w:val="5F5F5F"/>
       <w:spacing w:val="15"/>
-      <w:sz w:val="22"/>
+      <w:sz w:val="28"/>
       <w:szCs w:val="22"/>
-      <w14:shadow w14:blurRad="50800" w14:dist="38100" w14:dir="2700000" w14:sx="100000" w14:sy="100000" w14:kx="0" w14:ky="0" w14:algn="tl">
-        <w14:srgbClr w14:val="000000">
-          <w14:alpha w14:val="60000"/>
-        </w14:srgbClr>
+      <w14:shadow w14:blurRad="0" w14:dist="38100" w14:dir="0" w14:sx="1000" w14:sy="1000" w14:kx="0" w14:ky="0" w14:algn="tl">
+        <w14:srgbClr w14:val="000000"/>
       </w14:shadow>
     </w:rPr>
   </w:style>
@@ -8080,32 +8108,25 @@
     <w:basedOn w:val="Normal"/>
     <w:next w:val="Normal"/>
     <w:link w:val="Heading2Char"/>
+    <w:autoRedefine/>
     <w:uiPriority w:val="9"/>
     <w:unhideWhenUsed/>
     <w:qFormat/>
-    <w:rsid w:val="00B73FF7"/>
+    <w:rsid w:val="00B563A1"/>
     <w:pPr>
-      <w:pBdr>
-        <w:top w:val="single" w:sz="24" w:space="0" w:color="00B050"/>
-        <w:left w:val="single" w:sz="24" w:space="0" w:color="00B050"/>
-        <w:bottom w:val="single" w:sz="24" w:space="0" w:color="00B050"/>
-        <w:right w:val="single" w:sz="24" w:space="0" w:color="00B050"/>
-      </w:pBdr>
-      <w:shd w:val="clear" w:color="auto" w:fill="00B050"/>
-      <w:spacing w:after="0"/>
+      <w:spacing w:before="0" w:after="0" w:line="240" w:lineRule="auto"/>
       <w:outlineLvl w:val="1"/>
     </w:pPr>
     <w:rPr>
       <w:caps/>
-      <w:color w:val="FFFFFF" w:themeColor="background1"/>
+      <w:color w:val="808080" w:themeColor="background1" w:themeShade="80"/>
       <w:spacing w:val="15"/>
-      <w:sz w:val="22"/>
+      <w:sz w:val="24"/>
       <w:szCs w:val="22"/>
-      <w14:shadow w14:blurRad="50800" w14:dist="38100" w14:dir="8100000" w14:sx="100000" w14:sy="100000" w14:kx="0" w14:ky="0" w14:algn="tr">
-        <w14:srgbClr w14:val="000000">
-          <w14:alpha w14:val="60000"/>
-        </w14:srgbClr>
+      <w14:shadow w14:blurRad="0" w14:dist="38100" w14:dir="0" w14:sx="1000" w14:sy="1000" w14:kx="0" w14:ky="0" w14:algn="tr">
+        <w14:srgbClr w14:val="000000"/>
       </w14:shadow>
+      <w14:reflection w14:blurRad="0" w14:stA="100000" w14:stPos="0" w14:endA="0" w14:endPos="0" w14:dist="0" w14:dir="0" w14:fadeDir="0" w14:sx="0" w14:sy="0" w14:kx="0" w14:ky="0" w14:algn="b"/>
     </w:rPr>
   </w:style>
   <w:style w:type="paragraph" w:styleId="Heading3">
@@ -8116,19 +8137,15 @@
     <w:uiPriority w:val="9"/>
     <w:unhideWhenUsed/>
     <w:qFormat/>
-    <w:rsid w:val="00317A5D"/>
+    <w:rsid w:val="00B563A1"/>
     <w:pPr>
-      <w:pBdr>
-        <w:bottom w:val="single" w:sz="6" w:space="1" w:color="D16349" w:themeColor="accent1"/>
-      </w:pBdr>
-      <w:shd w:val="clear" w:color="auto" w:fill="FFFFFF" w:themeFill="background1"/>
       <w:spacing w:before="300" w:after="0"/>
       <w:outlineLvl w:val="2"/>
     </w:pPr>
     <w:rPr>
+      <w:b/>
       <w:caps/>
       <w:spacing w:val="15"/>
-      <w:sz w:val="22"/>
       <w:szCs w:val="22"/>
     </w:rPr>
   </w:style>
@@ -8362,18 +8379,16 @@
     <w:basedOn w:val="DefaultParagraphFont"/>
     <w:link w:val="Heading1"/>
     <w:uiPriority w:val="9"/>
-    <w:rsid w:val="00831434"/>
+    <w:rsid w:val="00B563A1"/>
     <w:rPr>
-      <w:b/>
+      <w:rFonts w:ascii="Segoe UI" w:hAnsi="Segoe UI"/>
       <w:bCs/>
       <w:caps/>
-      <w:color w:val="FFFFFF" w:themeColor="background1"/>
+      <w:color w:val="5F5F5F"/>
       <w:spacing w:val="15"/>
-      <w:shd w:val="clear" w:color="auto" w:fill="00B0F0"/>
-      <w14:shadow w14:blurRad="50800" w14:dist="38100" w14:dir="2700000" w14:sx="100000" w14:sy="100000" w14:kx="0" w14:ky="0" w14:algn="tl">
-        <w14:srgbClr w14:val="000000">
-          <w14:alpha w14:val="60000"/>
-        </w14:srgbClr>
+      <w:sz w:val="28"/>
+      <w14:shadow w14:blurRad="0" w14:dist="38100" w14:dir="0" w14:sx="1000" w14:sy="1000" w14:kx="0" w14:ky="0" w14:algn="tl">
+        <w14:srgbClr w14:val="000000"/>
       </w14:shadow>
     </w:rPr>
   </w:style>
@@ -8412,17 +8427,17 @@
     <w:basedOn w:val="DefaultParagraphFont"/>
     <w:link w:val="Heading2"/>
     <w:uiPriority w:val="9"/>
-    <w:rsid w:val="00B73FF7"/>
+    <w:rsid w:val="00B563A1"/>
     <w:rPr>
+      <w:rFonts w:ascii="Segoe UI" w:hAnsi="Segoe UI"/>
       <w:caps/>
-      <w:color w:val="FFFFFF" w:themeColor="background1"/>
+      <w:color w:val="808080" w:themeColor="background1" w:themeShade="80"/>
       <w:spacing w:val="15"/>
-      <w:shd w:val="clear" w:color="auto" w:fill="00B050"/>
-      <w14:shadow w14:blurRad="50800" w14:dist="38100" w14:dir="8100000" w14:sx="100000" w14:sy="100000" w14:kx="0" w14:ky="0" w14:algn="tr">
-        <w14:srgbClr w14:val="000000">
-          <w14:alpha w14:val="60000"/>
-        </w14:srgbClr>
+      <w:sz w:val="24"/>
+      <w14:shadow w14:blurRad="0" w14:dist="38100" w14:dir="0" w14:sx="1000" w14:sy="1000" w14:kx="0" w14:ky="0" w14:algn="tr">
+        <w14:srgbClr w14:val="000000"/>
       </w14:shadow>
+      <w14:reflection w14:blurRad="0" w14:stA="100000" w14:stPos="0" w14:endA="0" w14:endPos="0" w14:dist="0" w14:dir="0" w14:fadeDir="0" w14:sx="0" w14:sy="0" w14:kx="0" w14:ky="0" w14:algn="b"/>
     </w:rPr>
   </w:style>
   <w:style w:type="paragraph" w:styleId="Caption">
@@ -8483,11 +8498,13 @@
     <w:basedOn w:val="DefaultParagraphFont"/>
     <w:link w:val="Heading3"/>
     <w:uiPriority w:val="9"/>
-    <w:rsid w:val="00317A5D"/>
+    <w:rsid w:val="00B563A1"/>
     <w:rPr>
+      <w:rFonts w:ascii="Segoe UI" w:hAnsi="Segoe UI"/>
+      <w:b/>
       <w:caps/>
       <w:spacing w:val="15"/>
-      <w:shd w:val="clear" w:color="auto" w:fill="FFFFFF" w:themeFill="background1"/>
+      <w:sz w:val="20"/>
     </w:rPr>
   </w:style>
   <w:style w:type="paragraph" w:styleId="TOCHeading">
@@ -8499,6 +8516,7 @@
     <w:qFormat/>
     <w:rsid w:val="005070FC"/>
     <w:pPr>
+      <w:framePr w:wrap="notBeside"/>
       <w:outlineLvl w:val="9"/>
     </w:pPr>
   </w:style>
@@ -8826,6 +8844,70 @@
       <w:u w:val="single"/>
     </w:rPr>
   </w:style>
+  <w:style w:type="table" w:styleId="GridTable1Light-Accent6">
+    <w:name w:val="Grid Table 1 Light Accent 6"/>
+    <w:basedOn w:val="TableNormal"/>
+    <w:uiPriority w:val="46"/>
+    <w:rsid w:val="00F72C5D"/>
+    <w:pPr>
+      <w:spacing w:after="0" w:line="240" w:lineRule="auto"/>
+    </w:pPr>
+    <w:tblPr>
+      <w:tblStyleRowBandSize w:val="1"/>
+      <w:tblStyleColBandSize w:val="1"/>
+      <w:tblInd w:w="0" w:type="dxa"/>
+      <w:tblBorders>
+        <w:top w:val="single" w:sz="4" w:space="0" w:color="ECD2B6" w:themeColor="accent6" w:themeTint="66"/>
+        <w:left w:val="single" w:sz="4" w:space="0" w:color="ECD2B6" w:themeColor="accent6" w:themeTint="66"/>
+        <w:bottom w:val="single" w:sz="4" w:space="0" w:color="ECD2B6" w:themeColor="accent6" w:themeTint="66"/>
+        <w:right w:val="single" w:sz="4" w:space="0" w:color="ECD2B6" w:themeColor="accent6" w:themeTint="66"/>
+        <w:insideH w:val="single" w:sz="4" w:space="0" w:color="ECD2B6" w:themeColor="accent6" w:themeTint="66"/>
+        <w:insideV w:val="single" w:sz="4" w:space="0" w:color="ECD2B6" w:themeColor="accent6" w:themeTint="66"/>
+      </w:tblBorders>
+      <w:tblCellMar>
+        <w:top w:w="0" w:type="dxa"/>
+        <w:left w:w="108" w:type="dxa"/>
+        <w:bottom w:w="0" w:type="dxa"/>
+        <w:right w:w="108" w:type="dxa"/>
+      </w:tblCellMar>
+    </w:tblPr>
+    <w:tblStylePr w:type="firstRow">
+      <w:rPr>
+        <w:b/>
+        <w:bCs/>
+      </w:rPr>
+      <w:tblPr/>
+      <w:tcPr>
+        <w:tcBorders>
+          <w:bottom w:val="single" w:sz="12" w:space="0" w:color="E3BC91" w:themeColor="accent6" w:themeTint="99"/>
+        </w:tcBorders>
+      </w:tcPr>
+    </w:tblStylePr>
+    <w:tblStylePr w:type="lastRow">
+      <w:rPr>
+        <w:b/>
+        <w:bCs/>
+      </w:rPr>
+      <w:tblPr/>
+      <w:tcPr>
+        <w:tcBorders>
+          <w:top w:val="double" w:sz="2" w:space="0" w:color="E3BC91" w:themeColor="accent6" w:themeTint="99"/>
+        </w:tcBorders>
+      </w:tcPr>
+    </w:tblStylePr>
+    <w:tblStylePr w:type="firstCol">
+      <w:rPr>
+        <w:b/>
+        <w:bCs/>
+      </w:rPr>
+    </w:tblStylePr>
+    <w:tblStylePr w:type="lastCol">
+      <w:rPr>
+        <w:b/>
+        <w:bCs/>
+      </w:rPr>
+    </w:tblStylePr>
+  </w:style>
 </w:styles>
 </file>
 
@@ -9117,7 +9199,7 @@
 </file>
 
 <file path=customXml/itemProps1.xml><?xml version="1.0" encoding="utf-8"?>
-<ds:datastoreItem xmlns:ds="http://schemas.openxmlformats.org/officeDocument/2006/customXml" ds:itemID="{1D4D4925-6A29-477D-B661-7EA492BB9DF5}">
+<ds:datastoreItem xmlns:ds="http://schemas.openxmlformats.org/officeDocument/2006/customXml" ds:itemID="{A417774C-9EC4-404F-AD32-89CE2BFAC40E}">
   <ds:schemaRefs>
     <ds:schemaRef ds:uri="http://schemas.openxmlformats.org/officeDocument/2006/bibliography"/>
   </ds:schemaRefs>

</xml_diff>